<commit_message>
Added headings to supplemental tables file
</commit_message>
<xml_diff>
--- a/Virulence supplemental files/Supplemental File 2 Tables.docx
+++ b/Virulence supplemental files/Supplemental File 2 Tables.docx
@@ -1,9 +1,17 @@
 
 <file path=word/document.xml><?xml version="1.0" encoding="utf-8"?>
-<w:document xmlns:wpc="http://schemas.microsoft.com/office/word/2010/wordprocessingCanvas" xmlns:cx="http://schemas.microsoft.com/office/drawing/2014/chartex" xmlns:cx1="http://schemas.microsoft.com/office/drawing/2015/9/8/chartex" xmlns:cx2="http://schemas.microsoft.com/office/drawing/2015/10/21/chartex" xmlns:cx3="http://schemas.microsoft.com/office/drawing/2016/5/9/chartex" xmlns:cx4="http://schemas.microsoft.com/office/drawing/2016/5/10/chartex" xmlns:cx5="http://schemas.microsoft.com/office/drawing/2016/5/11/chartex" xmlns:cx6="http://schemas.microsoft.com/office/drawing/2016/5/12/chartex" xmlns:cx7="http://schemas.microsoft.com/office/drawing/2016/5/13/chartex" xmlns:cx8="http://schemas.microsoft.com/office/drawing/2016/5/14/chartex" xmlns:mc="http://schemas.openxmlformats.org/markup-compatibility/2006" xmlns:aink="http://schemas.microsoft.com/office/drawing/2016/ink" xmlns:am3d="http://schemas.microsoft.com/office/drawing/2017/model3d" xmlns:o="urn:schemas-microsoft-com:office:office" xmlns:r="http://schemas.openxmlformats.org/officeDocument/2006/relationships" xmlns:m="http://schemas.openxmlformats.org/officeDocument/2006/math" xmlns:v="urn:schemas-microsoft-com:vml" xmlns:wp14="http://schemas.microsoft.com/office/word/2010/wordprocessingDrawing" xmlns:wp="http://schemas.openxmlformats.org/drawingml/2006/wordprocessingDrawing" xmlns:w10="urn:schemas-microsoft-com:office:word" xmlns:w="http://schemas.openxmlformats.org/wordprocessingml/2006/main" xmlns:w14="http://schemas.microsoft.com/office/word/2010/wordml" xmlns:w15="http://schemas.microsoft.com/office/word/2012/wordml" xmlns:w16cid="http://schemas.microsoft.com/office/word/2016/wordml/cid" xmlns:w16se="http://schemas.microsoft.com/office/word/2015/wordml/symex" xmlns:wpg="http://schemas.microsoft.com/office/word/2010/wordprocessingGroup" xmlns:wpi="http://schemas.microsoft.com/office/word/2010/wordprocessingInk" xmlns:wne="http://schemas.microsoft.com/office/word/2006/wordml" xmlns:wps="http://schemas.microsoft.com/office/word/2010/wordprocessingShape" mc:Ignorable="w14 w15 w16se w16cid wp14">
+<w:document xmlns:wpc="http://schemas.microsoft.com/office/word/2010/wordprocessingCanvas" xmlns:cx="http://schemas.microsoft.com/office/drawing/2014/chartex" xmlns:cx1="http://schemas.microsoft.com/office/drawing/2015/9/8/chartex" xmlns:cx2="http://schemas.microsoft.com/office/drawing/2015/10/21/chartex" xmlns:cx3="http://schemas.microsoft.com/office/drawing/2016/5/9/chartex" xmlns:cx4="http://schemas.microsoft.com/office/drawing/2016/5/10/chartex" xmlns:cx5="http://schemas.microsoft.com/office/drawing/2016/5/11/chartex" xmlns:cx6="http://schemas.microsoft.com/office/drawing/2016/5/12/chartex" xmlns:cx7="http://schemas.microsoft.com/office/drawing/2016/5/13/chartex" xmlns:cx8="http://schemas.microsoft.com/office/drawing/2016/5/14/chartex" xmlns:mc="http://schemas.openxmlformats.org/markup-compatibility/2006" xmlns:aink="http://schemas.microsoft.com/office/drawing/2016/ink" xmlns:am3d="http://schemas.microsoft.com/office/drawing/2017/model3d" xmlns:o="urn:schemas-microsoft-com:office:office" xmlns:oel="http://schemas.microsoft.com/office/2019/extlst" xmlns:r="http://schemas.openxmlformats.org/officeDocument/2006/relationships" xmlns:m="http://schemas.openxmlformats.org/officeDocument/2006/math" xmlns:v="urn:schemas-microsoft-com:vml" xmlns:wp14="http://schemas.microsoft.com/office/word/2010/wordprocessingDrawing" xmlns:wp="http://schemas.openxmlformats.org/drawingml/2006/wordprocessingDrawing" xmlns:w10="urn:schemas-microsoft-com:office:word" xmlns:w="http://schemas.openxmlformats.org/wordprocessingml/2006/main" xmlns:w14="http://schemas.microsoft.com/office/word/2010/wordml" xmlns:w15="http://schemas.microsoft.com/office/word/2012/wordml" xmlns:w16cex="http://schemas.microsoft.com/office/word/2018/wordml/cex" xmlns:w16cid="http://schemas.microsoft.com/office/word/2016/wordml/cid" xmlns:w16="http://schemas.microsoft.com/office/word/2018/wordml" xmlns:w16du="http://schemas.microsoft.com/office/word/2023/wordml/word16du" xmlns:w16sdtdh="http://schemas.microsoft.com/office/word/2020/wordml/sdtdatahash" xmlns:w16sdtfl="http://schemas.microsoft.com/office/word/2024/wordml/sdtformatlock" xmlns:w16se="http://schemas.microsoft.com/office/word/2015/wordml/symex" xmlns:wpg="http://schemas.microsoft.com/office/word/2010/wordprocessingGroup" xmlns:wpi="http://schemas.microsoft.com/office/word/2010/wordprocessingInk" xmlns:wne="http://schemas.microsoft.com/office/word/2006/wordml" xmlns:wps="http://schemas.microsoft.com/office/word/2010/wordprocessingShape" mc:Ignorable="w14 w15 w16se w16cid w16 w16cex w16sdtdh w16sdtfl w16du wp14">
   <w:body>
     <w:p>
+      <w:pPr>
+        <w:pStyle w:val="Heading1"/>
+      </w:pPr>
       <w:bookmarkStart w:id="0" w:name="_Ref139291115"/>
+      <w:r>
+        <w:t>Supplemental tables</w:t>
+      </w:r>
+    </w:p>
+    <w:p>
       <w:r>
         <w:t xml:space="preserve">Supplemental </w:t>
       </w:r>
@@ -1800,6 +1808,7 @@
                 <w:rFonts w:ascii="Calibri" w:hAnsi="Calibri" w:cs="Calibri"/>
                 <w:color w:val="000000"/>
               </w:rPr>
+              <w:lastRenderedPageBreak/>
               <w:t>Mucous neck cells</w:t>
             </w:r>
           </w:p>
@@ -1854,7 +1863,6 @@
                 <w:rFonts w:ascii="Calibri" w:hAnsi="Calibri" w:cs="Calibri"/>
                 <w:color w:val="000000"/>
               </w:rPr>
-              <w:lastRenderedPageBreak/>
               <w:t>Natural killer T cells</w:t>
             </w:r>
           </w:p>
@@ -4759,168 +4767,6 @@
                 <w:rFonts w:ascii="Calibri" w:hAnsi="Calibri" w:cs="Calibri"/>
                 <w:color w:val="000000"/>
               </w:rPr>
-              <w:t>Dendritic cells</w:t>
-            </w:r>
-          </w:p>
-        </w:tc>
-        <w:tc>
-          <w:tcPr>
-            <w:tcW w:w="3128" w:type="dxa"/>
-            <w:vAlign w:val="bottom"/>
-          </w:tcPr>
-          <w:p>
-            <w:r>
-              <w:rPr>
-                <w:rFonts w:ascii="Calibri" w:hAnsi="Calibri" w:cs="Calibri"/>
-                <w:color w:val="000000"/>
-              </w:rPr>
-              <w:t>Zbtb46</w:t>
-            </w:r>
-          </w:p>
-        </w:tc>
-        <w:tc>
-          <w:tcPr>
-            <w:tcW w:w="2617" w:type="dxa"/>
-          </w:tcPr>
-          <w:p>
-            <w:pPr>
-              <w:rPr>
-                <w:rFonts w:ascii="Calibri" w:hAnsi="Calibri" w:cs="Calibri"/>
-                <w:color w:val="000000"/>
-              </w:rPr>
-            </w:pPr>
-            <w:r>
-              <w:rPr>
-                <w:rFonts w:ascii="Calibri" w:hAnsi="Calibri" w:cs="Calibri"/>
-                <w:color w:val="000000"/>
-              </w:rPr>
-              <w:fldChar w:fldCharType="begin"/>
-            </w:r>
-            <w:r>
-              <w:rPr>
-                <w:rFonts w:ascii="Calibri" w:hAnsi="Calibri" w:cs="Calibri"/>
-                <w:color w:val="000000"/>
-              </w:rPr>
-              <w:instrText xml:space="preserve"> ADDIN EN.CITE &lt;EndNote&gt;&lt;Cite&gt;&lt;Author&gt;Franzén&lt;/Author&gt;&lt;Year&gt;2019&lt;/Year&gt;&lt;RecNum&gt;682&lt;/RecNum&gt;&lt;DisplayText&gt;(1)&lt;/DisplayText&gt;&lt;record&gt;&lt;rec-number&gt;682&lt;/rec-number&gt;&lt;foreign-keys&gt;&lt;key app="EN" db-id="xxwwe0rzmffw5tea00tvder2stww5tpt9xwa" timestamp="1691154024" guid="c39a3138-2a5b-4f33-b724-135fd1a0da54"&gt;682&lt;/key&gt;&lt;/foreign-keys&gt;&lt;ref-type name="Journal Article"&gt;17&lt;/ref-type&gt;&lt;contributors&gt;&lt;authors&gt;&lt;author&gt;Franzén, Oscar&lt;/author&gt;&lt;author&gt;Gan, Li-Ming&lt;/author&gt;&lt;author&gt;Björkegren, Johan L M&lt;/author&gt;&lt;/authors&gt;&lt;/contributors&gt;&lt;titles&gt;&lt;title&gt;PanglaoDB: a web server for exploration of mouse and human single-cell RNA sequencing data&lt;/title&gt;&lt;secondary-title&gt;Database&lt;/secondary-title&gt;&lt;/titles&gt;&lt;periodical&gt;&lt;full-title&gt;Database&lt;/full-title&gt;&lt;/periodical&gt;&lt;volume&gt;2019&lt;/volume&gt;&lt;dates&gt;&lt;year&gt;2019&lt;/year&gt;&lt;/dates&gt;&lt;isbn&gt;1758-0463&lt;/isbn&gt;&lt;urls&gt;&lt;related-urls&gt;&lt;url&gt;https://doi.org/10.1093/database/baz046&lt;/url&gt;&lt;/related-urls&gt;&lt;/urls&gt;&lt;custom1&gt;baz046&lt;/custom1&gt;&lt;electronic-resource-num&gt;10.1093/database/baz046&lt;/electronic-resource-num&gt;&lt;access-date&gt;6/29/2023&lt;/access-date&gt;&lt;/record&gt;&lt;/Cite&gt;&lt;/EndNote&gt;</w:instrText>
-            </w:r>
-            <w:r>
-              <w:rPr>
-                <w:rFonts w:ascii="Calibri" w:hAnsi="Calibri" w:cs="Calibri"/>
-                <w:color w:val="000000"/>
-              </w:rPr>
-              <w:fldChar w:fldCharType="separate"/>
-            </w:r>
-            <w:r>
-              <w:rPr>
-                <w:rFonts w:ascii="Calibri" w:hAnsi="Calibri" w:cs="Calibri"/>
-                <w:noProof/>
-                <w:color w:val="000000"/>
-              </w:rPr>
-              <w:t>(1)</w:t>
-            </w:r>
-            <w:r>
-              <w:rPr>
-                <w:rFonts w:ascii="Calibri" w:hAnsi="Calibri" w:cs="Calibri"/>
-                <w:color w:val="000000"/>
-              </w:rPr>
-              <w:fldChar w:fldCharType="end"/>
-            </w:r>
-          </w:p>
-        </w:tc>
-      </w:tr>
-      <w:tr>
-        <w:tc>
-          <w:tcPr>
-            <w:tcW w:w="3317" w:type="dxa"/>
-            <w:vAlign w:val="bottom"/>
-          </w:tcPr>
-          <w:p>
-            <w:r>
-              <w:rPr>
-                <w:rFonts w:ascii="Calibri" w:hAnsi="Calibri" w:cs="Calibri"/>
-                <w:color w:val="000000"/>
-              </w:rPr>
-              <w:t>Dendritic cells</w:t>
-            </w:r>
-          </w:p>
-        </w:tc>
-        <w:tc>
-          <w:tcPr>
-            <w:tcW w:w="3128" w:type="dxa"/>
-            <w:vAlign w:val="bottom"/>
-          </w:tcPr>
-          <w:p>
-            <w:r>
-              <w:rPr>
-                <w:rFonts w:ascii="Calibri" w:hAnsi="Calibri" w:cs="Calibri"/>
-                <w:color w:val="000000"/>
-              </w:rPr>
-              <w:t>Pdcd1lg2</w:t>
-            </w:r>
-          </w:p>
-        </w:tc>
-        <w:tc>
-          <w:tcPr>
-            <w:tcW w:w="2617" w:type="dxa"/>
-          </w:tcPr>
-          <w:p>
-            <w:pPr>
-              <w:rPr>
-                <w:rFonts w:ascii="Calibri" w:hAnsi="Calibri" w:cs="Calibri"/>
-                <w:color w:val="000000"/>
-              </w:rPr>
-            </w:pPr>
-            <w:r>
-              <w:rPr>
-                <w:rFonts w:ascii="Calibri" w:hAnsi="Calibri" w:cs="Calibri"/>
-                <w:color w:val="000000"/>
-              </w:rPr>
-              <w:fldChar w:fldCharType="begin"/>
-            </w:r>
-            <w:r>
-              <w:rPr>
-                <w:rFonts w:ascii="Calibri" w:hAnsi="Calibri" w:cs="Calibri"/>
-                <w:color w:val="000000"/>
-              </w:rPr>
-              <w:instrText xml:space="preserve"> ADDIN EN.CITE &lt;EndNote&gt;&lt;Cite&gt;&lt;Author&gt;Franzén&lt;/Author&gt;&lt;Year&gt;2019&lt;/Year&gt;&lt;RecNum&gt;682&lt;/RecNum&gt;&lt;DisplayText&gt;(1)&lt;/DisplayText&gt;&lt;record&gt;&lt;rec-number&gt;682&lt;/rec-number&gt;&lt;foreign-keys&gt;&lt;key app="EN" db-id="xxwwe0rzmffw5tea00tvder2stww5tpt9xwa" timestamp="1691154024" guid="c39a3138-2a5b-4f33-b724-135fd1a0da54"&gt;682&lt;/key&gt;&lt;/foreign-keys&gt;&lt;ref-type name="Journal Article"&gt;17&lt;/ref-type&gt;&lt;contributors&gt;&lt;authors&gt;&lt;author&gt;Franzén, Oscar&lt;/author&gt;&lt;author&gt;Gan, Li-Ming&lt;/author&gt;&lt;author&gt;Björkegren, Johan L M&lt;/author&gt;&lt;/authors&gt;&lt;/contributors&gt;&lt;titles&gt;&lt;title&gt;PanglaoDB: a web server for exploration of mouse and human single-cell RNA sequencing data&lt;/title&gt;&lt;secondary-title&gt;Database&lt;/secondary-title&gt;&lt;/titles&gt;&lt;periodical&gt;&lt;full-title&gt;Database&lt;/full-title&gt;&lt;/periodical&gt;&lt;volume&gt;2019&lt;/volume&gt;&lt;dates&gt;&lt;year&gt;2019&lt;/year&gt;&lt;/dates&gt;&lt;isbn&gt;1758-0463&lt;/isbn&gt;&lt;urls&gt;&lt;related-urls&gt;&lt;url&gt;https://doi.org/10.1093/database/baz046&lt;/url&gt;&lt;/related-urls&gt;&lt;/urls&gt;&lt;custom1&gt;baz046&lt;/custom1&gt;&lt;electronic-resource-num&gt;10.1093/database/baz046&lt;/electronic-resource-num&gt;&lt;access-date&gt;6/29/2023&lt;/access-date&gt;&lt;/record&gt;&lt;/Cite&gt;&lt;/EndNote&gt;</w:instrText>
-            </w:r>
-            <w:r>
-              <w:rPr>
-                <w:rFonts w:ascii="Calibri" w:hAnsi="Calibri" w:cs="Calibri"/>
-                <w:color w:val="000000"/>
-              </w:rPr>
-              <w:fldChar w:fldCharType="separate"/>
-            </w:r>
-            <w:r>
-              <w:rPr>
-                <w:rFonts w:ascii="Calibri" w:hAnsi="Calibri" w:cs="Calibri"/>
-                <w:noProof/>
-                <w:color w:val="000000"/>
-              </w:rPr>
-              <w:t>(1)</w:t>
-            </w:r>
-            <w:r>
-              <w:rPr>
-                <w:rFonts w:ascii="Calibri" w:hAnsi="Calibri" w:cs="Calibri"/>
-                <w:color w:val="000000"/>
-              </w:rPr>
-              <w:fldChar w:fldCharType="end"/>
-            </w:r>
-          </w:p>
-        </w:tc>
-      </w:tr>
-      <w:tr>
-        <w:tc>
-          <w:tcPr>
-            <w:tcW w:w="3317" w:type="dxa"/>
-            <w:vAlign w:val="bottom"/>
-          </w:tcPr>
-          <w:p>
-            <w:r>
-              <w:rPr>
-                <w:rFonts w:ascii="Calibri" w:hAnsi="Calibri" w:cs="Calibri"/>
-                <w:color w:val="000000"/>
-              </w:rPr>
               <w:lastRenderedPageBreak/>
               <w:t>Dendritic cells</w:t>
             </w:r>
@@ -4932,13 +4778,580 @@
             <w:vAlign w:val="bottom"/>
           </w:tcPr>
           <w:p>
+            <w:r>
+              <w:rPr>
+                <w:rFonts w:ascii="Calibri" w:hAnsi="Calibri" w:cs="Calibri"/>
+                <w:color w:val="000000"/>
+              </w:rPr>
+              <w:t>Zbtb46</w:t>
+            </w:r>
+          </w:p>
+        </w:tc>
+        <w:tc>
+          <w:tcPr>
+            <w:tcW w:w="2617" w:type="dxa"/>
+          </w:tcPr>
+          <w:p>
+            <w:pPr>
+              <w:rPr>
+                <w:rFonts w:ascii="Calibri" w:hAnsi="Calibri" w:cs="Calibri"/>
+                <w:color w:val="000000"/>
+              </w:rPr>
+            </w:pPr>
+            <w:r>
+              <w:rPr>
+                <w:rFonts w:ascii="Calibri" w:hAnsi="Calibri" w:cs="Calibri"/>
+                <w:color w:val="000000"/>
+              </w:rPr>
+              <w:fldChar w:fldCharType="begin"/>
+            </w:r>
+            <w:r>
+              <w:rPr>
+                <w:rFonts w:ascii="Calibri" w:hAnsi="Calibri" w:cs="Calibri"/>
+                <w:color w:val="000000"/>
+              </w:rPr>
+              <w:instrText xml:space="preserve"> ADDIN EN.CITE &lt;EndNote&gt;&lt;Cite&gt;&lt;Author&gt;Franzén&lt;/Author&gt;&lt;Year&gt;2019&lt;/Year&gt;&lt;RecNum&gt;682&lt;/RecNum&gt;&lt;DisplayText&gt;(1)&lt;/DisplayText&gt;&lt;record&gt;&lt;rec-number&gt;682&lt;/rec-number&gt;&lt;foreign-keys&gt;&lt;key app="EN" db-id="xxwwe0rzmffw5tea00tvder2stww5tpt9xwa" timestamp="1691154024" guid="c39a3138-2a5b-4f33-b724-135fd1a0da54"&gt;682&lt;/key&gt;&lt;/foreign-keys&gt;&lt;ref-type name="Journal Article"&gt;17&lt;/ref-type&gt;&lt;contributors&gt;&lt;authors&gt;&lt;author&gt;Franzén, Oscar&lt;/author&gt;&lt;author&gt;Gan, Li-Ming&lt;/author&gt;&lt;author&gt;Björkegren, Johan L M&lt;/author&gt;&lt;/authors&gt;&lt;/contributors&gt;&lt;titles&gt;&lt;title&gt;PanglaoDB: a web server for exploration of mouse and human single-cell RNA sequencing data&lt;/title&gt;&lt;secondary-title&gt;Database&lt;/secondary-title&gt;&lt;/titles&gt;&lt;periodical&gt;&lt;full-title&gt;Database&lt;/full-title&gt;&lt;/periodical&gt;&lt;volume&gt;2019&lt;/volume&gt;&lt;dates&gt;&lt;year&gt;2019&lt;/year&gt;&lt;/dates&gt;&lt;isbn&gt;1758-0463&lt;/isbn&gt;&lt;urls&gt;&lt;related-urls&gt;&lt;url&gt;https://doi.org/10.1093/database/baz046&lt;/url&gt;&lt;/related-urls&gt;&lt;/urls&gt;&lt;custom1&gt;baz046&lt;/custom1&gt;&lt;electronic-resource-num&gt;10.1093/database/baz046&lt;/electronic-resource-num&gt;&lt;access-date&gt;6/29/2023&lt;/access-date&gt;&lt;/record&gt;&lt;/Cite&gt;&lt;/EndNote&gt;</w:instrText>
+            </w:r>
+            <w:r>
+              <w:rPr>
+                <w:rFonts w:ascii="Calibri" w:hAnsi="Calibri" w:cs="Calibri"/>
+                <w:color w:val="000000"/>
+              </w:rPr>
+              <w:fldChar w:fldCharType="separate"/>
+            </w:r>
+            <w:r>
+              <w:rPr>
+                <w:rFonts w:ascii="Calibri" w:hAnsi="Calibri" w:cs="Calibri"/>
+                <w:noProof/>
+                <w:color w:val="000000"/>
+              </w:rPr>
+              <w:t>(1)</w:t>
+            </w:r>
+            <w:r>
+              <w:rPr>
+                <w:rFonts w:ascii="Calibri" w:hAnsi="Calibri" w:cs="Calibri"/>
+                <w:color w:val="000000"/>
+              </w:rPr>
+              <w:fldChar w:fldCharType="end"/>
+            </w:r>
+          </w:p>
+        </w:tc>
+      </w:tr>
+      <w:tr>
+        <w:tc>
+          <w:tcPr>
+            <w:tcW w:w="3317" w:type="dxa"/>
+            <w:vAlign w:val="bottom"/>
+          </w:tcPr>
+          <w:p>
+            <w:r>
+              <w:rPr>
+                <w:rFonts w:ascii="Calibri" w:hAnsi="Calibri" w:cs="Calibri"/>
+                <w:color w:val="000000"/>
+              </w:rPr>
+              <w:t>Dendritic cells</w:t>
+            </w:r>
+          </w:p>
+        </w:tc>
+        <w:tc>
+          <w:tcPr>
+            <w:tcW w:w="3128" w:type="dxa"/>
+            <w:vAlign w:val="bottom"/>
+          </w:tcPr>
+          <w:p>
+            <w:r>
+              <w:rPr>
+                <w:rFonts w:ascii="Calibri" w:hAnsi="Calibri" w:cs="Calibri"/>
+                <w:color w:val="000000"/>
+              </w:rPr>
+              <w:t>Pdcd1lg2</w:t>
+            </w:r>
+          </w:p>
+        </w:tc>
+        <w:tc>
+          <w:tcPr>
+            <w:tcW w:w="2617" w:type="dxa"/>
+          </w:tcPr>
+          <w:p>
+            <w:pPr>
+              <w:rPr>
+                <w:rFonts w:ascii="Calibri" w:hAnsi="Calibri" w:cs="Calibri"/>
+                <w:color w:val="000000"/>
+              </w:rPr>
+            </w:pPr>
+            <w:r>
+              <w:rPr>
+                <w:rFonts w:ascii="Calibri" w:hAnsi="Calibri" w:cs="Calibri"/>
+                <w:color w:val="000000"/>
+              </w:rPr>
+              <w:fldChar w:fldCharType="begin"/>
+            </w:r>
+            <w:r>
+              <w:rPr>
+                <w:rFonts w:ascii="Calibri" w:hAnsi="Calibri" w:cs="Calibri"/>
+                <w:color w:val="000000"/>
+              </w:rPr>
+              <w:instrText xml:space="preserve"> ADDIN EN.CITE &lt;EndNote&gt;&lt;Cite&gt;&lt;Author&gt;Franzén&lt;/Author&gt;&lt;Year&gt;2019&lt;/Year&gt;&lt;RecNum&gt;682&lt;/RecNum&gt;&lt;DisplayText&gt;(1)&lt;/DisplayText&gt;&lt;record&gt;&lt;rec-number&gt;682&lt;/rec-number&gt;&lt;foreign-keys&gt;&lt;key app="EN" db-id="xxwwe0rzmffw5tea00tvder2stww5tpt9xwa" timestamp="1691154024" guid="c39a3138-2a5b-4f33-b724-135fd1a0da54"&gt;682&lt;/key&gt;&lt;/foreign-keys&gt;&lt;ref-type name="Journal Article"&gt;17&lt;/ref-type&gt;&lt;contributors&gt;&lt;authors&gt;&lt;author&gt;Franzén, Oscar&lt;/author&gt;&lt;author&gt;Gan, Li-Ming&lt;/author&gt;&lt;author&gt;Björkegren, Johan L M&lt;/author&gt;&lt;/authors&gt;&lt;/contributors&gt;&lt;titles&gt;&lt;title&gt;PanglaoDB: a web server for exploration of mouse and human single-cell RNA sequencing data&lt;/title&gt;&lt;secondary-title&gt;Database&lt;/secondary-title&gt;&lt;/titles&gt;&lt;periodical&gt;&lt;full-title&gt;Database&lt;/full-title&gt;&lt;/periodical&gt;&lt;volume&gt;2019&lt;/volume&gt;&lt;dates&gt;&lt;year&gt;2019&lt;/year&gt;&lt;/dates&gt;&lt;isbn&gt;1758-0463&lt;/isbn&gt;&lt;urls&gt;&lt;related-urls&gt;&lt;url&gt;https://doi.org/10.1093/database/baz046&lt;/url&gt;&lt;/related-urls&gt;&lt;/urls&gt;&lt;custom1&gt;baz046&lt;/custom1&gt;&lt;electronic-resource-num&gt;10.1093/database/baz046&lt;/electronic-resource-num&gt;&lt;access-date&gt;6/29/2023&lt;/access-date&gt;&lt;/record&gt;&lt;/Cite&gt;&lt;/EndNote&gt;</w:instrText>
+            </w:r>
+            <w:r>
+              <w:rPr>
+                <w:rFonts w:ascii="Calibri" w:hAnsi="Calibri" w:cs="Calibri"/>
+                <w:color w:val="000000"/>
+              </w:rPr>
+              <w:fldChar w:fldCharType="separate"/>
+            </w:r>
+            <w:r>
+              <w:rPr>
+                <w:rFonts w:ascii="Calibri" w:hAnsi="Calibri" w:cs="Calibri"/>
+                <w:noProof/>
+                <w:color w:val="000000"/>
+              </w:rPr>
+              <w:t>(1)</w:t>
+            </w:r>
+            <w:r>
+              <w:rPr>
+                <w:rFonts w:ascii="Calibri" w:hAnsi="Calibri" w:cs="Calibri"/>
+                <w:color w:val="000000"/>
+              </w:rPr>
+              <w:fldChar w:fldCharType="end"/>
+            </w:r>
+          </w:p>
+        </w:tc>
+      </w:tr>
+      <w:tr>
+        <w:tc>
+          <w:tcPr>
+            <w:tcW w:w="3317" w:type="dxa"/>
+            <w:vAlign w:val="bottom"/>
+          </w:tcPr>
+          <w:p>
+            <w:r>
+              <w:rPr>
+                <w:rFonts w:ascii="Calibri" w:hAnsi="Calibri" w:cs="Calibri"/>
+                <w:color w:val="000000"/>
+              </w:rPr>
+              <w:t>Dendritic cells</w:t>
+            </w:r>
+          </w:p>
+        </w:tc>
+        <w:tc>
+          <w:tcPr>
+            <w:tcW w:w="3128" w:type="dxa"/>
+            <w:vAlign w:val="bottom"/>
+          </w:tcPr>
+          <w:p>
+            <w:r>
+              <w:rPr>
+                <w:rFonts w:ascii="Calibri" w:hAnsi="Calibri" w:cs="Calibri"/>
+                <w:color w:val="000000"/>
+              </w:rPr>
+              <w:t>Sirpa</w:t>
+            </w:r>
+          </w:p>
+        </w:tc>
+        <w:tc>
+          <w:tcPr>
+            <w:tcW w:w="2617" w:type="dxa"/>
+          </w:tcPr>
+          <w:p>
+            <w:pPr>
+              <w:rPr>
+                <w:rFonts w:ascii="Calibri" w:hAnsi="Calibri" w:cs="Calibri"/>
+                <w:color w:val="000000"/>
+              </w:rPr>
+            </w:pPr>
+            <w:r>
+              <w:rPr>
+                <w:rFonts w:ascii="Calibri" w:hAnsi="Calibri" w:cs="Calibri"/>
+                <w:color w:val="000000"/>
+              </w:rPr>
+              <w:fldChar w:fldCharType="begin"/>
+            </w:r>
+            <w:r>
+              <w:rPr>
+                <w:rFonts w:ascii="Calibri" w:hAnsi="Calibri" w:cs="Calibri"/>
+                <w:color w:val="000000"/>
+              </w:rPr>
+              <w:instrText xml:space="preserve"> ADDIN EN.CITE &lt;EndNote&gt;&lt;Cite&gt;&lt;Author&gt;Franzén&lt;/Author&gt;&lt;Year&gt;2019&lt;/Year&gt;&lt;RecNum&gt;682&lt;/RecNum&gt;&lt;DisplayText&gt;(1)&lt;/DisplayText&gt;&lt;record&gt;&lt;rec-number&gt;682&lt;/rec-number&gt;&lt;foreign-keys&gt;&lt;key app="EN" db-id="xxwwe0rzmffw5tea00tvder2stww5tpt9xwa" timestamp="1691154024" guid="c39a3138-2a5b-4f33-b724-135fd1a0da54"&gt;682&lt;/key&gt;&lt;/foreign-keys&gt;&lt;ref-type name="Journal Article"&gt;17&lt;/ref-type&gt;&lt;contributors&gt;&lt;authors&gt;&lt;author&gt;Franzén, Oscar&lt;/author&gt;&lt;author&gt;Gan, Li-Ming&lt;/author&gt;&lt;author&gt;Björkegren, Johan L M&lt;/author&gt;&lt;/authors&gt;&lt;/contributors&gt;&lt;titles&gt;&lt;title&gt;PanglaoDB: a web server for exploration of mouse and human single-cell RNA sequencing data&lt;/title&gt;&lt;secondary-title&gt;Database&lt;/secondary-title&gt;&lt;/titles&gt;&lt;periodical&gt;&lt;full-title&gt;Database&lt;/full-title&gt;&lt;/periodical&gt;&lt;volume&gt;2019&lt;/volume&gt;&lt;dates&gt;&lt;year&gt;2019&lt;/year&gt;&lt;/dates&gt;&lt;isbn&gt;1758-0463&lt;/isbn&gt;&lt;urls&gt;&lt;related-urls&gt;&lt;url&gt;https://doi.org/10.1093/database/baz046&lt;/url&gt;&lt;/related-urls&gt;&lt;/urls&gt;&lt;custom1&gt;baz046&lt;/custom1&gt;&lt;electronic-resource-num&gt;10.1093/database/baz046&lt;/electronic-resource-num&gt;&lt;access-date&gt;6/29/2023&lt;/access-date&gt;&lt;/record&gt;&lt;/Cite&gt;&lt;/EndNote&gt;</w:instrText>
+            </w:r>
+            <w:r>
+              <w:rPr>
+                <w:rFonts w:ascii="Calibri" w:hAnsi="Calibri" w:cs="Calibri"/>
+                <w:color w:val="000000"/>
+              </w:rPr>
+              <w:fldChar w:fldCharType="separate"/>
+            </w:r>
+            <w:r>
+              <w:rPr>
+                <w:rFonts w:ascii="Calibri" w:hAnsi="Calibri" w:cs="Calibri"/>
+                <w:noProof/>
+                <w:color w:val="000000"/>
+              </w:rPr>
+              <w:t>(1)</w:t>
+            </w:r>
+            <w:r>
+              <w:rPr>
+                <w:rFonts w:ascii="Calibri" w:hAnsi="Calibri" w:cs="Calibri"/>
+                <w:color w:val="000000"/>
+              </w:rPr>
+              <w:fldChar w:fldCharType="end"/>
+            </w:r>
+          </w:p>
+        </w:tc>
+      </w:tr>
+      <w:tr>
+        <w:tc>
+          <w:tcPr>
+            <w:tcW w:w="3317" w:type="dxa"/>
+            <w:vAlign w:val="bottom"/>
+          </w:tcPr>
+          <w:p>
+            <w:r>
+              <w:rPr>
+                <w:rFonts w:ascii="Calibri" w:hAnsi="Calibri" w:cs="Calibri"/>
+                <w:color w:val="000000"/>
+              </w:rPr>
+              <w:t>Dendritic cells</w:t>
+            </w:r>
+          </w:p>
+        </w:tc>
+        <w:tc>
+          <w:tcPr>
+            <w:tcW w:w="3128" w:type="dxa"/>
+            <w:vAlign w:val="bottom"/>
+          </w:tcPr>
+          <w:p>
+            <w:r>
+              <w:rPr>
+                <w:rFonts w:ascii="Calibri" w:hAnsi="Calibri" w:cs="Calibri"/>
+                <w:color w:val="000000"/>
+              </w:rPr>
+              <w:t>Rnase6</w:t>
+            </w:r>
+          </w:p>
+        </w:tc>
+        <w:tc>
+          <w:tcPr>
+            <w:tcW w:w="2617" w:type="dxa"/>
+          </w:tcPr>
+          <w:p>
+            <w:pPr>
+              <w:rPr>
+                <w:rFonts w:ascii="Calibri" w:hAnsi="Calibri" w:cs="Calibri"/>
+                <w:color w:val="000000"/>
+              </w:rPr>
+            </w:pPr>
+            <w:r>
+              <w:rPr>
+                <w:rFonts w:ascii="Calibri" w:hAnsi="Calibri" w:cs="Calibri"/>
+                <w:color w:val="000000"/>
+              </w:rPr>
+              <w:fldChar w:fldCharType="begin"/>
+            </w:r>
+            <w:r>
+              <w:rPr>
+                <w:rFonts w:ascii="Calibri" w:hAnsi="Calibri" w:cs="Calibri"/>
+                <w:color w:val="000000"/>
+              </w:rPr>
+              <w:instrText xml:space="preserve"> ADDIN EN.CITE &lt;EndNote&gt;&lt;Cite&gt;&lt;Author&gt;Franzén&lt;/Author&gt;&lt;Year&gt;2019&lt;/Year&gt;&lt;RecNum&gt;682&lt;/RecNum&gt;&lt;DisplayText&gt;(1)&lt;/DisplayText&gt;&lt;record&gt;&lt;rec-number&gt;682&lt;/rec-number&gt;&lt;foreign-keys&gt;&lt;key app="EN" db-id="xxwwe0rzmffw5tea00tvder2stww5tpt9xwa" timestamp="1691154024" guid="c39a3138-2a5b-4f33-b724-135fd1a0da54"&gt;682&lt;/key&gt;&lt;/foreign-keys&gt;&lt;ref-type name="Journal Article"&gt;17&lt;/ref-type&gt;&lt;contributors&gt;&lt;authors&gt;&lt;author&gt;Franzén, Oscar&lt;/author&gt;&lt;author&gt;Gan, Li-Ming&lt;/author&gt;&lt;author&gt;Björkegren, Johan L M&lt;/author&gt;&lt;/authors&gt;&lt;/contributors&gt;&lt;titles&gt;&lt;title&gt;PanglaoDB: a web server for exploration of mouse and human single-cell RNA sequencing data&lt;/title&gt;&lt;secondary-title&gt;Database&lt;/secondary-title&gt;&lt;/titles&gt;&lt;periodical&gt;&lt;full-title&gt;Database&lt;/full-title&gt;&lt;/periodical&gt;&lt;volume&gt;2019&lt;/volume&gt;&lt;dates&gt;&lt;year&gt;2019&lt;/year&gt;&lt;/dates&gt;&lt;isbn&gt;1758-0463&lt;/isbn&gt;&lt;urls&gt;&lt;related-urls&gt;&lt;url&gt;https://doi.org/10.1093/database/baz046&lt;/url&gt;&lt;/related-urls&gt;&lt;/urls&gt;&lt;custom1&gt;baz046&lt;/custom1&gt;&lt;electronic-resource-num&gt;10.1093/database/baz046&lt;/electronic-resource-num&gt;&lt;access-date&gt;6/29/2023&lt;/access-date&gt;&lt;/record&gt;&lt;/Cite&gt;&lt;/EndNote&gt;</w:instrText>
+            </w:r>
+            <w:r>
+              <w:rPr>
+                <w:rFonts w:ascii="Calibri" w:hAnsi="Calibri" w:cs="Calibri"/>
+                <w:color w:val="000000"/>
+              </w:rPr>
+              <w:fldChar w:fldCharType="separate"/>
+            </w:r>
+            <w:r>
+              <w:rPr>
+                <w:rFonts w:ascii="Calibri" w:hAnsi="Calibri" w:cs="Calibri"/>
+                <w:noProof/>
+                <w:color w:val="000000"/>
+              </w:rPr>
+              <w:t>(1)</w:t>
+            </w:r>
+            <w:r>
+              <w:rPr>
+                <w:rFonts w:ascii="Calibri" w:hAnsi="Calibri" w:cs="Calibri"/>
+                <w:color w:val="000000"/>
+              </w:rPr>
+              <w:fldChar w:fldCharType="end"/>
+            </w:r>
+          </w:p>
+        </w:tc>
+      </w:tr>
+      <w:tr>
+        <w:tc>
+          <w:tcPr>
+            <w:tcW w:w="3317" w:type="dxa"/>
+            <w:vAlign w:val="bottom"/>
+          </w:tcPr>
+          <w:p>
+            <w:r>
+              <w:rPr>
+                <w:rFonts w:ascii="Calibri" w:hAnsi="Calibri" w:cs="Calibri"/>
+                <w:color w:val="000000"/>
+              </w:rPr>
+              <w:t>Dendritic cells</w:t>
+            </w:r>
+          </w:p>
+        </w:tc>
+        <w:tc>
+          <w:tcPr>
+            <w:tcW w:w="3128" w:type="dxa"/>
+            <w:vAlign w:val="bottom"/>
+          </w:tcPr>
+          <w:p>
+            <w:r>
+              <w:rPr>
+                <w:rFonts w:ascii="Calibri" w:hAnsi="Calibri" w:cs="Calibri"/>
+                <w:color w:val="000000"/>
+              </w:rPr>
+              <w:t>S100b</w:t>
+            </w:r>
+          </w:p>
+        </w:tc>
+        <w:tc>
+          <w:tcPr>
+            <w:tcW w:w="2617" w:type="dxa"/>
+          </w:tcPr>
+          <w:p>
+            <w:pPr>
+              <w:rPr>
+                <w:rFonts w:ascii="Calibri" w:hAnsi="Calibri" w:cs="Calibri"/>
+                <w:color w:val="000000"/>
+              </w:rPr>
+            </w:pPr>
+            <w:r>
+              <w:rPr>
+                <w:rFonts w:ascii="Calibri" w:hAnsi="Calibri" w:cs="Calibri"/>
+                <w:color w:val="000000"/>
+              </w:rPr>
+              <w:fldChar w:fldCharType="begin"/>
+            </w:r>
+            <w:r>
+              <w:rPr>
+                <w:rFonts w:ascii="Calibri" w:hAnsi="Calibri" w:cs="Calibri"/>
+                <w:color w:val="000000"/>
+              </w:rPr>
+              <w:instrText xml:space="preserve"> ADDIN EN.CITE &lt;EndNote&gt;&lt;Cite&gt;&lt;Author&gt;Franzén&lt;/Author&gt;&lt;Year&gt;2019&lt;/Year&gt;&lt;RecNum&gt;682&lt;/RecNum&gt;&lt;DisplayText&gt;(1)&lt;/DisplayText&gt;&lt;record&gt;&lt;rec-number&gt;682&lt;/rec-number&gt;&lt;foreign-keys&gt;&lt;key app="EN" db-id="xxwwe0rzmffw5tea00tvder2stww5tpt9xwa" timestamp="1691154024" guid="c39a3138-2a5b-4f33-b724-135fd1a0da54"&gt;682&lt;/key&gt;&lt;/foreign-keys&gt;&lt;ref-type name="Journal Article"&gt;17&lt;/ref-type&gt;&lt;contributors&gt;&lt;authors&gt;&lt;author&gt;Franzén, Oscar&lt;/author&gt;&lt;author&gt;Gan, Li-Ming&lt;/author&gt;&lt;author&gt;Björkegren, Johan L M&lt;/author&gt;&lt;/authors&gt;&lt;/contributors&gt;&lt;titles&gt;&lt;title&gt;PanglaoDB: a web server for exploration of mouse and human single-cell RNA sequencing data&lt;/title&gt;&lt;secondary-title&gt;Database&lt;/secondary-title&gt;&lt;/titles&gt;&lt;periodical&gt;&lt;full-title&gt;Database&lt;/full-title&gt;&lt;/periodical&gt;&lt;volume&gt;2019&lt;/volume&gt;&lt;dates&gt;&lt;year&gt;2019&lt;/year&gt;&lt;/dates&gt;&lt;isbn&gt;1758-0463&lt;/isbn&gt;&lt;urls&gt;&lt;related-urls&gt;&lt;url&gt;https://doi.org/10.1093/database/baz046&lt;/url&gt;&lt;/related-urls&gt;&lt;/urls&gt;&lt;custom1&gt;baz046&lt;/custom1&gt;&lt;electronic-resource-num&gt;10.1093/database/baz046&lt;/electronic-resource-num&gt;&lt;access-date&gt;6/29/2023&lt;/access-date&gt;&lt;/record&gt;&lt;/Cite&gt;&lt;/EndNote&gt;</w:instrText>
+            </w:r>
+            <w:r>
+              <w:rPr>
+                <w:rFonts w:ascii="Calibri" w:hAnsi="Calibri" w:cs="Calibri"/>
+                <w:color w:val="000000"/>
+              </w:rPr>
+              <w:fldChar w:fldCharType="separate"/>
+            </w:r>
+            <w:r>
+              <w:rPr>
+                <w:rFonts w:ascii="Calibri" w:hAnsi="Calibri" w:cs="Calibri"/>
+                <w:noProof/>
+                <w:color w:val="000000"/>
+              </w:rPr>
+              <w:t>(1)</w:t>
+            </w:r>
+            <w:r>
+              <w:rPr>
+                <w:rFonts w:ascii="Calibri" w:hAnsi="Calibri" w:cs="Calibri"/>
+                <w:color w:val="000000"/>
+              </w:rPr>
+              <w:fldChar w:fldCharType="end"/>
+            </w:r>
+          </w:p>
+        </w:tc>
+      </w:tr>
+      <w:tr>
+        <w:tc>
+          <w:tcPr>
+            <w:tcW w:w="3317" w:type="dxa"/>
+            <w:vAlign w:val="bottom"/>
+          </w:tcPr>
+          <w:p>
+            <w:r>
+              <w:rPr>
+                <w:rFonts w:ascii="Calibri" w:hAnsi="Calibri" w:cs="Calibri"/>
+                <w:color w:val="000000"/>
+              </w:rPr>
+              <w:t>Dendritic cells</w:t>
+            </w:r>
+          </w:p>
+        </w:tc>
+        <w:tc>
+          <w:tcPr>
+            <w:tcW w:w="3128" w:type="dxa"/>
+            <w:vAlign w:val="bottom"/>
+          </w:tcPr>
+          <w:p>
+            <w:r>
+              <w:rPr>
+                <w:rFonts w:ascii="Calibri" w:hAnsi="Calibri" w:cs="Calibri"/>
+                <w:color w:val="000000"/>
+              </w:rPr>
+              <w:t>Slurp1</w:t>
+            </w:r>
+          </w:p>
+        </w:tc>
+        <w:tc>
+          <w:tcPr>
+            <w:tcW w:w="2617" w:type="dxa"/>
+          </w:tcPr>
+          <w:p>
+            <w:pPr>
+              <w:rPr>
+                <w:rFonts w:ascii="Calibri" w:hAnsi="Calibri" w:cs="Calibri"/>
+                <w:color w:val="000000"/>
+              </w:rPr>
+            </w:pPr>
+            <w:r>
+              <w:rPr>
+                <w:rFonts w:ascii="Calibri" w:hAnsi="Calibri" w:cs="Calibri"/>
+                <w:color w:val="000000"/>
+              </w:rPr>
+              <w:fldChar w:fldCharType="begin"/>
+            </w:r>
+            <w:r>
+              <w:rPr>
+                <w:rFonts w:ascii="Calibri" w:hAnsi="Calibri" w:cs="Calibri"/>
+                <w:color w:val="000000"/>
+              </w:rPr>
+              <w:instrText xml:space="preserve"> ADDIN EN.CITE &lt;EndNote&gt;&lt;Cite&gt;&lt;Author&gt;Franzén&lt;/Author&gt;&lt;Year&gt;2019&lt;/Year&gt;&lt;RecNum&gt;682&lt;/RecNum&gt;&lt;DisplayText&gt;(1)&lt;/DisplayText&gt;&lt;record&gt;&lt;rec-number&gt;682&lt;/rec-number&gt;&lt;foreign-keys&gt;&lt;key app="EN" db-id="xxwwe0rzmffw5tea00tvder2stww5tpt9xwa" timestamp="1691154024" guid="c39a3138-2a5b-4f33-b724-135fd1a0da54"&gt;682&lt;/key&gt;&lt;/foreign-keys&gt;&lt;ref-type name="Journal Article"&gt;17&lt;/ref-type&gt;&lt;contributors&gt;&lt;authors&gt;&lt;author&gt;Franzén, Oscar&lt;/author&gt;&lt;author&gt;Gan, Li-Ming&lt;/author&gt;&lt;author&gt;Björkegren, Johan L M&lt;/author&gt;&lt;/authors&gt;&lt;/contributors&gt;&lt;titles&gt;&lt;title&gt;PanglaoDB: a web server for exploration of mouse and human single-cell RNA sequencing data&lt;/title&gt;&lt;secondary-title&gt;Database&lt;/secondary-title&gt;&lt;/titles&gt;&lt;periodical&gt;&lt;full-title&gt;Database&lt;/full-title&gt;&lt;/periodical&gt;&lt;volume&gt;2019&lt;/volume&gt;&lt;dates&gt;&lt;year&gt;2019&lt;/year&gt;&lt;/dates&gt;&lt;isbn&gt;1758-0463&lt;/isbn&gt;&lt;urls&gt;&lt;related-urls&gt;&lt;url&gt;https://doi.org/10.1093/database/baz046&lt;/url&gt;&lt;/related-urls&gt;&lt;/urls&gt;&lt;custom1&gt;baz046&lt;/custom1&gt;&lt;electronic-resource-num&gt;10.1093/database/baz046&lt;/electronic-resource-num&gt;&lt;access-date&gt;6/29/2023&lt;/access-date&gt;&lt;/record&gt;&lt;/Cite&gt;&lt;/EndNote&gt;</w:instrText>
+            </w:r>
+            <w:r>
+              <w:rPr>
+                <w:rFonts w:ascii="Calibri" w:hAnsi="Calibri" w:cs="Calibri"/>
+                <w:color w:val="000000"/>
+              </w:rPr>
+              <w:fldChar w:fldCharType="separate"/>
+            </w:r>
+            <w:r>
+              <w:rPr>
+                <w:rFonts w:ascii="Calibri" w:hAnsi="Calibri" w:cs="Calibri"/>
+                <w:noProof/>
+                <w:color w:val="000000"/>
+              </w:rPr>
+              <w:t>(1)</w:t>
+            </w:r>
+            <w:r>
+              <w:rPr>
+                <w:rFonts w:ascii="Calibri" w:hAnsi="Calibri" w:cs="Calibri"/>
+                <w:color w:val="000000"/>
+              </w:rPr>
+              <w:fldChar w:fldCharType="end"/>
+            </w:r>
+          </w:p>
+        </w:tc>
+      </w:tr>
+      <w:tr>
+        <w:tc>
+          <w:tcPr>
+            <w:tcW w:w="3317" w:type="dxa"/>
+            <w:vAlign w:val="bottom"/>
+          </w:tcPr>
+          <w:p>
+            <w:r>
+              <w:rPr>
+                <w:rFonts w:ascii="Calibri" w:hAnsi="Calibri" w:cs="Calibri"/>
+                <w:color w:val="000000"/>
+              </w:rPr>
+              <w:t>Dendritic cells</w:t>
+            </w:r>
+          </w:p>
+        </w:tc>
+        <w:tc>
+          <w:tcPr>
+            <w:tcW w:w="3128" w:type="dxa"/>
+            <w:vAlign w:val="bottom"/>
+          </w:tcPr>
+          <w:p>
+            <w:r>
+              <w:rPr>
+                <w:rFonts w:ascii="Calibri" w:hAnsi="Calibri" w:cs="Calibri"/>
+                <w:color w:val="000000"/>
+              </w:rPr>
+              <w:t>Serpinb9</w:t>
+            </w:r>
+          </w:p>
+        </w:tc>
+        <w:tc>
+          <w:tcPr>
+            <w:tcW w:w="2617" w:type="dxa"/>
+          </w:tcPr>
+          <w:p>
+            <w:pPr>
+              <w:rPr>
+                <w:rFonts w:ascii="Calibri" w:hAnsi="Calibri" w:cs="Calibri"/>
+                <w:color w:val="000000"/>
+              </w:rPr>
+            </w:pPr>
+            <w:r>
+              <w:rPr>
+                <w:rFonts w:ascii="Calibri" w:hAnsi="Calibri" w:cs="Calibri"/>
+                <w:color w:val="000000"/>
+              </w:rPr>
+              <w:fldChar w:fldCharType="begin"/>
+            </w:r>
+            <w:r>
+              <w:rPr>
+                <w:rFonts w:ascii="Calibri" w:hAnsi="Calibri" w:cs="Calibri"/>
+                <w:color w:val="000000"/>
+              </w:rPr>
+              <w:instrText xml:space="preserve"> ADDIN EN.CITE &lt;EndNote&gt;&lt;Cite&gt;&lt;Author&gt;Franzén&lt;/Author&gt;&lt;Year&gt;2019&lt;/Year&gt;&lt;RecNum&gt;682&lt;/RecNum&gt;&lt;DisplayText&gt;(1)&lt;/DisplayText&gt;&lt;record&gt;&lt;rec-number&gt;682&lt;/rec-number&gt;&lt;foreign-keys&gt;&lt;key app="EN" db-id="xxwwe0rzmffw5tea00tvder2stww5tpt9xwa" timestamp="1691154024" guid="c39a3138-2a5b-4f33-b724-135fd1a0da54"&gt;682&lt;/key&gt;&lt;/foreign-keys&gt;&lt;ref-type name="Journal Article"&gt;17&lt;/ref-type&gt;&lt;contributors&gt;&lt;authors&gt;&lt;author&gt;Franzén, Oscar&lt;/author&gt;&lt;author&gt;Gan, Li-Ming&lt;/author&gt;&lt;author&gt;Björkegren, Johan L M&lt;/author&gt;&lt;/authors&gt;&lt;/contributors&gt;&lt;titles&gt;&lt;title&gt;PanglaoDB: a web server for exploration of mouse and human single-cell RNA sequencing data&lt;/title&gt;&lt;secondary-title&gt;Database&lt;/secondary-title&gt;&lt;/titles&gt;&lt;periodical&gt;&lt;full-title&gt;Database&lt;/full-title&gt;&lt;/periodical&gt;&lt;volume&gt;2019&lt;/volume&gt;&lt;dates&gt;&lt;year&gt;2019&lt;/year&gt;&lt;/dates&gt;&lt;isbn&gt;1758-0463&lt;/isbn&gt;&lt;urls&gt;&lt;related-urls&gt;&lt;url&gt;https://doi.org/10.1093/database/baz046&lt;/url&gt;&lt;/related-urls&gt;&lt;/urls&gt;&lt;custom1&gt;baz046&lt;/custom1&gt;&lt;electronic-resource-num&gt;10.1093/database/baz046&lt;/electronic-resource-num&gt;&lt;access-date&gt;6/29/2023&lt;/access-date&gt;&lt;/record&gt;&lt;/Cite&gt;&lt;/EndNote&gt;</w:instrText>
+            </w:r>
+            <w:r>
+              <w:rPr>
+                <w:rFonts w:ascii="Calibri" w:hAnsi="Calibri" w:cs="Calibri"/>
+                <w:color w:val="000000"/>
+              </w:rPr>
+              <w:fldChar w:fldCharType="separate"/>
+            </w:r>
+            <w:r>
+              <w:rPr>
+                <w:rFonts w:ascii="Calibri" w:hAnsi="Calibri" w:cs="Calibri"/>
+                <w:noProof/>
+                <w:color w:val="000000"/>
+              </w:rPr>
+              <w:t>(1)</w:t>
+            </w:r>
+            <w:r>
+              <w:rPr>
+                <w:rFonts w:ascii="Calibri" w:hAnsi="Calibri" w:cs="Calibri"/>
+                <w:color w:val="000000"/>
+              </w:rPr>
+              <w:fldChar w:fldCharType="end"/>
+            </w:r>
+          </w:p>
+        </w:tc>
+      </w:tr>
+      <w:tr>
+        <w:tc>
+          <w:tcPr>
+            <w:tcW w:w="3317" w:type="dxa"/>
+            <w:vAlign w:val="bottom"/>
+          </w:tcPr>
+          <w:p>
+            <w:r>
+              <w:rPr>
+                <w:rFonts w:ascii="Calibri" w:hAnsi="Calibri" w:cs="Calibri"/>
+                <w:color w:val="000000"/>
+              </w:rPr>
+              <w:t>Endothelial cells</w:t>
+            </w:r>
+          </w:p>
+        </w:tc>
+        <w:tc>
+          <w:tcPr>
+            <w:tcW w:w="3128" w:type="dxa"/>
+            <w:vAlign w:val="bottom"/>
+          </w:tcPr>
+          <w:p>
             <w:proofErr w:type="spellStart"/>
             <w:r>
               <w:rPr>
                 <w:rFonts w:ascii="Calibri" w:hAnsi="Calibri" w:cs="Calibri"/>
                 <w:color w:val="000000"/>
               </w:rPr>
-              <w:t>Sirpa</w:t>
+              <w:t>Vwf</w:t>
             </w:r>
             <w:proofErr w:type="spellEnd"/>
           </w:p>
@@ -5005,7 +5418,7 @@
                 <w:rFonts w:ascii="Calibri" w:hAnsi="Calibri" w:cs="Calibri"/>
                 <w:color w:val="000000"/>
               </w:rPr>
-              <w:t>Dendritic cells</w:t>
+              <w:t>Endothelial cells</w:t>
             </w:r>
           </w:p>
         </w:tc>
@@ -5015,13 +5428,15 @@
             <w:vAlign w:val="bottom"/>
           </w:tcPr>
           <w:p>
-            <w:r>
-              <w:rPr>
-                <w:rFonts w:ascii="Calibri" w:hAnsi="Calibri" w:cs="Calibri"/>
-                <w:color w:val="000000"/>
-              </w:rPr>
-              <w:t>Rnase6</w:t>
-            </w:r>
+            <w:proofErr w:type="spellStart"/>
+            <w:r>
+              <w:rPr>
+                <w:rFonts w:ascii="Calibri" w:hAnsi="Calibri" w:cs="Calibri"/>
+                <w:color w:val="000000"/>
+              </w:rPr>
+              <w:t>Thbd</w:t>
+            </w:r>
+            <w:proofErr w:type="spellEnd"/>
           </w:p>
         </w:tc>
         <w:tc>
@@ -5086,7 +5501,7 @@
                 <w:rFonts w:ascii="Calibri" w:hAnsi="Calibri" w:cs="Calibri"/>
                 <w:color w:val="000000"/>
               </w:rPr>
-              <w:t>Dendritic cells</w:t>
+              <w:t>Endothelial cells</w:t>
             </w:r>
           </w:p>
         </w:tc>
@@ -5101,7 +5516,7 @@
                 <w:rFonts w:ascii="Calibri" w:hAnsi="Calibri" w:cs="Calibri"/>
                 <w:color w:val="000000"/>
               </w:rPr>
-              <w:t>S100b</w:t>
+              <w:t>Slco1c1</w:t>
             </w:r>
           </w:p>
         </w:tc>
@@ -5167,7 +5582,7 @@
                 <w:rFonts w:ascii="Calibri" w:hAnsi="Calibri" w:cs="Calibri"/>
                 <w:color w:val="000000"/>
               </w:rPr>
-              <w:t>Dendritic cells</w:t>
+              <w:t>Endothelial cells</w:t>
             </w:r>
           </w:p>
         </w:tc>
@@ -5182,7 +5597,7 @@
                 <w:rFonts w:ascii="Calibri" w:hAnsi="Calibri" w:cs="Calibri"/>
                 <w:color w:val="000000"/>
               </w:rPr>
-              <w:t>Slurp1</w:t>
+              <w:t>Tmem100</w:t>
             </w:r>
           </w:p>
         </w:tc>
@@ -5248,7 +5663,7 @@
                 <w:rFonts w:ascii="Calibri" w:hAnsi="Calibri" w:cs="Calibri"/>
                 <w:color w:val="000000"/>
               </w:rPr>
-              <w:t>Dendritic cells</w:t>
+              <w:t>Endothelial cells</w:t>
             </w:r>
           </w:p>
         </w:tc>
@@ -5263,7 +5678,7 @@
                 <w:rFonts w:ascii="Calibri" w:hAnsi="Calibri" w:cs="Calibri"/>
                 <w:color w:val="000000"/>
               </w:rPr>
-              <w:t>Serpinb9</w:t>
+              <w:t>Rasip1</w:t>
             </w:r>
           </w:p>
         </w:tc>
@@ -5339,13 +5754,94 @@
             <w:vAlign w:val="bottom"/>
           </w:tcPr>
           <w:p>
+            <w:r>
+              <w:rPr>
+                <w:rFonts w:ascii="Calibri" w:hAnsi="Calibri" w:cs="Calibri"/>
+                <w:color w:val="000000"/>
+              </w:rPr>
+              <w:t>Tie1</w:t>
+            </w:r>
+          </w:p>
+        </w:tc>
+        <w:tc>
+          <w:tcPr>
+            <w:tcW w:w="2617" w:type="dxa"/>
+          </w:tcPr>
+          <w:p>
+            <w:pPr>
+              <w:rPr>
+                <w:rFonts w:ascii="Calibri" w:hAnsi="Calibri" w:cs="Calibri"/>
+                <w:color w:val="000000"/>
+              </w:rPr>
+            </w:pPr>
+            <w:r>
+              <w:rPr>
+                <w:rFonts w:ascii="Calibri" w:hAnsi="Calibri" w:cs="Calibri"/>
+                <w:color w:val="000000"/>
+              </w:rPr>
+              <w:fldChar w:fldCharType="begin"/>
+            </w:r>
+            <w:r>
+              <w:rPr>
+                <w:rFonts w:ascii="Calibri" w:hAnsi="Calibri" w:cs="Calibri"/>
+                <w:color w:val="000000"/>
+              </w:rPr>
+              <w:instrText xml:space="preserve"> ADDIN EN.CITE &lt;EndNote&gt;&lt;Cite&gt;&lt;Author&gt;Franzén&lt;/Author&gt;&lt;Year&gt;2019&lt;/Year&gt;&lt;RecNum&gt;682&lt;/RecNum&gt;&lt;DisplayText&gt;(1)&lt;/DisplayText&gt;&lt;record&gt;&lt;rec-number&gt;682&lt;/rec-number&gt;&lt;foreign-keys&gt;&lt;key app="EN" db-id="xxwwe0rzmffw5tea00tvder2stww5tpt9xwa" timestamp="1691154024" guid="c39a3138-2a5b-4f33-b724-135fd1a0da54"&gt;682&lt;/key&gt;&lt;/foreign-keys&gt;&lt;ref-type name="Journal Article"&gt;17&lt;/ref-type&gt;&lt;contributors&gt;&lt;authors&gt;&lt;author&gt;Franzén, Oscar&lt;/author&gt;&lt;author&gt;Gan, Li-Ming&lt;/author&gt;&lt;author&gt;Björkegren, Johan L M&lt;/author&gt;&lt;/authors&gt;&lt;/contributors&gt;&lt;titles&gt;&lt;title&gt;PanglaoDB: a web server for exploration of mouse and human single-cell RNA sequencing data&lt;/title&gt;&lt;secondary-title&gt;Database&lt;/secondary-title&gt;&lt;/titles&gt;&lt;periodical&gt;&lt;full-title&gt;Database&lt;/full-title&gt;&lt;/periodical&gt;&lt;volume&gt;2019&lt;/volume&gt;&lt;dates&gt;&lt;year&gt;2019&lt;/year&gt;&lt;/dates&gt;&lt;isbn&gt;1758-0463&lt;/isbn&gt;&lt;urls&gt;&lt;related-urls&gt;&lt;url&gt;https://doi.org/10.1093/database/baz046&lt;/url&gt;&lt;/related-urls&gt;&lt;/urls&gt;&lt;custom1&gt;baz046&lt;/custom1&gt;&lt;electronic-resource-num&gt;10.1093/database/baz046&lt;/electronic-resource-num&gt;&lt;access-date&gt;6/29/2023&lt;/access-date&gt;&lt;/record&gt;&lt;/Cite&gt;&lt;/EndNote&gt;</w:instrText>
+            </w:r>
+            <w:r>
+              <w:rPr>
+                <w:rFonts w:ascii="Calibri" w:hAnsi="Calibri" w:cs="Calibri"/>
+                <w:color w:val="000000"/>
+              </w:rPr>
+              <w:fldChar w:fldCharType="separate"/>
+            </w:r>
+            <w:r>
+              <w:rPr>
+                <w:rFonts w:ascii="Calibri" w:hAnsi="Calibri" w:cs="Calibri"/>
+                <w:noProof/>
+                <w:color w:val="000000"/>
+              </w:rPr>
+              <w:t>(1)</w:t>
+            </w:r>
+            <w:r>
+              <w:rPr>
+                <w:rFonts w:ascii="Calibri" w:hAnsi="Calibri" w:cs="Calibri"/>
+                <w:color w:val="000000"/>
+              </w:rPr>
+              <w:fldChar w:fldCharType="end"/>
+            </w:r>
+          </w:p>
+        </w:tc>
+      </w:tr>
+      <w:tr>
+        <w:tc>
+          <w:tcPr>
+            <w:tcW w:w="3317" w:type="dxa"/>
+            <w:vAlign w:val="bottom"/>
+          </w:tcPr>
+          <w:p>
+            <w:r>
+              <w:rPr>
+                <w:rFonts w:ascii="Calibri" w:hAnsi="Calibri" w:cs="Calibri"/>
+                <w:color w:val="000000"/>
+              </w:rPr>
+              <w:t>Endothelial cells</w:t>
+            </w:r>
+          </w:p>
+        </w:tc>
+        <w:tc>
+          <w:tcPr>
+            <w:tcW w:w="3128" w:type="dxa"/>
+            <w:vAlign w:val="bottom"/>
+          </w:tcPr>
+          <w:p>
             <w:proofErr w:type="spellStart"/>
             <w:r>
               <w:rPr>
                 <w:rFonts w:ascii="Calibri" w:hAnsi="Calibri" w:cs="Calibri"/>
                 <w:color w:val="000000"/>
               </w:rPr>
-              <w:t>Vwf</w:t>
+              <w:t>Rprm</w:t>
             </w:r>
             <w:proofErr w:type="spellEnd"/>
           </w:p>
@@ -5422,13 +5918,904 @@
             <w:vAlign w:val="bottom"/>
           </w:tcPr>
           <w:p>
+            <w:r>
+              <w:rPr>
+                <w:rFonts w:ascii="Calibri" w:hAnsi="Calibri" w:cs="Calibri"/>
+                <w:color w:val="000000"/>
+              </w:rPr>
+              <w:t>Exoc3l</w:t>
+            </w:r>
+          </w:p>
+        </w:tc>
+        <w:tc>
+          <w:tcPr>
+            <w:tcW w:w="2617" w:type="dxa"/>
+          </w:tcPr>
+          <w:p>
+            <w:pPr>
+              <w:rPr>
+                <w:rFonts w:ascii="Calibri" w:hAnsi="Calibri" w:cs="Calibri"/>
+                <w:color w:val="000000"/>
+              </w:rPr>
+            </w:pPr>
+            <w:r>
+              <w:rPr>
+                <w:rFonts w:ascii="Calibri" w:hAnsi="Calibri" w:cs="Calibri"/>
+                <w:color w:val="000000"/>
+              </w:rPr>
+              <w:fldChar w:fldCharType="begin"/>
+            </w:r>
+            <w:r>
+              <w:rPr>
+                <w:rFonts w:ascii="Calibri" w:hAnsi="Calibri" w:cs="Calibri"/>
+                <w:color w:val="000000"/>
+              </w:rPr>
+              <w:instrText xml:space="preserve"> ADDIN EN.CITE &lt;EndNote&gt;&lt;Cite&gt;&lt;Author&gt;Franzén&lt;/Author&gt;&lt;Year&gt;2019&lt;/Year&gt;&lt;RecNum&gt;682&lt;/RecNum&gt;&lt;DisplayText&gt;(1)&lt;/DisplayText&gt;&lt;record&gt;&lt;rec-number&gt;682&lt;/rec-number&gt;&lt;foreign-keys&gt;&lt;key app="EN" db-id="xxwwe0rzmffw5tea00tvder2stww5tpt9xwa" timestamp="1691154024" guid="c39a3138-2a5b-4f33-b724-135fd1a0da54"&gt;682&lt;/key&gt;&lt;/foreign-keys&gt;&lt;ref-type name="Journal Article"&gt;17&lt;/ref-type&gt;&lt;contributors&gt;&lt;authors&gt;&lt;author&gt;Franzén, Oscar&lt;/author&gt;&lt;author&gt;Gan, Li-Ming&lt;/author&gt;&lt;author&gt;Björkegren, Johan L M&lt;/author&gt;&lt;/authors&gt;&lt;/contributors&gt;&lt;titles&gt;&lt;title&gt;PanglaoDB: a web server for exploration of mouse and human single-cell RNA sequencing data&lt;/title&gt;&lt;secondary-title&gt;Database&lt;/secondary-title&gt;&lt;/titles&gt;&lt;periodical&gt;&lt;full-title&gt;Database&lt;/full-title&gt;&lt;/periodical&gt;&lt;volume&gt;2019&lt;/volume&gt;&lt;dates&gt;&lt;year&gt;2019&lt;/year&gt;&lt;/dates&gt;&lt;isbn&gt;1758-0463&lt;/isbn&gt;&lt;urls&gt;&lt;related-urls&gt;&lt;url&gt;https://doi.org/10.1093/database/baz046&lt;/url&gt;&lt;/related-urls&gt;&lt;/urls&gt;&lt;custom1&gt;baz046&lt;/custom1&gt;&lt;electronic-resource-num&gt;10.1093/database/baz046&lt;/electronic-resource-num&gt;&lt;access-date&gt;6/29/2023&lt;/access-date&gt;&lt;/record&gt;&lt;/Cite&gt;&lt;/EndNote&gt;</w:instrText>
+            </w:r>
+            <w:r>
+              <w:rPr>
+                <w:rFonts w:ascii="Calibri" w:hAnsi="Calibri" w:cs="Calibri"/>
+                <w:color w:val="000000"/>
+              </w:rPr>
+              <w:fldChar w:fldCharType="separate"/>
+            </w:r>
+            <w:r>
+              <w:rPr>
+                <w:rFonts w:ascii="Calibri" w:hAnsi="Calibri" w:cs="Calibri"/>
+                <w:noProof/>
+                <w:color w:val="000000"/>
+              </w:rPr>
+              <w:t>(1)</w:t>
+            </w:r>
+            <w:r>
+              <w:rPr>
+                <w:rFonts w:ascii="Calibri" w:hAnsi="Calibri" w:cs="Calibri"/>
+                <w:color w:val="000000"/>
+              </w:rPr>
+              <w:fldChar w:fldCharType="end"/>
+            </w:r>
+          </w:p>
+        </w:tc>
+      </w:tr>
+      <w:tr>
+        <w:tc>
+          <w:tcPr>
+            <w:tcW w:w="3317" w:type="dxa"/>
+            <w:vAlign w:val="bottom"/>
+          </w:tcPr>
+          <w:p>
+            <w:r>
+              <w:rPr>
+                <w:rFonts w:ascii="Calibri" w:hAnsi="Calibri" w:cs="Calibri"/>
+                <w:color w:val="000000"/>
+              </w:rPr>
+              <w:t>Endothelial cells</w:t>
+            </w:r>
+          </w:p>
+        </w:tc>
+        <w:tc>
+          <w:tcPr>
+            <w:tcW w:w="3128" w:type="dxa"/>
+            <w:vAlign w:val="bottom"/>
+          </w:tcPr>
+          <w:p>
+            <w:r>
+              <w:rPr>
+                <w:rFonts w:ascii="Calibri" w:hAnsi="Calibri" w:cs="Calibri"/>
+                <w:color w:val="000000"/>
+              </w:rPr>
+              <w:t>Robo4</w:t>
+            </w:r>
+          </w:p>
+        </w:tc>
+        <w:tc>
+          <w:tcPr>
+            <w:tcW w:w="2617" w:type="dxa"/>
+          </w:tcPr>
+          <w:p>
+            <w:pPr>
+              <w:rPr>
+                <w:rFonts w:ascii="Calibri" w:hAnsi="Calibri" w:cs="Calibri"/>
+                <w:color w:val="000000"/>
+              </w:rPr>
+            </w:pPr>
+            <w:r>
+              <w:rPr>
+                <w:rFonts w:ascii="Calibri" w:hAnsi="Calibri" w:cs="Calibri"/>
+                <w:color w:val="000000"/>
+              </w:rPr>
+              <w:fldChar w:fldCharType="begin"/>
+            </w:r>
+            <w:r>
+              <w:rPr>
+                <w:rFonts w:ascii="Calibri" w:hAnsi="Calibri" w:cs="Calibri"/>
+                <w:color w:val="000000"/>
+              </w:rPr>
+              <w:instrText xml:space="preserve"> ADDIN EN.CITE &lt;EndNote&gt;&lt;Cite&gt;&lt;Author&gt;Franzén&lt;/Author&gt;&lt;Year&gt;2019&lt;/Year&gt;&lt;RecNum&gt;682&lt;/RecNum&gt;&lt;DisplayText&gt;(1)&lt;/DisplayText&gt;&lt;record&gt;&lt;rec-number&gt;682&lt;/rec-number&gt;&lt;foreign-keys&gt;&lt;key app="EN" db-id="xxwwe0rzmffw5tea00tvder2stww5tpt9xwa" timestamp="1691154024" guid="c39a3138-2a5b-4f33-b724-135fd1a0da54"&gt;682&lt;/key&gt;&lt;/foreign-keys&gt;&lt;ref-type name="Journal Article"&gt;17&lt;/ref-type&gt;&lt;contributors&gt;&lt;authors&gt;&lt;author&gt;Franzén, Oscar&lt;/author&gt;&lt;author&gt;Gan, Li-Ming&lt;/author&gt;&lt;author&gt;Björkegren, Johan L M&lt;/author&gt;&lt;/authors&gt;&lt;/contributors&gt;&lt;titles&gt;&lt;title&gt;PanglaoDB: a web server for exploration of mouse and human single-cell RNA sequencing data&lt;/title&gt;&lt;secondary-title&gt;Database&lt;/secondary-title&gt;&lt;/titles&gt;&lt;periodical&gt;&lt;full-title&gt;Database&lt;/full-title&gt;&lt;/periodical&gt;&lt;volume&gt;2019&lt;/volume&gt;&lt;dates&gt;&lt;year&gt;2019&lt;/year&gt;&lt;/dates&gt;&lt;isbn&gt;1758-0463&lt;/isbn&gt;&lt;urls&gt;&lt;related-urls&gt;&lt;url&gt;https://doi.org/10.1093/database/baz046&lt;/url&gt;&lt;/related-urls&gt;&lt;/urls&gt;&lt;custom1&gt;baz046&lt;/custom1&gt;&lt;electronic-resource-num&gt;10.1093/database/baz046&lt;/electronic-resource-num&gt;&lt;access-date&gt;6/29/2023&lt;/access-date&gt;&lt;/record&gt;&lt;/Cite&gt;&lt;/EndNote&gt;</w:instrText>
+            </w:r>
+            <w:r>
+              <w:rPr>
+                <w:rFonts w:ascii="Calibri" w:hAnsi="Calibri" w:cs="Calibri"/>
+                <w:color w:val="000000"/>
+              </w:rPr>
+              <w:fldChar w:fldCharType="separate"/>
+            </w:r>
+            <w:r>
+              <w:rPr>
+                <w:rFonts w:ascii="Calibri" w:hAnsi="Calibri" w:cs="Calibri"/>
+                <w:noProof/>
+                <w:color w:val="000000"/>
+              </w:rPr>
+              <w:t>(1)</w:t>
+            </w:r>
+            <w:r>
+              <w:rPr>
+                <w:rFonts w:ascii="Calibri" w:hAnsi="Calibri" w:cs="Calibri"/>
+                <w:color w:val="000000"/>
+              </w:rPr>
+              <w:fldChar w:fldCharType="end"/>
+            </w:r>
+          </w:p>
+        </w:tc>
+      </w:tr>
+      <w:tr>
+        <w:tc>
+          <w:tcPr>
+            <w:tcW w:w="3317" w:type="dxa"/>
+            <w:vAlign w:val="bottom"/>
+          </w:tcPr>
+          <w:p>
+            <w:r>
+              <w:rPr>
+                <w:rFonts w:ascii="Calibri" w:hAnsi="Calibri" w:cs="Calibri"/>
+                <w:color w:val="000000"/>
+              </w:rPr>
+              <w:t>Endothelial cells</w:t>
+            </w:r>
+          </w:p>
+        </w:tc>
+        <w:tc>
+          <w:tcPr>
+            <w:tcW w:w="3128" w:type="dxa"/>
+            <w:vAlign w:val="bottom"/>
+          </w:tcPr>
+          <w:p>
+            <w:r>
+              <w:rPr>
+                <w:rFonts w:ascii="Calibri" w:hAnsi="Calibri" w:cs="Calibri"/>
+                <w:color w:val="000000"/>
+              </w:rPr>
+              <w:t>Scarf1</w:t>
+            </w:r>
+          </w:p>
+        </w:tc>
+        <w:tc>
+          <w:tcPr>
+            <w:tcW w:w="2617" w:type="dxa"/>
+          </w:tcPr>
+          <w:p>
+            <w:pPr>
+              <w:rPr>
+                <w:rFonts w:ascii="Calibri" w:hAnsi="Calibri" w:cs="Calibri"/>
+                <w:color w:val="000000"/>
+              </w:rPr>
+            </w:pPr>
+            <w:r>
+              <w:rPr>
+                <w:rFonts w:ascii="Calibri" w:hAnsi="Calibri" w:cs="Calibri"/>
+                <w:color w:val="000000"/>
+              </w:rPr>
+              <w:fldChar w:fldCharType="begin"/>
+            </w:r>
+            <w:r>
+              <w:rPr>
+                <w:rFonts w:ascii="Calibri" w:hAnsi="Calibri" w:cs="Calibri"/>
+                <w:color w:val="000000"/>
+              </w:rPr>
+              <w:instrText xml:space="preserve"> ADDIN EN.CITE &lt;EndNote&gt;&lt;Cite&gt;&lt;Author&gt;Franzén&lt;/Author&gt;&lt;Year&gt;2019&lt;/Year&gt;&lt;RecNum&gt;682&lt;/RecNum&gt;&lt;DisplayText&gt;(1)&lt;/DisplayText&gt;&lt;record&gt;&lt;rec-number&gt;682&lt;/rec-number&gt;&lt;foreign-keys&gt;&lt;key app="EN" db-id="xxwwe0rzmffw5tea00tvder2stww5tpt9xwa" timestamp="1691154024" guid="c39a3138-2a5b-4f33-b724-135fd1a0da54"&gt;682&lt;/key&gt;&lt;/foreign-keys&gt;&lt;ref-type name="Journal Article"&gt;17&lt;/ref-type&gt;&lt;contributors&gt;&lt;authors&gt;&lt;author&gt;Franzén, Oscar&lt;/author&gt;&lt;author&gt;Gan, Li-Ming&lt;/author&gt;&lt;author&gt;Björkegren, Johan L M&lt;/author&gt;&lt;/authors&gt;&lt;/contributors&gt;&lt;titles&gt;&lt;title&gt;PanglaoDB: a web server for exploration of mouse and human single-cell RNA sequencing data&lt;/title&gt;&lt;secondary-title&gt;Database&lt;/secondary-title&gt;&lt;/titles&gt;&lt;periodical&gt;&lt;full-title&gt;Database&lt;/full-title&gt;&lt;/periodical&gt;&lt;volume&gt;2019&lt;/volume&gt;&lt;dates&gt;&lt;year&gt;2019&lt;/year&gt;&lt;/dates&gt;&lt;isbn&gt;1758-0463&lt;/isbn&gt;&lt;urls&gt;&lt;related-urls&gt;&lt;url&gt;https://doi.org/10.1093/database/baz046&lt;/url&gt;&lt;/related-urls&gt;&lt;/urls&gt;&lt;custom1&gt;baz046&lt;/custom1&gt;&lt;electronic-resource-num&gt;10.1093/database/baz046&lt;/electronic-resource-num&gt;&lt;access-date&gt;6/29/2023&lt;/access-date&gt;&lt;/record&gt;&lt;/Cite&gt;&lt;/EndNote&gt;</w:instrText>
+            </w:r>
+            <w:r>
+              <w:rPr>
+                <w:rFonts w:ascii="Calibri" w:hAnsi="Calibri" w:cs="Calibri"/>
+                <w:color w:val="000000"/>
+              </w:rPr>
+              <w:fldChar w:fldCharType="separate"/>
+            </w:r>
+            <w:r>
+              <w:rPr>
+                <w:rFonts w:ascii="Calibri" w:hAnsi="Calibri" w:cs="Calibri"/>
+                <w:noProof/>
+                <w:color w:val="000000"/>
+              </w:rPr>
+              <w:t>(1)</w:t>
+            </w:r>
+            <w:r>
+              <w:rPr>
+                <w:rFonts w:ascii="Calibri" w:hAnsi="Calibri" w:cs="Calibri"/>
+                <w:color w:val="000000"/>
+              </w:rPr>
+              <w:fldChar w:fldCharType="end"/>
+            </w:r>
+          </w:p>
+        </w:tc>
+      </w:tr>
+      <w:tr>
+        <w:tc>
+          <w:tcPr>
+            <w:tcW w:w="3317" w:type="dxa"/>
+            <w:vAlign w:val="bottom"/>
+          </w:tcPr>
+          <w:p>
+            <w:r>
+              <w:rPr>
+                <w:rFonts w:ascii="Calibri" w:hAnsi="Calibri" w:cs="Calibri"/>
+                <w:color w:val="000000"/>
+              </w:rPr>
+              <w:t>Endothelial cells</w:t>
+            </w:r>
+          </w:p>
+        </w:tc>
+        <w:tc>
+          <w:tcPr>
+            <w:tcW w:w="3128" w:type="dxa"/>
+            <w:vAlign w:val="bottom"/>
+          </w:tcPr>
+          <w:p>
+            <w:r>
+              <w:rPr>
+                <w:rFonts w:ascii="Calibri" w:hAnsi="Calibri" w:cs="Calibri"/>
+                <w:color w:val="000000"/>
+              </w:rPr>
+              <w:t>Sox18</w:t>
+            </w:r>
+          </w:p>
+        </w:tc>
+        <w:tc>
+          <w:tcPr>
+            <w:tcW w:w="2617" w:type="dxa"/>
+          </w:tcPr>
+          <w:p>
+            <w:pPr>
+              <w:rPr>
+                <w:rFonts w:ascii="Calibri" w:hAnsi="Calibri" w:cs="Calibri"/>
+                <w:color w:val="000000"/>
+              </w:rPr>
+            </w:pPr>
+            <w:r>
+              <w:rPr>
+                <w:rFonts w:ascii="Calibri" w:hAnsi="Calibri" w:cs="Calibri"/>
+                <w:color w:val="000000"/>
+              </w:rPr>
+              <w:fldChar w:fldCharType="begin"/>
+            </w:r>
+            <w:r>
+              <w:rPr>
+                <w:rFonts w:ascii="Calibri" w:hAnsi="Calibri" w:cs="Calibri"/>
+                <w:color w:val="000000"/>
+              </w:rPr>
+              <w:instrText xml:space="preserve"> ADDIN EN.CITE &lt;EndNote&gt;&lt;Cite&gt;&lt;Author&gt;Franzén&lt;/Author&gt;&lt;Year&gt;2019&lt;/Year&gt;&lt;RecNum&gt;682&lt;/RecNum&gt;&lt;DisplayText&gt;(1)&lt;/DisplayText&gt;&lt;record&gt;&lt;rec-number&gt;682&lt;/rec-number&gt;&lt;foreign-keys&gt;&lt;key app="EN" db-id="xxwwe0rzmffw5tea00tvder2stww5tpt9xwa" timestamp="1691154024" guid="c39a3138-2a5b-4f33-b724-135fd1a0da54"&gt;682&lt;/key&gt;&lt;/foreign-keys&gt;&lt;ref-type name="Journal Article"&gt;17&lt;/ref-type&gt;&lt;contributors&gt;&lt;authors&gt;&lt;author&gt;Franzén, Oscar&lt;/author&gt;&lt;author&gt;Gan, Li-Ming&lt;/author&gt;&lt;author&gt;Björkegren, Johan L M&lt;/author&gt;&lt;/authors&gt;&lt;/contributors&gt;&lt;titles&gt;&lt;title&gt;PanglaoDB: a web server for exploration of mouse and human single-cell RNA sequencing data&lt;/title&gt;&lt;secondary-title&gt;Database&lt;/secondary-title&gt;&lt;/titles&gt;&lt;periodical&gt;&lt;full-title&gt;Database&lt;/full-title&gt;&lt;/periodical&gt;&lt;volume&gt;2019&lt;/volume&gt;&lt;dates&gt;&lt;year&gt;2019&lt;/year&gt;&lt;/dates&gt;&lt;isbn&gt;1758-0463&lt;/isbn&gt;&lt;urls&gt;&lt;related-urls&gt;&lt;url&gt;https://doi.org/10.1093/database/baz046&lt;/url&gt;&lt;/related-urls&gt;&lt;/urls&gt;&lt;custom1&gt;baz046&lt;/custom1&gt;&lt;electronic-resource-num&gt;10.1093/database/baz046&lt;/electronic-resource-num&gt;&lt;access-date&gt;6/29/2023&lt;/access-date&gt;&lt;/record&gt;&lt;/Cite&gt;&lt;/EndNote&gt;</w:instrText>
+            </w:r>
+            <w:r>
+              <w:rPr>
+                <w:rFonts w:ascii="Calibri" w:hAnsi="Calibri" w:cs="Calibri"/>
+                <w:color w:val="000000"/>
+              </w:rPr>
+              <w:fldChar w:fldCharType="separate"/>
+            </w:r>
+            <w:r>
+              <w:rPr>
+                <w:rFonts w:ascii="Calibri" w:hAnsi="Calibri" w:cs="Calibri"/>
+                <w:noProof/>
+                <w:color w:val="000000"/>
+              </w:rPr>
+              <w:t>(1)</w:t>
+            </w:r>
+            <w:r>
+              <w:rPr>
+                <w:rFonts w:ascii="Calibri" w:hAnsi="Calibri" w:cs="Calibri"/>
+                <w:color w:val="000000"/>
+              </w:rPr>
+              <w:fldChar w:fldCharType="end"/>
+            </w:r>
+          </w:p>
+        </w:tc>
+      </w:tr>
+      <w:tr>
+        <w:tc>
+          <w:tcPr>
+            <w:tcW w:w="3317" w:type="dxa"/>
+            <w:vAlign w:val="bottom"/>
+          </w:tcPr>
+          <w:p>
+            <w:r>
+              <w:rPr>
+                <w:rFonts w:ascii="Calibri" w:hAnsi="Calibri" w:cs="Calibri"/>
+                <w:color w:val="000000"/>
+              </w:rPr>
+              <w:t>Endothelial cells</w:t>
+            </w:r>
+          </w:p>
+        </w:tc>
+        <w:tc>
+          <w:tcPr>
+            <w:tcW w:w="3128" w:type="dxa"/>
+            <w:vAlign w:val="bottom"/>
+          </w:tcPr>
+          <w:p>
+            <w:r>
+              <w:rPr>
+                <w:rFonts w:ascii="Calibri" w:hAnsi="Calibri" w:cs="Calibri"/>
+                <w:color w:val="000000"/>
+              </w:rPr>
+              <w:t>Sox7</w:t>
+            </w:r>
+          </w:p>
+        </w:tc>
+        <w:tc>
+          <w:tcPr>
+            <w:tcW w:w="2617" w:type="dxa"/>
+          </w:tcPr>
+          <w:p>
+            <w:pPr>
+              <w:rPr>
+                <w:rFonts w:ascii="Calibri" w:hAnsi="Calibri" w:cs="Calibri"/>
+                <w:color w:val="000000"/>
+              </w:rPr>
+            </w:pPr>
+            <w:r>
+              <w:rPr>
+                <w:rFonts w:ascii="Calibri" w:hAnsi="Calibri" w:cs="Calibri"/>
+                <w:color w:val="000000"/>
+              </w:rPr>
+              <w:fldChar w:fldCharType="begin"/>
+            </w:r>
+            <w:r>
+              <w:rPr>
+                <w:rFonts w:ascii="Calibri" w:hAnsi="Calibri" w:cs="Calibri"/>
+                <w:color w:val="000000"/>
+              </w:rPr>
+              <w:instrText xml:space="preserve"> ADDIN EN.CITE &lt;EndNote&gt;&lt;Cite&gt;&lt;Author&gt;Franzén&lt;/Author&gt;&lt;Year&gt;2019&lt;/Year&gt;&lt;RecNum&gt;682&lt;/RecNum&gt;&lt;DisplayText&gt;(1)&lt;/DisplayText&gt;&lt;record&gt;&lt;rec-number&gt;682&lt;/rec-number&gt;&lt;foreign-keys&gt;&lt;key app="EN" db-id="xxwwe0rzmffw5tea00tvder2stww5tpt9xwa" timestamp="1691154024" guid="c39a3138-2a5b-4f33-b724-135fd1a0da54"&gt;682&lt;/key&gt;&lt;/foreign-keys&gt;&lt;ref-type name="Journal Article"&gt;17&lt;/ref-type&gt;&lt;contributors&gt;&lt;authors&gt;&lt;author&gt;Franzén, Oscar&lt;/author&gt;&lt;author&gt;Gan, Li-Ming&lt;/author&gt;&lt;author&gt;Björkegren, Johan L M&lt;/author&gt;&lt;/authors&gt;&lt;/contributors&gt;&lt;titles&gt;&lt;title&gt;PanglaoDB: a web server for exploration of mouse and human single-cell RNA sequencing data&lt;/title&gt;&lt;secondary-title&gt;Database&lt;/secondary-title&gt;&lt;/titles&gt;&lt;periodical&gt;&lt;full-title&gt;Database&lt;/full-title&gt;&lt;/periodical&gt;&lt;volume&gt;2019&lt;/volume&gt;&lt;dates&gt;&lt;year&gt;2019&lt;/year&gt;&lt;/dates&gt;&lt;isbn&gt;1758-0463&lt;/isbn&gt;&lt;urls&gt;&lt;related-urls&gt;&lt;url&gt;https://doi.org/10.1093/database/baz046&lt;/url&gt;&lt;/related-urls&gt;&lt;/urls&gt;&lt;custom1&gt;baz046&lt;/custom1&gt;&lt;electronic-resource-num&gt;10.1093/database/baz046&lt;/electronic-resource-num&gt;&lt;access-date&gt;6/29/2023&lt;/access-date&gt;&lt;/record&gt;&lt;/Cite&gt;&lt;/EndNote&gt;</w:instrText>
+            </w:r>
+            <w:r>
+              <w:rPr>
+                <w:rFonts w:ascii="Calibri" w:hAnsi="Calibri" w:cs="Calibri"/>
+                <w:color w:val="000000"/>
+              </w:rPr>
+              <w:fldChar w:fldCharType="separate"/>
+            </w:r>
+            <w:r>
+              <w:rPr>
+                <w:rFonts w:ascii="Calibri" w:hAnsi="Calibri" w:cs="Calibri"/>
+                <w:noProof/>
+                <w:color w:val="000000"/>
+              </w:rPr>
+              <w:t>(1)</w:t>
+            </w:r>
+            <w:r>
+              <w:rPr>
+                <w:rFonts w:ascii="Calibri" w:hAnsi="Calibri" w:cs="Calibri"/>
+                <w:color w:val="000000"/>
+              </w:rPr>
+              <w:fldChar w:fldCharType="end"/>
+            </w:r>
+          </w:p>
+        </w:tc>
+      </w:tr>
+      <w:tr>
+        <w:tc>
+          <w:tcPr>
+            <w:tcW w:w="3317" w:type="dxa"/>
+            <w:vAlign w:val="bottom"/>
+          </w:tcPr>
+          <w:p>
+            <w:r>
+              <w:rPr>
+                <w:rFonts w:ascii="Calibri" w:hAnsi="Calibri" w:cs="Calibri"/>
+                <w:color w:val="000000"/>
+              </w:rPr>
+              <w:t>Endothelial cells</w:t>
+            </w:r>
+          </w:p>
+        </w:tc>
+        <w:tc>
+          <w:tcPr>
+            <w:tcW w:w="3128" w:type="dxa"/>
+            <w:vAlign w:val="bottom"/>
+          </w:tcPr>
+          <w:p>
+            <w:r>
+              <w:rPr>
+                <w:rFonts w:ascii="Calibri" w:hAnsi="Calibri" w:cs="Calibri"/>
+                <w:color w:val="000000"/>
+              </w:rPr>
+              <w:t>Spns2</w:t>
+            </w:r>
+          </w:p>
+        </w:tc>
+        <w:tc>
+          <w:tcPr>
+            <w:tcW w:w="2617" w:type="dxa"/>
+          </w:tcPr>
+          <w:p>
+            <w:pPr>
+              <w:rPr>
+                <w:rFonts w:ascii="Calibri" w:hAnsi="Calibri" w:cs="Calibri"/>
+                <w:color w:val="000000"/>
+              </w:rPr>
+            </w:pPr>
+            <w:r>
+              <w:rPr>
+                <w:rFonts w:ascii="Calibri" w:hAnsi="Calibri" w:cs="Calibri"/>
+                <w:color w:val="000000"/>
+              </w:rPr>
+              <w:fldChar w:fldCharType="begin"/>
+            </w:r>
+            <w:r>
+              <w:rPr>
+                <w:rFonts w:ascii="Calibri" w:hAnsi="Calibri" w:cs="Calibri"/>
+                <w:color w:val="000000"/>
+              </w:rPr>
+              <w:instrText xml:space="preserve"> ADDIN EN.CITE &lt;EndNote&gt;&lt;Cite&gt;&lt;Author&gt;Franzén&lt;/Author&gt;&lt;Year&gt;2019&lt;/Year&gt;&lt;RecNum&gt;682&lt;/RecNum&gt;&lt;DisplayText&gt;(1)&lt;/DisplayText&gt;&lt;record&gt;&lt;rec-number&gt;682&lt;/rec-number&gt;&lt;foreign-keys&gt;&lt;key app="EN" db-id="xxwwe0rzmffw5tea00tvder2stww5tpt9xwa" timestamp="1691154024" guid="c39a3138-2a5b-4f33-b724-135fd1a0da54"&gt;682&lt;/key&gt;&lt;/foreign-keys&gt;&lt;ref-type name="Journal Article"&gt;17&lt;/ref-type&gt;&lt;contributors&gt;&lt;authors&gt;&lt;author&gt;Franzén, Oscar&lt;/author&gt;&lt;author&gt;Gan, Li-Ming&lt;/author&gt;&lt;author&gt;Björkegren, Johan L M&lt;/author&gt;&lt;/authors&gt;&lt;/contributors&gt;&lt;titles&gt;&lt;title&gt;PanglaoDB: a web server for exploration of mouse and human single-cell RNA sequencing data&lt;/title&gt;&lt;secondary-title&gt;Database&lt;/secondary-title&gt;&lt;/titles&gt;&lt;periodical&gt;&lt;full-title&gt;Database&lt;/full-title&gt;&lt;/periodical&gt;&lt;volume&gt;2019&lt;/volume&gt;&lt;dates&gt;&lt;year&gt;2019&lt;/year&gt;&lt;/dates&gt;&lt;isbn&gt;1758-0463&lt;/isbn&gt;&lt;urls&gt;&lt;related-urls&gt;&lt;url&gt;https://doi.org/10.1093/database/baz046&lt;/url&gt;&lt;/related-urls&gt;&lt;/urls&gt;&lt;custom1&gt;baz046&lt;/custom1&gt;&lt;electronic-resource-num&gt;10.1093/database/baz046&lt;/electronic-resource-num&gt;&lt;access-date&gt;6/29/2023&lt;/access-date&gt;&lt;/record&gt;&lt;/Cite&gt;&lt;/EndNote&gt;</w:instrText>
+            </w:r>
+            <w:r>
+              <w:rPr>
+                <w:rFonts w:ascii="Calibri" w:hAnsi="Calibri" w:cs="Calibri"/>
+                <w:color w:val="000000"/>
+              </w:rPr>
+              <w:fldChar w:fldCharType="separate"/>
+            </w:r>
+            <w:r>
+              <w:rPr>
+                <w:rFonts w:ascii="Calibri" w:hAnsi="Calibri" w:cs="Calibri"/>
+                <w:noProof/>
+                <w:color w:val="000000"/>
+              </w:rPr>
+              <w:t>(1)</w:t>
+            </w:r>
+            <w:r>
+              <w:rPr>
+                <w:rFonts w:ascii="Calibri" w:hAnsi="Calibri" w:cs="Calibri"/>
+                <w:color w:val="000000"/>
+              </w:rPr>
+              <w:fldChar w:fldCharType="end"/>
+            </w:r>
+          </w:p>
+        </w:tc>
+      </w:tr>
+      <w:tr>
+        <w:tc>
+          <w:tcPr>
+            <w:tcW w:w="3317" w:type="dxa"/>
+            <w:vAlign w:val="bottom"/>
+          </w:tcPr>
+          <w:p>
+            <w:r>
+              <w:rPr>
+                <w:rFonts w:ascii="Calibri" w:hAnsi="Calibri" w:cs="Calibri"/>
+                <w:color w:val="000000"/>
+              </w:rPr>
+              <w:t>Endothelial cells</w:t>
+            </w:r>
+          </w:p>
+        </w:tc>
+        <w:tc>
+          <w:tcPr>
+            <w:tcW w:w="3128" w:type="dxa"/>
+            <w:vAlign w:val="bottom"/>
+          </w:tcPr>
+          <w:p>
+            <w:r>
+              <w:rPr>
+                <w:rFonts w:ascii="Calibri" w:hAnsi="Calibri" w:cs="Calibri"/>
+                <w:color w:val="000000"/>
+              </w:rPr>
+              <w:t>Thsd1</w:t>
+            </w:r>
+          </w:p>
+        </w:tc>
+        <w:tc>
+          <w:tcPr>
+            <w:tcW w:w="2617" w:type="dxa"/>
+          </w:tcPr>
+          <w:p>
+            <w:pPr>
+              <w:rPr>
+                <w:rFonts w:ascii="Calibri" w:hAnsi="Calibri" w:cs="Calibri"/>
+                <w:color w:val="000000"/>
+              </w:rPr>
+            </w:pPr>
+            <w:r>
+              <w:rPr>
+                <w:rFonts w:ascii="Calibri" w:hAnsi="Calibri" w:cs="Calibri"/>
+                <w:color w:val="000000"/>
+              </w:rPr>
+              <w:fldChar w:fldCharType="begin"/>
+            </w:r>
+            <w:r>
+              <w:rPr>
+                <w:rFonts w:ascii="Calibri" w:hAnsi="Calibri" w:cs="Calibri"/>
+                <w:color w:val="000000"/>
+              </w:rPr>
+              <w:instrText xml:space="preserve"> ADDIN EN.CITE &lt;EndNote&gt;&lt;Cite&gt;&lt;Author&gt;Franzén&lt;/Author&gt;&lt;Year&gt;2019&lt;/Year&gt;&lt;RecNum&gt;682&lt;/RecNum&gt;&lt;DisplayText&gt;(1)&lt;/DisplayText&gt;&lt;record&gt;&lt;rec-number&gt;682&lt;/rec-number&gt;&lt;foreign-keys&gt;&lt;key app="EN" db-id="xxwwe0rzmffw5tea00tvder2stww5tpt9xwa" timestamp="1691154024" guid="c39a3138-2a5b-4f33-b724-135fd1a0da54"&gt;682&lt;/key&gt;&lt;/foreign-keys&gt;&lt;ref-type name="Journal Article"&gt;17&lt;/ref-type&gt;&lt;contributors&gt;&lt;authors&gt;&lt;author&gt;Franzén, Oscar&lt;/author&gt;&lt;author&gt;Gan, Li-Ming&lt;/author&gt;&lt;author&gt;Björkegren, Johan L M&lt;/author&gt;&lt;/authors&gt;&lt;/contributors&gt;&lt;titles&gt;&lt;title&gt;PanglaoDB: a web server for exploration of mouse and human single-cell RNA sequencing data&lt;/title&gt;&lt;secondary-title&gt;Database&lt;/secondary-title&gt;&lt;/titles&gt;&lt;periodical&gt;&lt;full-title&gt;Database&lt;/full-title&gt;&lt;/periodical&gt;&lt;volume&gt;2019&lt;/volume&gt;&lt;dates&gt;&lt;year&gt;2019&lt;/year&gt;&lt;/dates&gt;&lt;isbn&gt;1758-0463&lt;/isbn&gt;&lt;urls&gt;&lt;related-urls&gt;&lt;url&gt;https://doi.org/10.1093/database/baz046&lt;/url&gt;&lt;/related-urls&gt;&lt;/urls&gt;&lt;custom1&gt;baz046&lt;/custom1&gt;&lt;electronic-resource-num&gt;10.1093/database/baz046&lt;/electronic-resource-num&gt;&lt;access-date&gt;6/29/2023&lt;/access-date&gt;&lt;/record&gt;&lt;/Cite&gt;&lt;/EndNote&gt;</w:instrText>
+            </w:r>
+            <w:r>
+              <w:rPr>
+                <w:rFonts w:ascii="Calibri" w:hAnsi="Calibri" w:cs="Calibri"/>
+                <w:color w:val="000000"/>
+              </w:rPr>
+              <w:fldChar w:fldCharType="separate"/>
+            </w:r>
+            <w:r>
+              <w:rPr>
+                <w:rFonts w:ascii="Calibri" w:hAnsi="Calibri" w:cs="Calibri"/>
+                <w:noProof/>
+                <w:color w:val="000000"/>
+              </w:rPr>
+              <w:t>(1)</w:t>
+            </w:r>
+            <w:r>
+              <w:rPr>
+                <w:rFonts w:ascii="Calibri" w:hAnsi="Calibri" w:cs="Calibri"/>
+                <w:color w:val="000000"/>
+              </w:rPr>
+              <w:fldChar w:fldCharType="end"/>
+            </w:r>
+          </w:p>
+        </w:tc>
+      </w:tr>
+      <w:tr>
+        <w:tc>
+          <w:tcPr>
+            <w:tcW w:w="3317" w:type="dxa"/>
+            <w:vAlign w:val="bottom"/>
+          </w:tcPr>
+          <w:p>
+            <w:r>
+              <w:rPr>
+                <w:rFonts w:ascii="Calibri" w:hAnsi="Calibri" w:cs="Calibri"/>
+                <w:color w:val="000000"/>
+              </w:rPr>
+              <w:t>Endothelial cells</w:t>
+            </w:r>
+          </w:p>
+        </w:tc>
+        <w:tc>
+          <w:tcPr>
+            <w:tcW w:w="3128" w:type="dxa"/>
+            <w:vAlign w:val="bottom"/>
+          </w:tcPr>
+          <w:p>
+            <w:r>
+              <w:rPr>
+                <w:rFonts w:ascii="Calibri" w:hAnsi="Calibri" w:cs="Calibri"/>
+                <w:color w:val="000000"/>
+              </w:rPr>
+              <w:t>Rnase1</w:t>
+            </w:r>
+          </w:p>
+        </w:tc>
+        <w:tc>
+          <w:tcPr>
+            <w:tcW w:w="2617" w:type="dxa"/>
+          </w:tcPr>
+          <w:p>
+            <w:pPr>
+              <w:rPr>
+                <w:rFonts w:ascii="Calibri" w:hAnsi="Calibri" w:cs="Calibri"/>
+                <w:color w:val="000000"/>
+              </w:rPr>
+            </w:pPr>
+            <w:r>
+              <w:rPr>
+                <w:rFonts w:ascii="Calibri" w:hAnsi="Calibri" w:cs="Calibri"/>
+                <w:color w:val="000000"/>
+              </w:rPr>
+              <w:fldChar w:fldCharType="begin"/>
+            </w:r>
+            <w:r>
+              <w:rPr>
+                <w:rFonts w:ascii="Calibri" w:hAnsi="Calibri" w:cs="Calibri"/>
+                <w:color w:val="000000"/>
+              </w:rPr>
+              <w:instrText xml:space="preserve"> ADDIN EN.CITE &lt;EndNote&gt;&lt;Cite&gt;&lt;Author&gt;Franzén&lt;/Author&gt;&lt;Year&gt;2019&lt;/Year&gt;&lt;RecNum&gt;682&lt;/RecNum&gt;&lt;DisplayText&gt;(1)&lt;/DisplayText&gt;&lt;record&gt;&lt;rec-number&gt;682&lt;/rec-number&gt;&lt;foreign-keys&gt;&lt;key app="EN" db-id="xxwwe0rzmffw5tea00tvder2stww5tpt9xwa" timestamp="1691154024" guid="c39a3138-2a5b-4f33-b724-135fd1a0da54"&gt;682&lt;/key&gt;&lt;/foreign-keys&gt;&lt;ref-type name="Journal Article"&gt;17&lt;/ref-type&gt;&lt;contributors&gt;&lt;authors&gt;&lt;author&gt;Franzén, Oscar&lt;/author&gt;&lt;author&gt;Gan, Li-Ming&lt;/author&gt;&lt;author&gt;Björkegren, Johan L M&lt;/author&gt;&lt;/authors&gt;&lt;/contributors&gt;&lt;titles&gt;&lt;title&gt;PanglaoDB: a web server for exploration of mouse and human single-cell RNA sequencing data&lt;/title&gt;&lt;secondary-title&gt;Database&lt;/secondary-title&gt;&lt;/titles&gt;&lt;periodical&gt;&lt;full-title&gt;Database&lt;/full-title&gt;&lt;/periodical&gt;&lt;volume&gt;2019&lt;/volume&gt;&lt;dates&gt;&lt;year&gt;2019&lt;/year&gt;&lt;/dates&gt;&lt;isbn&gt;1758-0463&lt;/isbn&gt;&lt;urls&gt;&lt;related-urls&gt;&lt;url&gt;https://doi.org/10.1093/database/baz046&lt;/url&gt;&lt;/related-urls&gt;&lt;/urls&gt;&lt;custom1&gt;baz046&lt;/custom1&gt;&lt;electronic-resource-num&gt;10.1093/database/baz046&lt;/electronic-resource-num&gt;&lt;access-date&gt;6/29/2023&lt;/access-date&gt;&lt;/record&gt;&lt;/Cite&gt;&lt;/EndNote&gt;</w:instrText>
+            </w:r>
+            <w:r>
+              <w:rPr>
+                <w:rFonts w:ascii="Calibri" w:hAnsi="Calibri" w:cs="Calibri"/>
+                <w:color w:val="000000"/>
+              </w:rPr>
+              <w:fldChar w:fldCharType="separate"/>
+            </w:r>
+            <w:r>
+              <w:rPr>
+                <w:rFonts w:ascii="Calibri" w:hAnsi="Calibri" w:cs="Calibri"/>
+                <w:noProof/>
+                <w:color w:val="000000"/>
+              </w:rPr>
+              <w:t>(1)</w:t>
+            </w:r>
+            <w:r>
+              <w:rPr>
+                <w:rFonts w:ascii="Calibri" w:hAnsi="Calibri" w:cs="Calibri"/>
+                <w:color w:val="000000"/>
+              </w:rPr>
+              <w:fldChar w:fldCharType="end"/>
+            </w:r>
+          </w:p>
+        </w:tc>
+      </w:tr>
+      <w:tr>
+        <w:tc>
+          <w:tcPr>
+            <w:tcW w:w="3317" w:type="dxa"/>
+            <w:vAlign w:val="bottom"/>
+          </w:tcPr>
+          <w:p>
+            <w:r>
+              <w:rPr>
+                <w:rFonts w:ascii="Calibri" w:hAnsi="Calibri" w:cs="Calibri"/>
+                <w:color w:val="000000"/>
+              </w:rPr>
+              <w:t>Endothelial cells</w:t>
+            </w:r>
+          </w:p>
+        </w:tc>
+        <w:tc>
+          <w:tcPr>
+            <w:tcW w:w="3128" w:type="dxa"/>
+            <w:vAlign w:val="bottom"/>
+          </w:tcPr>
+          <w:p>
+            <w:r>
+              <w:rPr>
+                <w:rFonts w:ascii="Calibri" w:hAnsi="Calibri" w:cs="Calibri"/>
+                <w:color w:val="000000"/>
+              </w:rPr>
+              <w:t>Rbp7</w:t>
+            </w:r>
+          </w:p>
+        </w:tc>
+        <w:tc>
+          <w:tcPr>
+            <w:tcW w:w="2617" w:type="dxa"/>
+          </w:tcPr>
+          <w:p>
+            <w:pPr>
+              <w:rPr>
+                <w:rFonts w:ascii="Calibri" w:hAnsi="Calibri" w:cs="Calibri"/>
+                <w:color w:val="000000"/>
+              </w:rPr>
+            </w:pPr>
+            <w:r>
+              <w:rPr>
+                <w:rFonts w:ascii="Calibri" w:hAnsi="Calibri" w:cs="Calibri"/>
+                <w:color w:val="000000"/>
+              </w:rPr>
+              <w:fldChar w:fldCharType="begin"/>
+            </w:r>
+            <w:r>
+              <w:rPr>
+                <w:rFonts w:ascii="Calibri" w:hAnsi="Calibri" w:cs="Calibri"/>
+                <w:color w:val="000000"/>
+              </w:rPr>
+              <w:instrText xml:space="preserve"> ADDIN EN.CITE &lt;EndNote&gt;&lt;Cite&gt;&lt;Author&gt;Franzén&lt;/Author&gt;&lt;Year&gt;2019&lt;/Year&gt;&lt;RecNum&gt;682&lt;/RecNum&gt;&lt;DisplayText&gt;(1)&lt;/DisplayText&gt;&lt;record&gt;&lt;rec-number&gt;682&lt;/rec-number&gt;&lt;foreign-keys&gt;&lt;key app="EN" db-id="xxwwe0rzmffw5tea00tvder2stww5tpt9xwa" timestamp="1691154024" guid="c39a3138-2a5b-4f33-b724-135fd1a0da54"&gt;682&lt;/key&gt;&lt;/foreign-keys&gt;&lt;ref-type name="Journal Article"&gt;17&lt;/ref-type&gt;&lt;contributors&gt;&lt;authors&gt;&lt;author&gt;Franzén, Oscar&lt;/author&gt;&lt;author&gt;Gan, Li-Ming&lt;/author&gt;&lt;author&gt;Björkegren, Johan L M&lt;/author&gt;&lt;/authors&gt;&lt;/contributors&gt;&lt;titles&gt;&lt;title&gt;PanglaoDB: a web server for exploration of mouse and human single-cell RNA sequencing data&lt;/title&gt;&lt;secondary-title&gt;Database&lt;/secondary-title&gt;&lt;/titles&gt;&lt;periodical&gt;&lt;full-title&gt;Database&lt;/full-title&gt;&lt;/periodical&gt;&lt;volume&gt;2019&lt;/volume&gt;&lt;dates&gt;&lt;year&gt;2019&lt;/year&gt;&lt;/dates&gt;&lt;isbn&gt;1758-0463&lt;/isbn&gt;&lt;urls&gt;&lt;related-urls&gt;&lt;url&gt;https://doi.org/10.1093/database/baz046&lt;/url&gt;&lt;/related-urls&gt;&lt;/urls&gt;&lt;custom1&gt;baz046&lt;/custom1&gt;&lt;electronic-resource-num&gt;10.1093/database/baz046&lt;/electronic-resource-num&gt;&lt;access-date&gt;6/29/2023&lt;/access-date&gt;&lt;/record&gt;&lt;/Cite&gt;&lt;/EndNote&gt;</w:instrText>
+            </w:r>
+            <w:r>
+              <w:rPr>
+                <w:rFonts w:ascii="Calibri" w:hAnsi="Calibri" w:cs="Calibri"/>
+                <w:color w:val="000000"/>
+              </w:rPr>
+              <w:fldChar w:fldCharType="separate"/>
+            </w:r>
+            <w:r>
+              <w:rPr>
+                <w:rFonts w:ascii="Calibri" w:hAnsi="Calibri" w:cs="Calibri"/>
+                <w:noProof/>
+                <w:color w:val="000000"/>
+              </w:rPr>
+              <w:t>(1)</w:t>
+            </w:r>
+            <w:r>
+              <w:rPr>
+                <w:rFonts w:ascii="Calibri" w:hAnsi="Calibri" w:cs="Calibri"/>
+                <w:color w:val="000000"/>
+              </w:rPr>
+              <w:fldChar w:fldCharType="end"/>
+            </w:r>
+          </w:p>
+        </w:tc>
+      </w:tr>
+      <w:tr>
+        <w:tc>
+          <w:tcPr>
+            <w:tcW w:w="3317" w:type="dxa"/>
+            <w:vAlign w:val="bottom"/>
+          </w:tcPr>
+          <w:p>
+            <w:r>
+              <w:rPr>
+                <w:rFonts w:ascii="Calibri" w:hAnsi="Calibri" w:cs="Calibri"/>
+                <w:color w:val="000000"/>
+              </w:rPr>
+              <w:t>Endothelial cells</w:t>
+            </w:r>
+          </w:p>
+        </w:tc>
+        <w:tc>
+          <w:tcPr>
+            <w:tcW w:w="3128" w:type="dxa"/>
+            <w:vAlign w:val="bottom"/>
+          </w:tcPr>
+          <w:p>
+            <w:r>
+              <w:rPr>
+                <w:rFonts w:ascii="Calibri" w:hAnsi="Calibri" w:cs="Calibri"/>
+                <w:color w:val="000000"/>
+              </w:rPr>
+              <w:t>Tcf15</w:t>
+            </w:r>
+          </w:p>
+        </w:tc>
+        <w:tc>
+          <w:tcPr>
+            <w:tcW w:w="2617" w:type="dxa"/>
+          </w:tcPr>
+          <w:p>
+            <w:pPr>
+              <w:rPr>
+                <w:rFonts w:ascii="Calibri" w:hAnsi="Calibri" w:cs="Calibri"/>
+                <w:color w:val="000000"/>
+              </w:rPr>
+            </w:pPr>
+            <w:r>
+              <w:rPr>
+                <w:rFonts w:ascii="Calibri" w:hAnsi="Calibri" w:cs="Calibri"/>
+                <w:color w:val="000000"/>
+              </w:rPr>
+              <w:fldChar w:fldCharType="begin"/>
+            </w:r>
+            <w:r>
+              <w:rPr>
+                <w:rFonts w:ascii="Calibri" w:hAnsi="Calibri" w:cs="Calibri"/>
+                <w:color w:val="000000"/>
+              </w:rPr>
+              <w:instrText xml:space="preserve"> ADDIN EN.CITE &lt;EndNote&gt;&lt;Cite&gt;&lt;Author&gt;Franzén&lt;/Author&gt;&lt;Year&gt;2019&lt;/Year&gt;&lt;RecNum&gt;682&lt;/RecNum&gt;&lt;DisplayText&gt;(1)&lt;/DisplayText&gt;&lt;record&gt;&lt;rec-number&gt;682&lt;/rec-number&gt;&lt;foreign-keys&gt;&lt;key app="EN" db-id="xxwwe0rzmffw5tea00tvder2stww5tpt9xwa" timestamp="1691154024" guid="c39a3138-2a5b-4f33-b724-135fd1a0da54"&gt;682&lt;/key&gt;&lt;/foreign-keys&gt;&lt;ref-type name="Journal Article"&gt;17&lt;/ref-type&gt;&lt;contributors&gt;&lt;authors&gt;&lt;author&gt;Franzén, Oscar&lt;/author&gt;&lt;author&gt;Gan, Li-Ming&lt;/author&gt;&lt;author&gt;Björkegren, Johan L M&lt;/author&gt;&lt;/authors&gt;&lt;/contributors&gt;&lt;titles&gt;&lt;title&gt;PanglaoDB: a web server for exploration of mouse and human single-cell RNA sequencing data&lt;/title&gt;&lt;secondary-title&gt;Database&lt;/secondary-title&gt;&lt;/titles&gt;&lt;periodical&gt;&lt;full-title&gt;Database&lt;/full-title&gt;&lt;/periodical&gt;&lt;volume&gt;2019&lt;/volume&gt;&lt;dates&gt;&lt;year&gt;2019&lt;/year&gt;&lt;/dates&gt;&lt;isbn&gt;1758-0463&lt;/isbn&gt;&lt;urls&gt;&lt;related-urls&gt;&lt;url&gt;https://doi.org/10.1093/database/baz046&lt;/url&gt;&lt;/related-urls&gt;&lt;/urls&gt;&lt;custom1&gt;baz046&lt;/custom1&gt;&lt;electronic-resource-num&gt;10.1093/database/baz046&lt;/electronic-resource-num&gt;&lt;access-date&gt;6/29/2023&lt;/access-date&gt;&lt;/record&gt;&lt;/Cite&gt;&lt;/EndNote&gt;</w:instrText>
+            </w:r>
+            <w:r>
+              <w:rPr>
+                <w:rFonts w:ascii="Calibri" w:hAnsi="Calibri" w:cs="Calibri"/>
+                <w:color w:val="000000"/>
+              </w:rPr>
+              <w:fldChar w:fldCharType="separate"/>
+            </w:r>
+            <w:r>
+              <w:rPr>
+                <w:rFonts w:ascii="Calibri" w:hAnsi="Calibri" w:cs="Calibri"/>
+                <w:noProof/>
+                <w:color w:val="000000"/>
+              </w:rPr>
+              <w:t>(1)</w:t>
+            </w:r>
+            <w:r>
+              <w:rPr>
+                <w:rFonts w:ascii="Calibri" w:hAnsi="Calibri" w:cs="Calibri"/>
+                <w:color w:val="000000"/>
+              </w:rPr>
+              <w:fldChar w:fldCharType="end"/>
+            </w:r>
+          </w:p>
+        </w:tc>
+      </w:tr>
+      <w:tr>
+        <w:tc>
+          <w:tcPr>
+            <w:tcW w:w="3317" w:type="dxa"/>
+            <w:vAlign w:val="bottom"/>
+          </w:tcPr>
+          <w:p>
+            <w:r>
+              <w:rPr>
+                <w:rFonts w:ascii="Calibri" w:hAnsi="Calibri" w:cs="Calibri"/>
+                <w:color w:val="000000"/>
+              </w:rPr>
+              <w:t>Endothelial cells</w:t>
+            </w:r>
+          </w:p>
+        </w:tc>
+        <w:tc>
+          <w:tcPr>
+            <w:tcW w:w="3128" w:type="dxa"/>
+            <w:vAlign w:val="bottom"/>
+          </w:tcPr>
+          <w:p>
+            <w:r>
+              <w:rPr>
+                <w:rFonts w:ascii="Calibri" w:hAnsi="Calibri" w:cs="Calibri"/>
+                <w:color w:val="000000"/>
+              </w:rPr>
+              <w:t>Ramp3</w:t>
+            </w:r>
+          </w:p>
+        </w:tc>
+        <w:tc>
+          <w:tcPr>
+            <w:tcW w:w="2617" w:type="dxa"/>
+          </w:tcPr>
+          <w:p>
+            <w:pPr>
+              <w:rPr>
+                <w:rFonts w:ascii="Calibri" w:hAnsi="Calibri" w:cs="Calibri"/>
+                <w:color w:val="000000"/>
+              </w:rPr>
+            </w:pPr>
+            <w:r>
+              <w:rPr>
+                <w:rFonts w:ascii="Calibri" w:hAnsi="Calibri" w:cs="Calibri"/>
+                <w:color w:val="000000"/>
+              </w:rPr>
+              <w:fldChar w:fldCharType="begin"/>
+            </w:r>
+            <w:r>
+              <w:rPr>
+                <w:rFonts w:ascii="Calibri" w:hAnsi="Calibri" w:cs="Calibri"/>
+                <w:color w:val="000000"/>
+              </w:rPr>
+              <w:instrText xml:space="preserve"> ADDIN EN.CITE &lt;EndNote&gt;&lt;Cite&gt;&lt;Author&gt;Franzén&lt;/Author&gt;&lt;Year&gt;2019&lt;/Year&gt;&lt;RecNum&gt;682&lt;/RecNum&gt;&lt;DisplayText&gt;(1)&lt;/DisplayText&gt;&lt;record&gt;&lt;rec-number&gt;682&lt;/rec-number&gt;&lt;foreign-keys&gt;&lt;key app="EN" db-id="xxwwe0rzmffw5tea00tvder2stww5tpt9xwa" timestamp="1691154024" guid="c39a3138-2a5b-4f33-b724-135fd1a0da54"&gt;682&lt;/key&gt;&lt;/foreign-keys&gt;&lt;ref-type name="Journal Article"&gt;17&lt;/ref-type&gt;&lt;contributors&gt;&lt;authors&gt;&lt;author&gt;Franzén, Oscar&lt;/author&gt;&lt;author&gt;Gan, Li-Ming&lt;/author&gt;&lt;author&gt;Björkegren, Johan L M&lt;/author&gt;&lt;/authors&gt;&lt;/contributors&gt;&lt;titles&gt;&lt;title&gt;PanglaoDB: a web server for exploration of mouse and human single-cell RNA sequencing data&lt;/title&gt;&lt;secondary-title&gt;Database&lt;/secondary-title&gt;&lt;/titles&gt;&lt;periodical&gt;&lt;full-title&gt;Database&lt;/full-title&gt;&lt;/periodical&gt;&lt;volume&gt;2019&lt;/volume&gt;&lt;dates&gt;&lt;year&gt;2019&lt;/year&gt;&lt;/dates&gt;&lt;isbn&gt;1758-0463&lt;/isbn&gt;&lt;urls&gt;&lt;related-urls&gt;&lt;url&gt;https://doi.org/10.1093/database/baz046&lt;/url&gt;&lt;/related-urls&gt;&lt;/urls&gt;&lt;custom1&gt;baz046&lt;/custom1&gt;&lt;electronic-resource-num&gt;10.1093/database/baz046&lt;/electronic-resource-num&gt;&lt;access-date&gt;6/29/2023&lt;/access-date&gt;&lt;/record&gt;&lt;/Cite&gt;&lt;/EndNote&gt;</w:instrText>
+            </w:r>
+            <w:r>
+              <w:rPr>
+                <w:rFonts w:ascii="Calibri" w:hAnsi="Calibri" w:cs="Calibri"/>
+                <w:color w:val="000000"/>
+              </w:rPr>
+              <w:fldChar w:fldCharType="separate"/>
+            </w:r>
+            <w:r>
+              <w:rPr>
+                <w:rFonts w:ascii="Calibri" w:hAnsi="Calibri" w:cs="Calibri"/>
+                <w:noProof/>
+                <w:color w:val="000000"/>
+              </w:rPr>
+              <w:t>(1)</w:t>
+            </w:r>
+            <w:r>
+              <w:rPr>
+                <w:rFonts w:ascii="Calibri" w:hAnsi="Calibri" w:cs="Calibri"/>
+                <w:color w:val="000000"/>
+              </w:rPr>
+              <w:fldChar w:fldCharType="end"/>
+            </w:r>
+          </w:p>
+        </w:tc>
+      </w:tr>
+      <w:tr>
+        <w:tc>
+          <w:tcPr>
+            <w:tcW w:w="3317" w:type="dxa"/>
+            <w:vAlign w:val="bottom"/>
+          </w:tcPr>
+          <w:p>
+            <w:r>
+              <w:rPr>
+                <w:rFonts w:ascii="Calibri" w:hAnsi="Calibri" w:cs="Calibri"/>
+                <w:color w:val="000000"/>
+              </w:rPr>
+              <w:t>Endothelial cells</w:t>
+            </w:r>
+          </w:p>
+        </w:tc>
+        <w:tc>
+          <w:tcPr>
+            <w:tcW w:w="3128" w:type="dxa"/>
+            <w:vAlign w:val="bottom"/>
+          </w:tcPr>
+          <w:p>
             <w:proofErr w:type="spellStart"/>
             <w:r>
               <w:rPr>
                 <w:rFonts w:ascii="Calibri" w:hAnsi="Calibri" w:cs="Calibri"/>
                 <w:color w:val="000000"/>
               </w:rPr>
-              <w:t>Thbd</w:t>
+              <w:t>Vegfc</w:t>
             </w:r>
             <w:proofErr w:type="spellEnd"/>
           </w:p>
@@ -5510,7 +6897,7 @@
                 <w:rFonts w:ascii="Calibri" w:hAnsi="Calibri" w:cs="Calibri"/>
                 <w:color w:val="000000"/>
               </w:rPr>
-              <w:t>Slco1c1</w:t>
+              <w:t>Rnd1</w:t>
             </w:r>
           </w:p>
         </w:tc>
@@ -5591,7 +6978,7 @@
                 <w:rFonts w:ascii="Calibri" w:hAnsi="Calibri" w:cs="Calibri"/>
                 <w:color w:val="000000"/>
               </w:rPr>
-              <w:t>Tmem100</w:t>
+              <w:t>Sema3d</w:t>
             </w:r>
           </w:p>
         </w:tc>
@@ -5672,7 +7059,7 @@
                 <w:rFonts w:ascii="Calibri" w:hAnsi="Calibri" w:cs="Calibri"/>
                 <w:color w:val="000000"/>
               </w:rPr>
-              <w:t>Rasip1</w:t>
+              <w:t>Wfdc1</w:t>
             </w:r>
           </w:p>
         </w:tc>
@@ -5753,7 +7140,7 @@
                 <w:rFonts w:ascii="Calibri" w:hAnsi="Calibri" w:cs="Calibri"/>
                 <w:color w:val="000000"/>
               </w:rPr>
-              <w:t>Tie1</w:t>
+              <w:t>Vwa1</w:t>
             </w:r>
           </w:p>
         </w:tc>
@@ -5829,13 +7216,418 @@
             <w:vAlign w:val="bottom"/>
           </w:tcPr>
           <w:p>
+            <w:r>
+              <w:rPr>
+                <w:rFonts w:ascii="Calibri" w:hAnsi="Calibri" w:cs="Calibri"/>
+                <w:color w:val="000000"/>
+              </w:rPr>
+              <w:t>Tbx1</w:t>
+            </w:r>
+          </w:p>
+        </w:tc>
+        <w:tc>
+          <w:tcPr>
+            <w:tcW w:w="2617" w:type="dxa"/>
+          </w:tcPr>
+          <w:p>
+            <w:pPr>
+              <w:rPr>
+                <w:rFonts w:ascii="Calibri" w:hAnsi="Calibri" w:cs="Calibri"/>
+                <w:color w:val="000000"/>
+              </w:rPr>
+            </w:pPr>
+            <w:r>
+              <w:rPr>
+                <w:rFonts w:ascii="Calibri" w:hAnsi="Calibri" w:cs="Calibri"/>
+                <w:color w:val="000000"/>
+              </w:rPr>
+              <w:fldChar w:fldCharType="begin"/>
+            </w:r>
+            <w:r>
+              <w:rPr>
+                <w:rFonts w:ascii="Calibri" w:hAnsi="Calibri" w:cs="Calibri"/>
+                <w:color w:val="000000"/>
+              </w:rPr>
+              <w:instrText xml:space="preserve"> ADDIN EN.CITE &lt;EndNote&gt;&lt;Cite&gt;&lt;Author&gt;Franzén&lt;/Author&gt;&lt;Year&gt;2019&lt;/Year&gt;&lt;RecNum&gt;682&lt;/RecNum&gt;&lt;DisplayText&gt;(1)&lt;/DisplayText&gt;&lt;record&gt;&lt;rec-number&gt;682&lt;/rec-number&gt;&lt;foreign-keys&gt;&lt;key app="EN" db-id="xxwwe0rzmffw5tea00tvder2stww5tpt9xwa" timestamp="1691154024" guid="c39a3138-2a5b-4f33-b724-135fd1a0da54"&gt;682&lt;/key&gt;&lt;/foreign-keys&gt;&lt;ref-type name="Journal Article"&gt;17&lt;/ref-type&gt;&lt;contributors&gt;&lt;authors&gt;&lt;author&gt;Franzén, Oscar&lt;/author&gt;&lt;author&gt;Gan, Li-Ming&lt;/author&gt;&lt;author&gt;Björkegren, Johan L M&lt;/author&gt;&lt;/authors&gt;&lt;/contributors&gt;&lt;titles&gt;&lt;title&gt;PanglaoDB: a web server for exploration of mouse and human single-cell RNA sequencing data&lt;/title&gt;&lt;secondary-title&gt;Database&lt;/secondary-title&gt;&lt;/titles&gt;&lt;periodical&gt;&lt;full-title&gt;Database&lt;/full-title&gt;&lt;/periodical&gt;&lt;volume&gt;2019&lt;/volume&gt;&lt;dates&gt;&lt;year&gt;2019&lt;/year&gt;&lt;/dates&gt;&lt;isbn&gt;1758-0463&lt;/isbn&gt;&lt;urls&gt;&lt;related-urls&gt;&lt;url&gt;https://doi.org/10.1093/database/baz046&lt;/url&gt;&lt;/related-urls&gt;&lt;/urls&gt;&lt;custom1&gt;baz046&lt;/custom1&gt;&lt;electronic-resource-num&gt;10.1093/database/baz046&lt;/electronic-resource-num&gt;&lt;access-date&gt;6/29/2023&lt;/access-date&gt;&lt;/record&gt;&lt;/Cite&gt;&lt;/EndNote&gt;</w:instrText>
+            </w:r>
+            <w:r>
+              <w:rPr>
+                <w:rFonts w:ascii="Calibri" w:hAnsi="Calibri" w:cs="Calibri"/>
+                <w:color w:val="000000"/>
+              </w:rPr>
+              <w:fldChar w:fldCharType="separate"/>
+            </w:r>
+            <w:r>
+              <w:rPr>
+                <w:rFonts w:ascii="Calibri" w:hAnsi="Calibri" w:cs="Calibri"/>
+                <w:noProof/>
+                <w:color w:val="000000"/>
+              </w:rPr>
+              <w:t>(1)</w:t>
+            </w:r>
+            <w:r>
+              <w:rPr>
+                <w:rFonts w:ascii="Calibri" w:hAnsi="Calibri" w:cs="Calibri"/>
+                <w:color w:val="000000"/>
+              </w:rPr>
+              <w:fldChar w:fldCharType="end"/>
+            </w:r>
+          </w:p>
+        </w:tc>
+      </w:tr>
+      <w:tr>
+        <w:tc>
+          <w:tcPr>
+            <w:tcW w:w="3317" w:type="dxa"/>
+            <w:vAlign w:val="bottom"/>
+          </w:tcPr>
+          <w:p>
+            <w:r>
+              <w:rPr>
+                <w:rFonts w:ascii="Calibri" w:hAnsi="Calibri" w:cs="Calibri"/>
+                <w:color w:val="000000"/>
+              </w:rPr>
+              <w:t>Endothelial cells</w:t>
+            </w:r>
+          </w:p>
+        </w:tc>
+        <w:tc>
+          <w:tcPr>
+            <w:tcW w:w="3128" w:type="dxa"/>
+            <w:vAlign w:val="bottom"/>
+          </w:tcPr>
+          <w:p>
+            <w:r>
+              <w:rPr>
+                <w:rFonts w:ascii="Calibri" w:hAnsi="Calibri" w:cs="Calibri"/>
+                <w:color w:val="000000"/>
+              </w:rPr>
+              <w:t>Sema7a</w:t>
+            </w:r>
+          </w:p>
+        </w:tc>
+        <w:tc>
+          <w:tcPr>
+            <w:tcW w:w="2617" w:type="dxa"/>
+          </w:tcPr>
+          <w:p>
+            <w:pPr>
+              <w:rPr>
+                <w:rFonts w:ascii="Calibri" w:hAnsi="Calibri" w:cs="Calibri"/>
+                <w:color w:val="000000"/>
+              </w:rPr>
+            </w:pPr>
+            <w:r>
+              <w:rPr>
+                <w:rFonts w:ascii="Calibri" w:hAnsi="Calibri" w:cs="Calibri"/>
+                <w:color w:val="000000"/>
+              </w:rPr>
+              <w:fldChar w:fldCharType="begin"/>
+            </w:r>
+            <w:r>
+              <w:rPr>
+                <w:rFonts w:ascii="Calibri" w:hAnsi="Calibri" w:cs="Calibri"/>
+                <w:color w:val="000000"/>
+              </w:rPr>
+              <w:instrText xml:space="preserve"> ADDIN EN.CITE &lt;EndNote&gt;&lt;Cite&gt;&lt;Author&gt;Franzén&lt;/Author&gt;&lt;Year&gt;2019&lt;/Year&gt;&lt;RecNum&gt;682&lt;/RecNum&gt;&lt;DisplayText&gt;(1)&lt;/DisplayText&gt;&lt;record&gt;&lt;rec-number&gt;682&lt;/rec-number&gt;&lt;foreign-keys&gt;&lt;key app="EN" db-id="xxwwe0rzmffw5tea00tvder2stww5tpt9xwa" timestamp="1691154024" guid="c39a3138-2a5b-4f33-b724-135fd1a0da54"&gt;682&lt;/key&gt;&lt;/foreign-keys&gt;&lt;ref-type name="Journal Article"&gt;17&lt;/ref-type&gt;&lt;contributors&gt;&lt;authors&gt;&lt;author&gt;Franzén, Oscar&lt;/author&gt;&lt;author&gt;Gan, Li-Ming&lt;/author&gt;&lt;author&gt;Björkegren, Johan L M&lt;/author&gt;&lt;/authors&gt;&lt;/contributors&gt;&lt;titles&gt;&lt;title&gt;PanglaoDB: a web server for exploration of mouse and human single-cell RNA sequencing data&lt;/title&gt;&lt;secondary-title&gt;Database&lt;/secondary-title&gt;&lt;/titles&gt;&lt;periodical&gt;&lt;full-title&gt;Database&lt;/full-title&gt;&lt;/periodical&gt;&lt;volume&gt;2019&lt;/volume&gt;&lt;dates&gt;&lt;year&gt;2019&lt;/year&gt;&lt;/dates&gt;&lt;isbn&gt;1758-0463&lt;/isbn&gt;&lt;urls&gt;&lt;related-urls&gt;&lt;url&gt;https://doi.org/10.1093/database/baz046&lt;/url&gt;&lt;/related-urls&gt;&lt;/urls&gt;&lt;custom1&gt;baz046&lt;/custom1&gt;&lt;electronic-resource-num&gt;10.1093/database/baz046&lt;/electronic-resource-num&gt;&lt;access-date&gt;6/29/2023&lt;/access-date&gt;&lt;/record&gt;&lt;/Cite&gt;&lt;/EndNote&gt;</w:instrText>
+            </w:r>
+            <w:r>
+              <w:rPr>
+                <w:rFonts w:ascii="Calibri" w:hAnsi="Calibri" w:cs="Calibri"/>
+                <w:color w:val="000000"/>
+              </w:rPr>
+              <w:fldChar w:fldCharType="separate"/>
+            </w:r>
+            <w:r>
+              <w:rPr>
+                <w:rFonts w:ascii="Calibri" w:hAnsi="Calibri" w:cs="Calibri"/>
+                <w:noProof/>
+                <w:color w:val="000000"/>
+              </w:rPr>
+              <w:t>(1)</w:t>
+            </w:r>
+            <w:r>
+              <w:rPr>
+                <w:rFonts w:ascii="Calibri" w:hAnsi="Calibri" w:cs="Calibri"/>
+                <w:color w:val="000000"/>
+              </w:rPr>
+              <w:fldChar w:fldCharType="end"/>
+            </w:r>
+          </w:p>
+        </w:tc>
+      </w:tr>
+      <w:tr>
+        <w:tc>
+          <w:tcPr>
+            <w:tcW w:w="3317" w:type="dxa"/>
+            <w:vAlign w:val="bottom"/>
+          </w:tcPr>
+          <w:p>
+            <w:r>
+              <w:rPr>
+                <w:rFonts w:ascii="Calibri" w:hAnsi="Calibri" w:cs="Calibri"/>
+                <w:color w:val="000000"/>
+              </w:rPr>
+              <w:t>Endothelial cells</w:t>
+            </w:r>
+          </w:p>
+        </w:tc>
+        <w:tc>
+          <w:tcPr>
+            <w:tcW w:w="3128" w:type="dxa"/>
+            <w:vAlign w:val="bottom"/>
+          </w:tcPr>
+          <w:p>
+            <w:r>
+              <w:rPr>
+                <w:rFonts w:ascii="Calibri" w:hAnsi="Calibri" w:cs="Calibri"/>
+                <w:color w:val="000000"/>
+              </w:rPr>
+              <w:t>Tgfbr2</w:t>
+            </w:r>
+          </w:p>
+        </w:tc>
+        <w:tc>
+          <w:tcPr>
+            <w:tcW w:w="2617" w:type="dxa"/>
+          </w:tcPr>
+          <w:p>
+            <w:pPr>
+              <w:rPr>
+                <w:rFonts w:ascii="Calibri" w:hAnsi="Calibri" w:cs="Calibri"/>
+                <w:color w:val="000000"/>
+              </w:rPr>
+            </w:pPr>
+            <w:r>
+              <w:rPr>
+                <w:rFonts w:ascii="Calibri" w:hAnsi="Calibri" w:cs="Calibri"/>
+                <w:color w:val="000000"/>
+              </w:rPr>
+              <w:fldChar w:fldCharType="begin"/>
+            </w:r>
+            <w:r>
+              <w:rPr>
+                <w:rFonts w:ascii="Calibri" w:hAnsi="Calibri" w:cs="Calibri"/>
+                <w:color w:val="000000"/>
+              </w:rPr>
+              <w:instrText xml:space="preserve"> ADDIN EN.CITE &lt;EndNote&gt;&lt;Cite&gt;&lt;Author&gt;Franzén&lt;/Author&gt;&lt;Year&gt;2019&lt;/Year&gt;&lt;RecNum&gt;682&lt;/RecNum&gt;&lt;DisplayText&gt;(1)&lt;/DisplayText&gt;&lt;record&gt;&lt;rec-number&gt;682&lt;/rec-number&gt;&lt;foreign-keys&gt;&lt;key app="EN" db-id="xxwwe0rzmffw5tea00tvder2stww5tpt9xwa" timestamp="1691154024" guid="c39a3138-2a5b-4f33-b724-135fd1a0da54"&gt;682&lt;/key&gt;&lt;/foreign-keys&gt;&lt;ref-type name="Journal Article"&gt;17&lt;/ref-type&gt;&lt;contributors&gt;&lt;authors&gt;&lt;author&gt;Franzén, Oscar&lt;/author&gt;&lt;author&gt;Gan, Li-Ming&lt;/author&gt;&lt;author&gt;Björkegren, Johan L M&lt;/author&gt;&lt;/authors&gt;&lt;/contributors&gt;&lt;titles&gt;&lt;title&gt;PanglaoDB: a web server for exploration of mouse and human single-cell RNA sequencing data&lt;/title&gt;&lt;secondary-title&gt;Database&lt;/secondary-title&gt;&lt;/titles&gt;&lt;periodical&gt;&lt;full-title&gt;Database&lt;/full-title&gt;&lt;/periodical&gt;&lt;volume&gt;2019&lt;/volume&gt;&lt;dates&gt;&lt;year&gt;2019&lt;/year&gt;&lt;/dates&gt;&lt;isbn&gt;1758-0463&lt;/isbn&gt;&lt;urls&gt;&lt;related-urls&gt;&lt;url&gt;https://doi.org/10.1093/database/baz046&lt;/url&gt;&lt;/related-urls&gt;&lt;/urls&gt;&lt;custom1&gt;baz046&lt;/custom1&gt;&lt;electronic-resource-num&gt;10.1093/database/baz046&lt;/electronic-resource-num&gt;&lt;access-date&gt;6/29/2023&lt;/access-date&gt;&lt;/record&gt;&lt;/Cite&gt;&lt;/EndNote&gt;</w:instrText>
+            </w:r>
+            <w:r>
+              <w:rPr>
+                <w:rFonts w:ascii="Calibri" w:hAnsi="Calibri" w:cs="Calibri"/>
+                <w:color w:val="000000"/>
+              </w:rPr>
+              <w:fldChar w:fldCharType="separate"/>
+            </w:r>
+            <w:r>
+              <w:rPr>
+                <w:rFonts w:ascii="Calibri" w:hAnsi="Calibri" w:cs="Calibri"/>
+                <w:noProof/>
+                <w:color w:val="000000"/>
+              </w:rPr>
+              <w:t>(1)</w:t>
+            </w:r>
+            <w:r>
+              <w:rPr>
+                <w:rFonts w:ascii="Calibri" w:hAnsi="Calibri" w:cs="Calibri"/>
+                <w:color w:val="000000"/>
+              </w:rPr>
+              <w:fldChar w:fldCharType="end"/>
+            </w:r>
+          </w:p>
+        </w:tc>
+      </w:tr>
+      <w:tr>
+        <w:tc>
+          <w:tcPr>
+            <w:tcW w:w="3317" w:type="dxa"/>
+            <w:vAlign w:val="bottom"/>
+          </w:tcPr>
+          <w:p>
+            <w:r>
+              <w:rPr>
+                <w:rFonts w:ascii="Calibri" w:hAnsi="Calibri" w:cs="Calibri"/>
+                <w:color w:val="000000"/>
+              </w:rPr>
+              <w:t>Endothelial cells</w:t>
+            </w:r>
+          </w:p>
+        </w:tc>
+        <w:tc>
+          <w:tcPr>
+            <w:tcW w:w="3128" w:type="dxa"/>
+            <w:vAlign w:val="bottom"/>
+          </w:tcPr>
+          <w:p>
+            <w:r>
+              <w:rPr>
+                <w:rFonts w:ascii="Calibri" w:hAnsi="Calibri" w:cs="Calibri"/>
+                <w:color w:val="000000"/>
+              </w:rPr>
+              <w:t>Slc2a1</w:t>
+            </w:r>
+          </w:p>
+        </w:tc>
+        <w:tc>
+          <w:tcPr>
+            <w:tcW w:w="2617" w:type="dxa"/>
+          </w:tcPr>
+          <w:p>
+            <w:pPr>
+              <w:rPr>
+                <w:rFonts w:ascii="Calibri" w:hAnsi="Calibri" w:cs="Calibri"/>
+                <w:color w:val="000000"/>
+              </w:rPr>
+            </w:pPr>
+            <w:r>
+              <w:rPr>
+                <w:rFonts w:ascii="Calibri" w:hAnsi="Calibri" w:cs="Calibri"/>
+                <w:color w:val="000000"/>
+              </w:rPr>
+              <w:fldChar w:fldCharType="begin"/>
+            </w:r>
+            <w:r>
+              <w:rPr>
+                <w:rFonts w:ascii="Calibri" w:hAnsi="Calibri" w:cs="Calibri"/>
+                <w:color w:val="000000"/>
+              </w:rPr>
+              <w:instrText xml:space="preserve"> ADDIN EN.CITE &lt;EndNote&gt;&lt;Cite&gt;&lt;Author&gt;Franzén&lt;/Author&gt;&lt;Year&gt;2019&lt;/Year&gt;&lt;RecNum&gt;682&lt;/RecNum&gt;&lt;DisplayText&gt;(1)&lt;/DisplayText&gt;&lt;record&gt;&lt;rec-number&gt;682&lt;/rec-number&gt;&lt;foreign-keys&gt;&lt;key app="EN" db-id="xxwwe0rzmffw5tea00tvder2stww5tpt9xwa" timestamp="1691154024" guid="c39a3138-2a5b-4f33-b724-135fd1a0da54"&gt;682&lt;/key&gt;&lt;/foreign-keys&gt;&lt;ref-type name="Journal Article"&gt;17&lt;/ref-type&gt;&lt;contributors&gt;&lt;authors&gt;&lt;author&gt;Franzén, Oscar&lt;/author&gt;&lt;author&gt;Gan, Li-Ming&lt;/author&gt;&lt;author&gt;Björkegren, Johan L M&lt;/author&gt;&lt;/authors&gt;&lt;/contributors&gt;&lt;titles&gt;&lt;title&gt;PanglaoDB: a web server for exploration of mouse and human single-cell RNA sequencing data&lt;/title&gt;&lt;secondary-title&gt;Database&lt;/secondary-title&gt;&lt;/titles&gt;&lt;periodical&gt;&lt;full-title&gt;Database&lt;/full-title&gt;&lt;/periodical&gt;&lt;volume&gt;2019&lt;/volume&gt;&lt;dates&gt;&lt;year&gt;2019&lt;/year&gt;&lt;/dates&gt;&lt;isbn&gt;1758-0463&lt;/isbn&gt;&lt;urls&gt;&lt;related-urls&gt;&lt;url&gt;https://doi.org/10.1093/database/baz046&lt;/url&gt;&lt;/related-urls&gt;&lt;/urls&gt;&lt;custom1&gt;baz046&lt;/custom1&gt;&lt;electronic-resource-num&gt;10.1093/database/baz046&lt;/electronic-resource-num&gt;&lt;access-date&gt;6/29/2023&lt;/access-date&gt;&lt;/record&gt;&lt;/Cite&gt;&lt;/EndNote&gt;</w:instrText>
+            </w:r>
+            <w:r>
+              <w:rPr>
+                <w:rFonts w:ascii="Calibri" w:hAnsi="Calibri" w:cs="Calibri"/>
+                <w:color w:val="000000"/>
+              </w:rPr>
+              <w:fldChar w:fldCharType="separate"/>
+            </w:r>
+            <w:r>
+              <w:rPr>
+                <w:rFonts w:ascii="Calibri" w:hAnsi="Calibri" w:cs="Calibri"/>
+                <w:noProof/>
+                <w:color w:val="000000"/>
+              </w:rPr>
+              <w:t>(1)</w:t>
+            </w:r>
+            <w:r>
+              <w:rPr>
+                <w:rFonts w:ascii="Calibri" w:hAnsi="Calibri" w:cs="Calibri"/>
+                <w:color w:val="000000"/>
+              </w:rPr>
+              <w:fldChar w:fldCharType="end"/>
+            </w:r>
+          </w:p>
+        </w:tc>
+      </w:tr>
+      <w:tr>
+        <w:tc>
+          <w:tcPr>
+            <w:tcW w:w="3317" w:type="dxa"/>
+            <w:vAlign w:val="bottom"/>
+          </w:tcPr>
+          <w:p>
+            <w:r>
+              <w:rPr>
+                <w:rFonts w:ascii="Calibri" w:hAnsi="Calibri" w:cs="Calibri"/>
+                <w:color w:val="000000"/>
+              </w:rPr>
+              <w:t>Endothelial cells</w:t>
+            </w:r>
+          </w:p>
+        </w:tc>
+        <w:tc>
+          <w:tcPr>
+            <w:tcW w:w="3128" w:type="dxa"/>
+            <w:vAlign w:val="bottom"/>
+          </w:tcPr>
+          <w:p>
+            <w:r>
+              <w:rPr>
+                <w:rFonts w:ascii="Calibri" w:hAnsi="Calibri" w:cs="Calibri"/>
+                <w:color w:val="000000"/>
+              </w:rPr>
+              <w:t>Tspan8</w:t>
+            </w:r>
+          </w:p>
+        </w:tc>
+        <w:tc>
+          <w:tcPr>
+            <w:tcW w:w="2617" w:type="dxa"/>
+          </w:tcPr>
+          <w:p>
+            <w:pPr>
+              <w:rPr>
+                <w:rFonts w:ascii="Calibri" w:hAnsi="Calibri" w:cs="Calibri"/>
+                <w:color w:val="000000"/>
+              </w:rPr>
+            </w:pPr>
+            <w:r>
+              <w:rPr>
+                <w:rFonts w:ascii="Calibri" w:hAnsi="Calibri" w:cs="Calibri"/>
+                <w:color w:val="000000"/>
+              </w:rPr>
+              <w:fldChar w:fldCharType="begin"/>
+            </w:r>
+            <w:r>
+              <w:rPr>
+                <w:rFonts w:ascii="Calibri" w:hAnsi="Calibri" w:cs="Calibri"/>
+                <w:color w:val="000000"/>
+              </w:rPr>
+              <w:instrText xml:space="preserve"> ADDIN EN.CITE &lt;EndNote&gt;&lt;Cite&gt;&lt;Author&gt;Franzén&lt;/Author&gt;&lt;Year&gt;2019&lt;/Year&gt;&lt;RecNum&gt;682&lt;/RecNum&gt;&lt;DisplayText&gt;(1)&lt;/DisplayText&gt;&lt;record&gt;&lt;rec-number&gt;682&lt;/rec-number&gt;&lt;foreign-keys&gt;&lt;key app="EN" db-id="xxwwe0rzmffw5tea00tvder2stww5tpt9xwa" timestamp="1691154024" guid="c39a3138-2a5b-4f33-b724-135fd1a0da54"&gt;682&lt;/key&gt;&lt;/foreign-keys&gt;&lt;ref-type name="Journal Article"&gt;17&lt;/ref-type&gt;&lt;contributors&gt;&lt;authors&gt;&lt;author&gt;Franzén, Oscar&lt;/author&gt;&lt;author&gt;Gan, Li-Ming&lt;/author&gt;&lt;author&gt;Björkegren, Johan L M&lt;/author&gt;&lt;/authors&gt;&lt;/contributors&gt;&lt;titles&gt;&lt;title&gt;PanglaoDB: a web server for exploration of mouse and human single-cell RNA sequencing data&lt;/title&gt;&lt;secondary-title&gt;Database&lt;/secondary-title&gt;&lt;/titles&gt;&lt;periodical&gt;&lt;full-title&gt;Database&lt;/full-title&gt;&lt;/periodical&gt;&lt;volume&gt;2019&lt;/volume&gt;&lt;dates&gt;&lt;year&gt;2019&lt;/year&gt;&lt;/dates&gt;&lt;isbn&gt;1758-0463&lt;/isbn&gt;&lt;urls&gt;&lt;related-urls&gt;&lt;url&gt;https://doi.org/10.1093/database/baz046&lt;/url&gt;&lt;/related-urls&gt;&lt;/urls&gt;&lt;custom1&gt;baz046&lt;/custom1&gt;&lt;electronic-resource-num&gt;10.1093/database/baz046&lt;/electronic-resource-num&gt;&lt;access-date&gt;6/29/2023&lt;/access-date&gt;&lt;/record&gt;&lt;/Cite&gt;&lt;/EndNote&gt;</w:instrText>
+            </w:r>
+            <w:r>
+              <w:rPr>
+                <w:rFonts w:ascii="Calibri" w:hAnsi="Calibri" w:cs="Calibri"/>
+                <w:color w:val="000000"/>
+              </w:rPr>
+              <w:fldChar w:fldCharType="separate"/>
+            </w:r>
+            <w:r>
+              <w:rPr>
+                <w:rFonts w:ascii="Calibri" w:hAnsi="Calibri" w:cs="Calibri"/>
+                <w:noProof/>
+                <w:color w:val="000000"/>
+              </w:rPr>
+              <w:t>(1)</w:t>
+            </w:r>
+            <w:r>
+              <w:rPr>
+                <w:rFonts w:ascii="Calibri" w:hAnsi="Calibri" w:cs="Calibri"/>
+                <w:color w:val="000000"/>
+              </w:rPr>
+              <w:fldChar w:fldCharType="end"/>
+            </w:r>
+          </w:p>
+        </w:tc>
+      </w:tr>
+      <w:tr>
+        <w:tc>
+          <w:tcPr>
+            <w:tcW w:w="3317" w:type="dxa"/>
+            <w:vAlign w:val="bottom"/>
+          </w:tcPr>
+          <w:p>
+            <w:r>
+              <w:rPr>
+                <w:rFonts w:ascii="Calibri" w:hAnsi="Calibri" w:cs="Calibri"/>
+                <w:color w:val="000000"/>
+              </w:rPr>
+              <w:t>Endothelial cells</w:t>
+            </w:r>
+          </w:p>
+        </w:tc>
+        <w:tc>
+          <w:tcPr>
+            <w:tcW w:w="3128" w:type="dxa"/>
+            <w:vAlign w:val="bottom"/>
+          </w:tcPr>
+          <w:p>
             <w:proofErr w:type="spellStart"/>
             <w:r>
               <w:rPr>
                 <w:rFonts w:ascii="Calibri" w:hAnsi="Calibri" w:cs="Calibri"/>
                 <w:color w:val="000000"/>
               </w:rPr>
-              <w:t>Rprm</w:t>
+              <w:t>Srgn</w:t>
             </w:r>
             <w:proofErr w:type="spellEnd"/>
           </w:p>
@@ -5917,7 +7709,7 @@
                 <w:rFonts w:ascii="Calibri" w:hAnsi="Calibri" w:cs="Calibri"/>
                 <w:color w:val="000000"/>
               </w:rPr>
-              <w:t>Exoc3l</w:t>
+              <w:t>S100a10</w:t>
             </w:r>
           </w:p>
         </w:tc>
@@ -5998,7 +7790,7 @@
                 <w:rFonts w:ascii="Calibri" w:hAnsi="Calibri" w:cs="Calibri"/>
                 <w:color w:val="000000"/>
               </w:rPr>
-              <w:t>Robo4</w:t>
+              <w:t>Ushbp1</w:t>
             </w:r>
           </w:p>
         </w:tc>
@@ -6079,7 +7871,7 @@
                 <w:rFonts w:ascii="Calibri" w:hAnsi="Calibri" w:cs="Calibri"/>
                 <w:color w:val="000000"/>
               </w:rPr>
-              <w:t>Scarf1</w:t>
+              <w:t>Oit3</w:t>
             </w:r>
           </w:p>
         </w:tc>
@@ -6160,7 +7952,7 @@
                 <w:rFonts w:ascii="Calibri" w:hAnsi="Calibri" w:cs="Calibri"/>
                 <w:color w:val="000000"/>
               </w:rPr>
-              <w:t>Sox18</w:t>
+              <w:t>Slc38a5</w:t>
             </w:r>
           </w:p>
         </w:tc>
@@ -6241,7 +8033,7 @@
                 <w:rFonts w:ascii="Calibri" w:hAnsi="Calibri" w:cs="Calibri"/>
                 <w:color w:val="000000"/>
               </w:rPr>
-              <w:t>Sox7</w:t>
+              <w:t>Xdh</w:t>
             </w:r>
           </w:p>
         </w:tc>
@@ -6322,7 +8114,7 @@
                 <w:rFonts w:ascii="Calibri" w:hAnsi="Calibri" w:cs="Calibri"/>
                 <w:color w:val="000000"/>
               </w:rPr>
-              <w:t>Spns2</w:t>
+              <w:t>Slc9a3r2</w:t>
             </w:r>
           </w:p>
         </w:tc>
@@ -6398,13 +8190,15 @@
             <w:vAlign w:val="bottom"/>
           </w:tcPr>
           <w:p>
-            <w:r>
-              <w:rPr>
-                <w:rFonts w:ascii="Calibri" w:hAnsi="Calibri" w:cs="Calibri"/>
-                <w:color w:val="000000"/>
-              </w:rPr>
-              <w:t>Thsd1</w:t>
-            </w:r>
+            <w:proofErr w:type="spellStart"/>
+            <w:r>
+              <w:rPr>
+                <w:rFonts w:ascii="Calibri" w:hAnsi="Calibri" w:cs="Calibri"/>
+                <w:color w:val="000000"/>
+              </w:rPr>
+              <w:t>Rgcc</w:t>
+            </w:r>
+            <w:proofErr w:type="spellEnd"/>
           </w:p>
         </w:tc>
         <w:tc>
@@ -6484,7 +8278,7 @@
                 <w:rFonts w:ascii="Calibri" w:hAnsi="Calibri" w:cs="Calibri"/>
                 <w:color w:val="000000"/>
               </w:rPr>
-              <w:t>Rnase1</w:t>
+              <w:t>Sparcl1</w:t>
             </w:r>
           </w:p>
         </w:tc>
@@ -6565,7 +8359,7 @@
                 <w:rFonts w:ascii="Calibri" w:hAnsi="Calibri" w:cs="Calibri"/>
                 <w:color w:val="000000"/>
               </w:rPr>
-              <w:t>Rbp7</w:t>
+              <w:t>Tm4sf1</w:t>
             </w:r>
           </w:p>
         </w:tc>
@@ -6641,13 +8435,15 @@
             <w:vAlign w:val="bottom"/>
           </w:tcPr>
           <w:p>
-            <w:r>
-              <w:rPr>
-                <w:rFonts w:ascii="Calibri" w:hAnsi="Calibri" w:cs="Calibri"/>
-                <w:color w:val="000000"/>
-              </w:rPr>
-              <w:t>Tcf15</w:t>
-            </w:r>
+            <w:proofErr w:type="spellStart"/>
+            <w:r>
+              <w:rPr>
+                <w:rFonts w:ascii="Calibri" w:hAnsi="Calibri" w:cs="Calibri"/>
+                <w:color w:val="000000"/>
+              </w:rPr>
+              <w:t>Srpx</w:t>
+            </w:r>
+            <w:proofErr w:type="spellEnd"/>
           </w:p>
         </w:tc>
         <w:tc>
@@ -6727,7 +8523,7 @@
                 <w:rFonts w:ascii="Calibri" w:hAnsi="Calibri" w:cs="Calibri"/>
                 <w:color w:val="000000"/>
               </w:rPr>
-              <w:t>Ramp3</w:t>
+              <w:t>S100a13</w:t>
             </w:r>
           </w:p>
         </w:tc>
@@ -6803,15 +8599,13 @@
             <w:vAlign w:val="bottom"/>
           </w:tcPr>
           <w:p>
-            <w:proofErr w:type="spellStart"/>
-            <w:r>
-              <w:rPr>
-                <w:rFonts w:ascii="Calibri" w:hAnsi="Calibri" w:cs="Calibri"/>
-                <w:color w:val="000000"/>
-              </w:rPr>
-              <w:t>Vegfc</w:t>
-            </w:r>
-            <w:proofErr w:type="spellEnd"/>
+            <w:r>
+              <w:rPr>
+                <w:rFonts w:ascii="Calibri" w:hAnsi="Calibri" w:cs="Calibri"/>
+                <w:color w:val="000000"/>
+              </w:rPr>
+              <w:t>Sgk1</w:t>
+            </w:r>
           </w:p>
         </w:tc>
         <w:tc>
@@ -6891,7 +8685,7 @@
                 <w:rFonts w:ascii="Calibri" w:hAnsi="Calibri" w:cs="Calibri"/>
                 <w:color w:val="000000"/>
               </w:rPr>
-              <w:t>Rnd1</w:t>
+              <w:t>Timp3</w:t>
             </w:r>
           </w:p>
         </w:tc>
@@ -6972,7 +8766,7 @@
                 <w:rFonts w:ascii="Calibri" w:hAnsi="Calibri" w:cs="Calibri"/>
                 <w:color w:val="000000"/>
               </w:rPr>
-              <w:t>Sema3d</w:t>
+              <w:t>Stab2</w:t>
             </w:r>
           </w:p>
         </w:tc>
@@ -7038,7 +8832,8 @@
                 <w:rFonts w:ascii="Calibri" w:hAnsi="Calibri" w:cs="Calibri"/>
                 <w:color w:val="000000"/>
               </w:rPr>
-              <w:t>Endothelial cells</w:t>
+              <w:lastRenderedPageBreak/>
+              <w:t>Enterochromaffin cells</w:t>
             </w:r>
           </w:p>
         </w:tc>
@@ -7053,7 +8848,7 @@
                 <w:rFonts w:ascii="Calibri" w:hAnsi="Calibri" w:cs="Calibri"/>
                 <w:color w:val="000000"/>
               </w:rPr>
-              <w:t>Wfdc1</w:t>
+              <w:t>Reg4</w:t>
             </w:r>
           </w:p>
         </w:tc>
@@ -7119,7 +8914,7 @@
                 <w:rFonts w:ascii="Calibri" w:hAnsi="Calibri" w:cs="Calibri"/>
                 <w:color w:val="000000"/>
               </w:rPr>
-              <w:t>Endothelial cells</w:t>
+              <w:t>Enterochromaffin cells</w:t>
             </w:r>
           </w:p>
         </w:tc>
@@ -7134,7 +8929,7 @@
                 <w:rFonts w:ascii="Calibri" w:hAnsi="Calibri" w:cs="Calibri"/>
                 <w:color w:val="000000"/>
               </w:rPr>
-              <w:t>Vwa1</w:t>
+              <w:t>Slc18a1</w:t>
             </w:r>
           </w:p>
         </w:tc>
@@ -7200,1795 +8995,6 @@
                 <w:rFonts w:ascii="Calibri" w:hAnsi="Calibri" w:cs="Calibri"/>
                 <w:color w:val="000000"/>
               </w:rPr>
-              <w:t>Endothelial cells</w:t>
-            </w:r>
-          </w:p>
-        </w:tc>
-        <w:tc>
-          <w:tcPr>
-            <w:tcW w:w="3128" w:type="dxa"/>
-            <w:vAlign w:val="bottom"/>
-          </w:tcPr>
-          <w:p>
-            <w:r>
-              <w:rPr>
-                <w:rFonts w:ascii="Calibri" w:hAnsi="Calibri" w:cs="Calibri"/>
-                <w:color w:val="000000"/>
-              </w:rPr>
-              <w:t>Tbx1</w:t>
-            </w:r>
-          </w:p>
-        </w:tc>
-        <w:tc>
-          <w:tcPr>
-            <w:tcW w:w="2617" w:type="dxa"/>
-          </w:tcPr>
-          <w:p>
-            <w:pPr>
-              <w:rPr>
-                <w:rFonts w:ascii="Calibri" w:hAnsi="Calibri" w:cs="Calibri"/>
-                <w:color w:val="000000"/>
-              </w:rPr>
-            </w:pPr>
-            <w:r>
-              <w:rPr>
-                <w:rFonts w:ascii="Calibri" w:hAnsi="Calibri" w:cs="Calibri"/>
-                <w:color w:val="000000"/>
-              </w:rPr>
-              <w:fldChar w:fldCharType="begin"/>
-            </w:r>
-            <w:r>
-              <w:rPr>
-                <w:rFonts w:ascii="Calibri" w:hAnsi="Calibri" w:cs="Calibri"/>
-                <w:color w:val="000000"/>
-              </w:rPr>
-              <w:instrText xml:space="preserve"> ADDIN EN.CITE &lt;EndNote&gt;&lt;Cite&gt;&lt;Author&gt;Franzén&lt;/Author&gt;&lt;Year&gt;2019&lt;/Year&gt;&lt;RecNum&gt;682&lt;/RecNum&gt;&lt;DisplayText&gt;(1)&lt;/DisplayText&gt;&lt;record&gt;&lt;rec-number&gt;682&lt;/rec-number&gt;&lt;foreign-keys&gt;&lt;key app="EN" db-id="xxwwe0rzmffw5tea00tvder2stww5tpt9xwa" timestamp="1691154024" guid="c39a3138-2a5b-4f33-b724-135fd1a0da54"&gt;682&lt;/key&gt;&lt;/foreign-keys&gt;&lt;ref-type name="Journal Article"&gt;17&lt;/ref-type&gt;&lt;contributors&gt;&lt;authors&gt;&lt;author&gt;Franzén, Oscar&lt;/author&gt;&lt;author&gt;Gan, Li-Ming&lt;/author&gt;&lt;author&gt;Björkegren, Johan L M&lt;/author&gt;&lt;/authors&gt;&lt;/contributors&gt;&lt;titles&gt;&lt;title&gt;PanglaoDB: a web server for exploration of mouse and human single-cell RNA sequencing data&lt;/title&gt;&lt;secondary-title&gt;Database&lt;/secondary-title&gt;&lt;/titles&gt;&lt;periodical&gt;&lt;full-title&gt;Database&lt;/full-title&gt;&lt;/periodical&gt;&lt;volume&gt;2019&lt;/volume&gt;&lt;dates&gt;&lt;year&gt;2019&lt;/year&gt;&lt;/dates&gt;&lt;isbn&gt;1758-0463&lt;/isbn&gt;&lt;urls&gt;&lt;related-urls&gt;&lt;url&gt;https://doi.org/10.1093/database/baz046&lt;/url&gt;&lt;/related-urls&gt;&lt;/urls&gt;&lt;custom1&gt;baz046&lt;/custom1&gt;&lt;electronic-resource-num&gt;10.1093/database/baz046&lt;/electronic-resource-num&gt;&lt;access-date&gt;6/29/2023&lt;/access-date&gt;&lt;/record&gt;&lt;/Cite&gt;&lt;/EndNote&gt;</w:instrText>
-            </w:r>
-            <w:r>
-              <w:rPr>
-                <w:rFonts w:ascii="Calibri" w:hAnsi="Calibri" w:cs="Calibri"/>
-                <w:color w:val="000000"/>
-              </w:rPr>
-              <w:fldChar w:fldCharType="separate"/>
-            </w:r>
-            <w:r>
-              <w:rPr>
-                <w:rFonts w:ascii="Calibri" w:hAnsi="Calibri" w:cs="Calibri"/>
-                <w:noProof/>
-                <w:color w:val="000000"/>
-              </w:rPr>
-              <w:t>(1)</w:t>
-            </w:r>
-            <w:r>
-              <w:rPr>
-                <w:rFonts w:ascii="Calibri" w:hAnsi="Calibri" w:cs="Calibri"/>
-                <w:color w:val="000000"/>
-              </w:rPr>
-              <w:fldChar w:fldCharType="end"/>
-            </w:r>
-          </w:p>
-        </w:tc>
-      </w:tr>
-      <w:tr>
-        <w:tc>
-          <w:tcPr>
-            <w:tcW w:w="3317" w:type="dxa"/>
-            <w:vAlign w:val="bottom"/>
-          </w:tcPr>
-          <w:p>
-            <w:r>
-              <w:rPr>
-                <w:rFonts w:ascii="Calibri" w:hAnsi="Calibri" w:cs="Calibri"/>
-                <w:color w:val="000000"/>
-              </w:rPr>
-              <w:t>Endothelial cells</w:t>
-            </w:r>
-          </w:p>
-        </w:tc>
-        <w:tc>
-          <w:tcPr>
-            <w:tcW w:w="3128" w:type="dxa"/>
-            <w:vAlign w:val="bottom"/>
-          </w:tcPr>
-          <w:p>
-            <w:r>
-              <w:rPr>
-                <w:rFonts w:ascii="Calibri" w:hAnsi="Calibri" w:cs="Calibri"/>
-                <w:color w:val="000000"/>
-              </w:rPr>
-              <w:t>Sema7a</w:t>
-            </w:r>
-          </w:p>
-        </w:tc>
-        <w:tc>
-          <w:tcPr>
-            <w:tcW w:w="2617" w:type="dxa"/>
-          </w:tcPr>
-          <w:p>
-            <w:pPr>
-              <w:rPr>
-                <w:rFonts w:ascii="Calibri" w:hAnsi="Calibri" w:cs="Calibri"/>
-                <w:color w:val="000000"/>
-              </w:rPr>
-            </w:pPr>
-            <w:r>
-              <w:rPr>
-                <w:rFonts w:ascii="Calibri" w:hAnsi="Calibri" w:cs="Calibri"/>
-                <w:color w:val="000000"/>
-              </w:rPr>
-              <w:fldChar w:fldCharType="begin"/>
-            </w:r>
-            <w:r>
-              <w:rPr>
-                <w:rFonts w:ascii="Calibri" w:hAnsi="Calibri" w:cs="Calibri"/>
-                <w:color w:val="000000"/>
-              </w:rPr>
-              <w:instrText xml:space="preserve"> ADDIN EN.CITE &lt;EndNote&gt;&lt;Cite&gt;&lt;Author&gt;Franzén&lt;/Author&gt;&lt;Year&gt;2019&lt;/Year&gt;&lt;RecNum&gt;682&lt;/RecNum&gt;&lt;DisplayText&gt;(1)&lt;/DisplayText&gt;&lt;record&gt;&lt;rec-number&gt;682&lt;/rec-number&gt;&lt;foreign-keys&gt;&lt;key app="EN" db-id="xxwwe0rzmffw5tea00tvder2stww5tpt9xwa" timestamp="1691154024" guid="c39a3138-2a5b-4f33-b724-135fd1a0da54"&gt;682&lt;/key&gt;&lt;/foreign-keys&gt;&lt;ref-type name="Journal Article"&gt;17&lt;/ref-type&gt;&lt;contributors&gt;&lt;authors&gt;&lt;author&gt;Franzén, Oscar&lt;/author&gt;&lt;author&gt;Gan, Li-Ming&lt;/author&gt;&lt;author&gt;Björkegren, Johan L M&lt;/author&gt;&lt;/authors&gt;&lt;/contributors&gt;&lt;titles&gt;&lt;title&gt;PanglaoDB: a web server for exploration of mouse and human single-cell RNA sequencing data&lt;/title&gt;&lt;secondary-title&gt;Database&lt;/secondary-title&gt;&lt;/titles&gt;&lt;periodical&gt;&lt;full-title&gt;Database&lt;/full-title&gt;&lt;/periodical&gt;&lt;volume&gt;2019&lt;/volume&gt;&lt;dates&gt;&lt;year&gt;2019&lt;/year&gt;&lt;/dates&gt;&lt;isbn&gt;1758-0463&lt;/isbn&gt;&lt;urls&gt;&lt;related-urls&gt;&lt;url&gt;https://doi.org/10.1093/database/baz046&lt;/url&gt;&lt;/related-urls&gt;&lt;/urls&gt;&lt;custom1&gt;baz046&lt;/custom1&gt;&lt;electronic-resource-num&gt;10.1093/database/baz046&lt;/electronic-resource-num&gt;&lt;access-date&gt;6/29/2023&lt;/access-date&gt;&lt;/record&gt;&lt;/Cite&gt;&lt;/EndNote&gt;</w:instrText>
-            </w:r>
-            <w:r>
-              <w:rPr>
-                <w:rFonts w:ascii="Calibri" w:hAnsi="Calibri" w:cs="Calibri"/>
-                <w:color w:val="000000"/>
-              </w:rPr>
-              <w:fldChar w:fldCharType="separate"/>
-            </w:r>
-            <w:r>
-              <w:rPr>
-                <w:rFonts w:ascii="Calibri" w:hAnsi="Calibri" w:cs="Calibri"/>
-                <w:noProof/>
-                <w:color w:val="000000"/>
-              </w:rPr>
-              <w:t>(1)</w:t>
-            </w:r>
-            <w:r>
-              <w:rPr>
-                <w:rFonts w:ascii="Calibri" w:hAnsi="Calibri" w:cs="Calibri"/>
-                <w:color w:val="000000"/>
-              </w:rPr>
-              <w:fldChar w:fldCharType="end"/>
-            </w:r>
-          </w:p>
-        </w:tc>
-      </w:tr>
-      <w:tr>
-        <w:tc>
-          <w:tcPr>
-            <w:tcW w:w="3317" w:type="dxa"/>
-            <w:vAlign w:val="bottom"/>
-          </w:tcPr>
-          <w:p>
-            <w:r>
-              <w:rPr>
-                <w:rFonts w:ascii="Calibri" w:hAnsi="Calibri" w:cs="Calibri"/>
-                <w:color w:val="000000"/>
-              </w:rPr>
-              <w:t>Endothelial cells</w:t>
-            </w:r>
-          </w:p>
-        </w:tc>
-        <w:tc>
-          <w:tcPr>
-            <w:tcW w:w="3128" w:type="dxa"/>
-            <w:vAlign w:val="bottom"/>
-          </w:tcPr>
-          <w:p>
-            <w:r>
-              <w:rPr>
-                <w:rFonts w:ascii="Calibri" w:hAnsi="Calibri" w:cs="Calibri"/>
-                <w:color w:val="000000"/>
-              </w:rPr>
-              <w:t>Tgfbr2</w:t>
-            </w:r>
-          </w:p>
-        </w:tc>
-        <w:tc>
-          <w:tcPr>
-            <w:tcW w:w="2617" w:type="dxa"/>
-          </w:tcPr>
-          <w:p>
-            <w:pPr>
-              <w:rPr>
-                <w:rFonts w:ascii="Calibri" w:hAnsi="Calibri" w:cs="Calibri"/>
-                <w:color w:val="000000"/>
-              </w:rPr>
-            </w:pPr>
-            <w:r>
-              <w:rPr>
-                <w:rFonts w:ascii="Calibri" w:hAnsi="Calibri" w:cs="Calibri"/>
-                <w:color w:val="000000"/>
-              </w:rPr>
-              <w:fldChar w:fldCharType="begin"/>
-            </w:r>
-            <w:r>
-              <w:rPr>
-                <w:rFonts w:ascii="Calibri" w:hAnsi="Calibri" w:cs="Calibri"/>
-                <w:color w:val="000000"/>
-              </w:rPr>
-              <w:instrText xml:space="preserve"> ADDIN EN.CITE &lt;EndNote&gt;&lt;Cite&gt;&lt;Author&gt;Franzén&lt;/Author&gt;&lt;Year&gt;2019&lt;/Year&gt;&lt;RecNum&gt;682&lt;/RecNum&gt;&lt;DisplayText&gt;(1)&lt;/DisplayText&gt;&lt;record&gt;&lt;rec-number&gt;682&lt;/rec-number&gt;&lt;foreign-keys&gt;&lt;key app="EN" db-id="xxwwe0rzmffw5tea00tvder2stww5tpt9xwa" timestamp="1691154024" guid="c39a3138-2a5b-4f33-b724-135fd1a0da54"&gt;682&lt;/key&gt;&lt;/foreign-keys&gt;&lt;ref-type name="Journal Article"&gt;17&lt;/ref-type&gt;&lt;contributors&gt;&lt;authors&gt;&lt;author&gt;Franzén, Oscar&lt;/author&gt;&lt;author&gt;Gan, Li-Ming&lt;/author&gt;&lt;author&gt;Björkegren, Johan L M&lt;/author&gt;&lt;/authors&gt;&lt;/contributors&gt;&lt;titles&gt;&lt;title&gt;PanglaoDB: a web server for exploration of mouse and human single-cell RNA sequencing data&lt;/title&gt;&lt;secondary-title&gt;Database&lt;/secondary-title&gt;&lt;/titles&gt;&lt;periodical&gt;&lt;full-title&gt;Database&lt;/full-title&gt;&lt;/periodical&gt;&lt;volume&gt;2019&lt;/volume&gt;&lt;dates&gt;&lt;year&gt;2019&lt;/year&gt;&lt;/dates&gt;&lt;isbn&gt;1758-0463&lt;/isbn&gt;&lt;urls&gt;&lt;related-urls&gt;&lt;url&gt;https://doi.org/10.1093/database/baz046&lt;/url&gt;&lt;/related-urls&gt;&lt;/urls&gt;&lt;custom1&gt;baz046&lt;/custom1&gt;&lt;electronic-resource-num&gt;10.1093/database/baz046&lt;/electronic-resource-num&gt;&lt;access-date&gt;6/29/2023&lt;/access-date&gt;&lt;/record&gt;&lt;/Cite&gt;&lt;/EndNote&gt;</w:instrText>
-            </w:r>
-            <w:r>
-              <w:rPr>
-                <w:rFonts w:ascii="Calibri" w:hAnsi="Calibri" w:cs="Calibri"/>
-                <w:color w:val="000000"/>
-              </w:rPr>
-              <w:fldChar w:fldCharType="separate"/>
-            </w:r>
-            <w:r>
-              <w:rPr>
-                <w:rFonts w:ascii="Calibri" w:hAnsi="Calibri" w:cs="Calibri"/>
-                <w:noProof/>
-                <w:color w:val="000000"/>
-              </w:rPr>
-              <w:t>(1)</w:t>
-            </w:r>
-            <w:r>
-              <w:rPr>
-                <w:rFonts w:ascii="Calibri" w:hAnsi="Calibri" w:cs="Calibri"/>
-                <w:color w:val="000000"/>
-              </w:rPr>
-              <w:fldChar w:fldCharType="end"/>
-            </w:r>
-          </w:p>
-        </w:tc>
-      </w:tr>
-      <w:tr>
-        <w:tc>
-          <w:tcPr>
-            <w:tcW w:w="3317" w:type="dxa"/>
-            <w:vAlign w:val="bottom"/>
-          </w:tcPr>
-          <w:p>
-            <w:r>
-              <w:rPr>
-                <w:rFonts w:ascii="Calibri" w:hAnsi="Calibri" w:cs="Calibri"/>
-                <w:color w:val="000000"/>
-              </w:rPr>
-              <w:t>Endothelial cells</w:t>
-            </w:r>
-          </w:p>
-        </w:tc>
-        <w:tc>
-          <w:tcPr>
-            <w:tcW w:w="3128" w:type="dxa"/>
-            <w:vAlign w:val="bottom"/>
-          </w:tcPr>
-          <w:p>
-            <w:r>
-              <w:rPr>
-                <w:rFonts w:ascii="Calibri" w:hAnsi="Calibri" w:cs="Calibri"/>
-                <w:color w:val="000000"/>
-              </w:rPr>
-              <w:t>Slc2a1</w:t>
-            </w:r>
-          </w:p>
-        </w:tc>
-        <w:tc>
-          <w:tcPr>
-            <w:tcW w:w="2617" w:type="dxa"/>
-          </w:tcPr>
-          <w:p>
-            <w:pPr>
-              <w:rPr>
-                <w:rFonts w:ascii="Calibri" w:hAnsi="Calibri" w:cs="Calibri"/>
-                <w:color w:val="000000"/>
-              </w:rPr>
-            </w:pPr>
-            <w:r>
-              <w:rPr>
-                <w:rFonts w:ascii="Calibri" w:hAnsi="Calibri" w:cs="Calibri"/>
-                <w:color w:val="000000"/>
-              </w:rPr>
-              <w:fldChar w:fldCharType="begin"/>
-            </w:r>
-            <w:r>
-              <w:rPr>
-                <w:rFonts w:ascii="Calibri" w:hAnsi="Calibri" w:cs="Calibri"/>
-                <w:color w:val="000000"/>
-              </w:rPr>
-              <w:instrText xml:space="preserve"> ADDIN EN.CITE &lt;EndNote&gt;&lt;Cite&gt;&lt;Author&gt;Franzén&lt;/Author&gt;&lt;Year&gt;2019&lt;/Year&gt;&lt;RecNum&gt;682&lt;/RecNum&gt;&lt;DisplayText&gt;(1)&lt;/DisplayText&gt;&lt;record&gt;&lt;rec-number&gt;682&lt;/rec-number&gt;&lt;foreign-keys&gt;&lt;key app="EN" db-id="xxwwe0rzmffw5tea00tvder2stww5tpt9xwa" timestamp="1691154024" guid="c39a3138-2a5b-4f33-b724-135fd1a0da54"&gt;682&lt;/key&gt;&lt;/foreign-keys&gt;&lt;ref-type name="Journal Article"&gt;17&lt;/ref-type&gt;&lt;contributors&gt;&lt;authors&gt;&lt;author&gt;Franzén, Oscar&lt;/author&gt;&lt;author&gt;Gan, Li-Ming&lt;/author&gt;&lt;author&gt;Björkegren, Johan L M&lt;/author&gt;&lt;/authors&gt;&lt;/contributors&gt;&lt;titles&gt;&lt;title&gt;PanglaoDB: a web server for exploration of mouse and human single-cell RNA sequencing data&lt;/title&gt;&lt;secondary-title&gt;Database&lt;/secondary-title&gt;&lt;/titles&gt;&lt;periodical&gt;&lt;full-title&gt;Database&lt;/full-title&gt;&lt;/periodical&gt;&lt;volume&gt;2019&lt;/volume&gt;&lt;dates&gt;&lt;year&gt;2019&lt;/year&gt;&lt;/dates&gt;&lt;isbn&gt;1758-0463&lt;/isbn&gt;&lt;urls&gt;&lt;related-urls&gt;&lt;url&gt;https://doi.org/10.1093/database/baz046&lt;/url&gt;&lt;/related-urls&gt;&lt;/urls&gt;&lt;custom1&gt;baz046&lt;/custom1&gt;&lt;electronic-resource-num&gt;10.1093/database/baz046&lt;/electronic-resource-num&gt;&lt;access-date&gt;6/29/2023&lt;/access-date&gt;&lt;/record&gt;&lt;/Cite&gt;&lt;/EndNote&gt;</w:instrText>
-            </w:r>
-            <w:r>
-              <w:rPr>
-                <w:rFonts w:ascii="Calibri" w:hAnsi="Calibri" w:cs="Calibri"/>
-                <w:color w:val="000000"/>
-              </w:rPr>
-              <w:fldChar w:fldCharType="separate"/>
-            </w:r>
-            <w:r>
-              <w:rPr>
-                <w:rFonts w:ascii="Calibri" w:hAnsi="Calibri" w:cs="Calibri"/>
-                <w:noProof/>
-                <w:color w:val="000000"/>
-              </w:rPr>
-              <w:t>(1)</w:t>
-            </w:r>
-            <w:r>
-              <w:rPr>
-                <w:rFonts w:ascii="Calibri" w:hAnsi="Calibri" w:cs="Calibri"/>
-                <w:color w:val="000000"/>
-              </w:rPr>
-              <w:fldChar w:fldCharType="end"/>
-            </w:r>
-          </w:p>
-        </w:tc>
-      </w:tr>
-      <w:tr>
-        <w:tc>
-          <w:tcPr>
-            <w:tcW w:w="3317" w:type="dxa"/>
-            <w:vAlign w:val="bottom"/>
-          </w:tcPr>
-          <w:p>
-            <w:r>
-              <w:rPr>
-                <w:rFonts w:ascii="Calibri" w:hAnsi="Calibri" w:cs="Calibri"/>
-                <w:color w:val="000000"/>
-              </w:rPr>
-              <w:t>Endothelial cells</w:t>
-            </w:r>
-          </w:p>
-        </w:tc>
-        <w:tc>
-          <w:tcPr>
-            <w:tcW w:w="3128" w:type="dxa"/>
-            <w:vAlign w:val="bottom"/>
-          </w:tcPr>
-          <w:p>
-            <w:r>
-              <w:rPr>
-                <w:rFonts w:ascii="Calibri" w:hAnsi="Calibri" w:cs="Calibri"/>
-                <w:color w:val="000000"/>
-              </w:rPr>
-              <w:t>Tspan8</w:t>
-            </w:r>
-          </w:p>
-        </w:tc>
-        <w:tc>
-          <w:tcPr>
-            <w:tcW w:w="2617" w:type="dxa"/>
-          </w:tcPr>
-          <w:p>
-            <w:pPr>
-              <w:rPr>
-                <w:rFonts w:ascii="Calibri" w:hAnsi="Calibri" w:cs="Calibri"/>
-                <w:color w:val="000000"/>
-              </w:rPr>
-            </w:pPr>
-            <w:r>
-              <w:rPr>
-                <w:rFonts w:ascii="Calibri" w:hAnsi="Calibri" w:cs="Calibri"/>
-                <w:color w:val="000000"/>
-              </w:rPr>
-              <w:fldChar w:fldCharType="begin"/>
-            </w:r>
-            <w:r>
-              <w:rPr>
-                <w:rFonts w:ascii="Calibri" w:hAnsi="Calibri" w:cs="Calibri"/>
-                <w:color w:val="000000"/>
-              </w:rPr>
-              <w:instrText xml:space="preserve"> ADDIN EN.CITE &lt;EndNote&gt;&lt;Cite&gt;&lt;Author&gt;Franzén&lt;/Author&gt;&lt;Year&gt;2019&lt;/Year&gt;&lt;RecNum&gt;682&lt;/RecNum&gt;&lt;DisplayText&gt;(1)&lt;/DisplayText&gt;&lt;record&gt;&lt;rec-number&gt;682&lt;/rec-number&gt;&lt;foreign-keys&gt;&lt;key app="EN" db-id="xxwwe0rzmffw5tea00tvder2stww5tpt9xwa" timestamp="1691154024" guid="c39a3138-2a5b-4f33-b724-135fd1a0da54"&gt;682&lt;/key&gt;&lt;/foreign-keys&gt;&lt;ref-type name="Journal Article"&gt;17&lt;/ref-type&gt;&lt;contributors&gt;&lt;authors&gt;&lt;author&gt;Franzén, Oscar&lt;/author&gt;&lt;author&gt;Gan, Li-Ming&lt;/author&gt;&lt;author&gt;Björkegren, Johan L M&lt;/author&gt;&lt;/authors&gt;&lt;/contributors&gt;&lt;titles&gt;&lt;title&gt;PanglaoDB: a web server for exploration of mouse and human single-cell RNA sequencing data&lt;/title&gt;&lt;secondary-title&gt;Database&lt;/secondary-title&gt;&lt;/titles&gt;&lt;periodical&gt;&lt;full-title&gt;Database&lt;/full-title&gt;&lt;/periodical&gt;&lt;volume&gt;2019&lt;/volume&gt;&lt;dates&gt;&lt;year&gt;2019&lt;/year&gt;&lt;/dates&gt;&lt;isbn&gt;1758-0463&lt;/isbn&gt;&lt;urls&gt;&lt;related-urls&gt;&lt;url&gt;https://doi.org/10.1093/database/baz046&lt;/url&gt;&lt;/related-urls&gt;&lt;/urls&gt;&lt;custom1&gt;baz046&lt;/custom1&gt;&lt;electronic-resource-num&gt;10.1093/database/baz046&lt;/electronic-resource-num&gt;&lt;access-date&gt;6/29/2023&lt;/access-date&gt;&lt;/record&gt;&lt;/Cite&gt;&lt;/EndNote&gt;</w:instrText>
-            </w:r>
-            <w:r>
-              <w:rPr>
-                <w:rFonts w:ascii="Calibri" w:hAnsi="Calibri" w:cs="Calibri"/>
-                <w:color w:val="000000"/>
-              </w:rPr>
-              <w:fldChar w:fldCharType="separate"/>
-            </w:r>
-            <w:r>
-              <w:rPr>
-                <w:rFonts w:ascii="Calibri" w:hAnsi="Calibri" w:cs="Calibri"/>
-                <w:noProof/>
-                <w:color w:val="000000"/>
-              </w:rPr>
-              <w:t>(1)</w:t>
-            </w:r>
-            <w:r>
-              <w:rPr>
-                <w:rFonts w:ascii="Calibri" w:hAnsi="Calibri" w:cs="Calibri"/>
-                <w:color w:val="000000"/>
-              </w:rPr>
-              <w:fldChar w:fldCharType="end"/>
-            </w:r>
-          </w:p>
-        </w:tc>
-      </w:tr>
-      <w:tr>
-        <w:tc>
-          <w:tcPr>
-            <w:tcW w:w="3317" w:type="dxa"/>
-            <w:vAlign w:val="bottom"/>
-          </w:tcPr>
-          <w:p>
-            <w:r>
-              <w:rPr>
-                <w:rFonts w:ascii="Calibri" w:hAnsi="Calibri" w:cs="Calibri"/>
-                <w:color w:val="000000"/>
-              </w:rPr>
-              <w:t>Endothelial cells</w:t>
-            </w:r>
-          </w:p>
-        </w:tc>
-        <w:tc>
-          <w:tcPr>
-            <w:tcW w:w="3128" w:type="dxa"/>
-            <w:vAlign w:val="bottom"/>
-          </w:tcPr>
-          <w:p>
-            <w:proofErr w:type="spellStart"/>
-            <w:r>
-              <w:rPr>
-                <w:rFonts w:ascii="Calibri" w:hAnsi="Calibri" w:cs="Calibri"/>
-                <w:color w:val="000000"/>
-              </w:rPr>
-              <w:t>Srgn</w:t>
-            </w:r>
-            <w:proofErr w:type="spellEnd"/>
-          </w:p>
-        </w:tc>
-        <w:tc>
-          <w:tcPr>
-            <w:tcW w:w="2617" w:type="dxa"/>
-          </w:tcPr>
-          <w:p>
-            <w:pPr>
-              <w:rPr>
-                <w:rFonts w:ascii="Calibri" w:hAnsi="Calibri" w:cs="Calibri"/>
-                <w:color w:val="000000"/>
-              </w:rPr>
-            </w:pPr>
-            <w:r>
-              <w:rPr>
-                <w:rFonts w:ascii="Calibri" w:hAnsi="Calibri" w:cs="Calibri"/>
-                <w:color w:val="000000"/>
-              </w:rPr>
-              <w:fldChar w:fldCharType="begin"/>
-            </w:r>
-            <w:r>
-              <w:rPr>
-                <w:rFonts w:ascii="Calibri" w:hAnsi="Calibri" w:cs="Calibri"/>
-                <w:color w:val="000000"/>
-              </w:rPr>
-              <w:instrText xml:space="preserve"> ADDIN EN.CITE &lt;EndNote&gt;&lt;Cite&gt;&lt;Author&gt;Franzén&lt;/Author&gt;&lt;Year&gt;2019&lt;/Year&gt;&lt;RecNum&gt;682&lt;/RecNum&gt;&lt;DisplayText&gt;(1)&lt;/DisplayText&gt;&lt;record&gt;&lt;rec-number&gt;682&lt;/rec-number&gt;&lt;foreign-keys&gt;&lt;key app="EN" db-id="xxwwe0rzmffw5tea00tvder2stww5tpt9xwa" timestamp="1691154024" guid="c39a3138-2a5b-4f33-b724-135fd1a0da54"&gt;682&lt;/key&gt;&lt;/foreign-keys&gt;&lt;ref-type name="Journal Article"&gt;17&lt;/ref-type&gt;&lt;contributors&gt;&lt;authors&gt;&lt;author&gt;Franzén, Oscar&lt;/author&gt;&lt;author&gt;Gan, Li-Ming&lt;/author&gt;&lt;author&gt;Björkegren, Johan L M&lt;/author&gt;&lt;/authors&gt;&lt;/contributors&gt;&lt;titles&gt;&lt;title&gt;PanglaoDB: a web server for exploration of mouse and human single-cell RNA sequencing data&lt;/title&gt;&lt;secondary-title&gt;Database&lt;/secondary-title&gt;&lt;/titles&gt;&lt;periodical&gt;&lt;full-title&gt;Database&lt;/full-title&gt;&lt;/periodical&gt;&lt;volume&gt;2019&lt;/volume&gt;&lt;dates&gt;&lt;year&gt;2019&lt;/year&gt;&lt;/dates&gt;&lt;isbn&gt;1758-0463&lt;/isbn&gt;&lt;urls&gt;&lt;related-urls&gt;&lt;url&gt;https://doi.org/10.1093/database/baz046&lt;/url&gt;&lt;/related-urls&gt;&lt;/urls&gt;&lt;custom1&gt;baz046&lt;/custom1&gt;&lt;electronic-resource-num&gt;10.1093/database/baz046&lt;/electronic-resource-num&gt;&lt;access-date&gt;6/29/2023&lt;/access-date&gt;&lt;/record&gt;&lt;/Cite&gt;&lt;/EndNote&gt;</w:instrText>
-            </w:r>
-            <w:r>
-              <w:rPr>
-                <w:rFonts w:ascii="Calibri" w:hAnsi="Calibri" w:cs="Calibri"/>
-                <w:color w:val="000000"/>
-              </w:rPr>
-              <w:fldChar w:fldCharType="separate"/>
-            </w:r>
-            <w:r>
-              <w:rPr>
-                <w:rFonts w:ascii="Calibri" w:hAnsi="Calibri" w:cs="Calibri"/>
-                <w:noProof/>
-                <w:color w:val="000000"/>
-              </w:rPr>
-              <w:t>(1)</w:t>
-            </w:r>
-            <w:r>
-              <w:rPr>
-                <w:rFonts w:ascii="Calibri" w:hAnsi="Calibri" w:cs="Calibri"/>
-                <w:color w:val="000000"/>
-              </w:rPr>
-              <w:fldChar w:fldCharType="end"/>
-            </w:r>
-          </w:p>
-        </w:tc>
-      </w:tr>
-      <w:tr>
-        <w:tc>
-          <w:tcPr>
-            <w:tcW w:w="3317" w:type="dxa"/>
-            <w:vAlign w:val="bottom"/>
-          </w:tcPr>
-          <w:p>
-            <w:r>
-              <w:rPr>
-                <w:rFonts w:ascii="Calibri" w:hAnsi="Calibri" w:cs="Calibri"/>
-                <w:color w:val="000000"/>
-              </w:rPr>
-              <w:t>Endothelial cells</w:t>
-            </w:r>
-          </w:p>
-        </w:tc>
-        <w:tc>
-          <w:tcPr>
-            <w:tcW w:w="3128" w:type="dxa"/>
-            <w:vAlign w:val="bottom"/>
-          </w:tcPr>
-          <w:p>
-            <w:r>
-              <w:rPr>
-                <w:rFonts w:ascii="Calibri" w:hAnsi="Calibri" w:cs="Calibri"/>
-                <w:color w:val="000000"/>
-              </w:rPr>
-              <w:t>S100a10</w:t>
-            </w:r>
-          </w:p>
-        </w:tc>
-        <w:tc>
-          <w:tcPr>
-            <w:tcW w:w="2617" w:type="dxa"/>
-          </w:tcPr>
-          <w:p>
-            <w:pPr>
-              <w:rPr>
-                <w:rFonts w:ascii="Calibri" w:hAnsi="Calibri" w:cs="Calibri"/>
-                <w:color w:val="000000"/>
-              </w:rPr>
-            </w:pPr>
-            <w:r>
-              <w:rPr>
-                <w:rFonts w:ascii="Calibri" w:hAnsi="Calibri" w:cs="Calibri"/>
-                <w:color w:val="000000"/>
-              </w:rPr>
-              <w:fldChar w:fldCharType="begin"/>
-            </w:r>
-            <w:r>
-              <w:rPr>
-                <w:rFonts w:ascii="Calibri" w:hAnsi="Calibri" w:cs="Calibri"/>
-                <w:color w:val="000000"/>
-              </w:rPr>
-              <w:instrText xml:space="preserve"> ADDIN EN.CITE &lt;EndNote&gt;&lt;Cite&gt;&lt;Author&gt;Franzén&lt;/Author&gt;&lt;Year&gt;2019&lt;/Year&gt;&lt;RecNum&gt;682&lt;/RecNum&gt;&lt;DisplayText&gt;(1)&lt;/DisplayText&gt;&lt;record&gt;&lt;rec-number&gt;682&lt;/rec-number&gt;&lt;foreign-keys&gt;&lt;key app="EN" db-id="xxwwe0rzmffw5tea00tvder2stww5tpt9xwa" timestamp="1691154024" guid="c39a3138-2a5b-4f33-b724-135fd1a0da54"&gt;682&lt;/key&gt;&lt;/foreign-keys&gt;&lt;ref-type name="Journal Article"&gt;17&lt;/ref-type&gt;&lt;contributors&gt;&lt;authors&gt;&lt;author&gt;Franzén, Oscar&lt;/author&gt;&lt;author&gt;Gan, Li-Ming&lt;/author&gt;&lt;author&gt;Björkegren, Johan L M&lt;/author&gt;&lt;/authors&gt;&lt;/contributors&gt;&lt;titles&gt;&lt;title&gt;PanglaoDB: a web server for exploration of mouse and human single-cell RNA sequencing data&lt;/title&gt;&lt;secondary-title&gt;Database&lt;/secondary-title&gt;&lt;/titles&gt;&lt;periodical&gt;&lt;full-title&gt;Database&lt;/full-title&gt;&lt;/periodical&gt;&lt;volume&gt;2019&lt;/volume&gt;&lt;dates&gt;&lt;year&gt;2019&lt;/year&gt;&lt;/dates&gt;&lt;isbn&gt;1758-0463&lt;/isbn&gt;&lt;urls&gt;&lt;related-urls&gt;&lt;url&gt;https://doi.org/10.1093/database/baz046&lt;/url&gt;&lt;/related-urls&gt;&lt;/urls&gt;&lt;custom1&gt;baz046&lt;/custom1&gt;&lt;electronic-resource-num&gt;10.1093/database/baz046&lt;/electronic-resource-num&gt;&lt;access-date&gt;6/29/2023&lt;/access-date&gt;&lt;/record&gt;&lt;/Cite&gt;&lt;/EndNote&gt;</w:instrText>
-            </w:r>
-            <w:r>
-              <w:rPr>
-                <w:rFonts w:ascii="Calibri" w:hAnsi="Calibri" w:cs="Calibri"/>
-                <w:color w:val="000000"/>
-              </w:rPr>
-              <w:fldChar w:fldCharType="separate"/>
-            </w:r>
-            <w:r>
-              <w:rPr>
-                <w:rFonts w:ascii="Calibri" w:hAnsi="Calibri" w:cs="Calibri"/>
-                <w:noProof/>
-                <w:color w:val="000000"/>
-              </w:rPr>
-              <w:t>(1)</w:t>
-            </w:r>
-            <w:r>
-              <w:rPr>
-                <w:rFonts w:ascii="Calibri" w:hAnsi="Calibri" w:cs="Calibri"/>
-                <w:color w:val="000000"/>
-              </w:rPr>
-              <w:fldChar w:fldCharType="end"/>
-            </w:r>
-          </w:p>
-        </w:tc>
-      </w:tr>
-      <w:tr>
-        <w:tc>
-          <w:tcPr>
-            <w:tcW w:w="3317" w:type="dxa"/>
-            <w:vAlign w:val="bottom"/>
-          </w:tcPr>
-          <w:p>
-            <w:r>
-              <w:rPr>
-                <w:rFonts w:ascii="Calibri" w:hAnsi="Calibri" w:cs="Calibri"/>
-                <w:color w:val="000000"/>
-              </w:rPr>
-              <w:t>Endothelial cells</w:t>
-            </w:r>
-          </w:p>
-        </w:tc>
-        <w:tc>
-          <w:tcPr>
-            <w:tcW w:w="3128" w:type="dxa"/>
-            <w:vAlign w:val="bottom"/>
-          </w:tcPr>
-          <w:p>
-            <w:r>
-              <w:rPr>
-                <w:rFonts w:ascii="Calibri" w:hAnsi="Calibri" w:cs="Calibri"/>
-                <w:color w:val="000000"/>
-              </w:rPr>
-              <w:t>Ushbp1</w:t>
-            </w:r>
-          </w:p>
-        </w:tc>
-        <w:tc>
-          <w:tcPr>
-            <w:tcW w:w="2617" w:type="dxa"/>
-          </w:tcPr>
-          <w:p>
-            <w:pPr>
-              <w:rPr>
-                <w:rFonts w:ascii="Calibri" w:hAnsi="Calibri" w:cs="Calibri"/>
-                <w:color w:val="000000"/>
-              </w:rPr>
-            </w:pPr>
-            <w:r>
-              <w:rPr>
-                <w:rFonts w:ascii="Calibri" w:hAnsi="Calibri" w:cs="Calibri"/>
-                <w:color w:val="000000"/>
-              </w:rPr>
-              <w:fldChar w:fldCharType="begin"/>
-            </w:r>
-            <w:r>
-              <w:rPr>
-                <w:rFonts w:ascii="Calibri" w:hAnsi="Calibri" w:cs="Calibri"/>
-                <w:color w:val="000000"/>
-              </w:rPr>
-              <w:instrText xml:space="preserve"> ADDIN EN.CITE &lt;EndNote&gt;&lt;Cite&gt;&lt;Author&gt;Franzén&lt;/Author&gt;&lt;Year&gt;2019&lt;/Year&gt;&lt;RecNum&gt;682&lt;/RecNum&gt;&lt;DisplayText&gt;(1)&lt;/DisplayText&gt;&lt;record&gt;&lt;rec-number&gt;682&lt;/rec-number&gt;&lt;foreign-keys&gt;&lt;key app="EN" db-id="xxwwe0rzmffw5tea00tvder2stww5tpt9xwa" timestamp="1691154024" guid="c39a3138-2a5b-4f33-b724-135fd1a0da54"&gt;682&lt;/key&gt;&lt;/foreign-keys&gt;&lt;ref-type name="Journal Article"&gt;17&lt;/ref-type&gt;&lt;contributors&gt;&lt;authors&gt;&lt;author&gt;Franzén, Oscar&lt;/author&gt;&lt;author&gt;Gan, Li-Ming&lt;/author&gt;&lt;author&gt;Björkegren, Johan L M&lt;/author&gt;&lt;/authors&gt;&lt;/contributors&gt;&lt;titles&gt;&lt;title&gt;PanglaoDB: a web server for exploration of mouse and human single-cell RNA sequencing data&lt;/title&gt;&lt;secondary-title&gt;Database&lt;/secondary-title&gt;&lt;/titles&gt;&lt;periodical&gt;&lt;full-title&gt;Database&lt;/full-title&gt;&lt;/periodical&gt;&lt;volume&gt;2019&lt;/volume&gt;&lt;dates&gt;&lt;year&gt;2019&lt;/year&gt;&lt;/dates&gt;&lt;isbn&gt;1758-0463&lt;/isbn&gt;&lt;urls&gt;&lt;related-urls&gt;&lt;url&gt;https://doi.org/10.1093/database/baz046&lt;/url&gt;&lt;/related-urls&gt;&lt;/urls&gt;&lt;custom1&gt;baz046&lt;/custom1&gt;&lt;electronic-resource-num&gt;10.1093/database/baz046&lt;/electronic-resource-num&gt;&lt;access-date&gt;6/29/2023&lt;/access-date&gt;&lt;/record&gt;&lt;/Cite&gt;&lt;/EndNote&gt;</w:instrText>
-            </w:r>
-            <w:r>
-              <w:rPr>
-                <w:rFonts w:ascii="Calibri" w:hAnsi="Calibri" w:cs="Calibri"/>
-                <w:color w:val="000000"/>
-              </w:rPr>
-              <w:fldChar w:fldCharType="separate"/>
-            </w:r>
-            <w:r>
-              <w:rPr>
-                <w:rFonts w:ascii="Calibri" w:hAnsi="Calibri" w:cs="Calibri"/>
-                <w:noProof/>
-                <w:color w:val="000000"/>
-              </w:rPr>
-              <w:t>(1)</w:t>
-            </w:r>
-            <w:r>
-              <w:rPr>
-                <w:rFonts w:ascii="Calibri" w:hAnsi="Calibri" w:cs="Calibri"/>
-                <w:color w:val="000000"/>
-              </w:rPr>
-              <w:fldChar w:fldCharType="end"/>
-            </w:r>
-          </w:p>
-        </w:tc>
-      </w:tr>
-      <w:tr>
-        <w:tc>
-          <w:tcPr>
-            <w:tcW w:w="3317" w:type="dxa"/>
-            <w:vAlign w:val="bottom"/>
-          </w:tcPr>
-          <w:p>
-            <w:r>
-              <w:rPr>
-                <w:rFonts w:ascii="Calibri" w:hAnsi="Calibri" w:cs="Calibri"/>
-                <w:color w:val="000000"/>
-              </w:rPr>
-              <w:t>Endothelial cells</w:t>
-            </w:r>
-          </w:p>
-        </w:tc>
-        <w:tc>
-          <w:tcPr>
-            <w:tcW w:w="3128" w:type="dxa"/>
-            <w:vAlign w:val="bottom"/>
-          </w:tcPr>
-          <w:p>
-            <w:r>
-              <w:rPr>
-                <w:rFonts w:ascii="Calibri" w:hAnsi="Calibri" w:cs="Calibri"/>
-                <w:color w:val="000000"/>
-              </w:rPr>
-              <w:t>Oit3</w:t>
-            </w:r>
-          </w:p>
-        </w:tc>
-        <w:tc>
-          <w:tcPr>
-            <w:tcW w:w="2617" w:type="dxa"/>
-          </w:tcPr>
-          <w:p>
-            <w:pPr>
-              <w:rPr>
-                <w:rFonts w:ascii="Calibri" w:hAnsi="Calibri" w:cs="Calibri"/>
-                <w:color w:val="000000"/>
-              </w:rPr>
-            </w:pPr>
-            <w:r>
-              <w:rPr>
-                <w:rFonts w:ascii="Calibri" w:hAnsi="Calibri" w:cs="Calibri"/>
-                <w:color w:val="000000"/>
-              </w:rPr>
-              <w:fldChar w:fldCharType="begin"/>
-            </w:r>
-            <w:r>
-              <w:rPr>
-                <w:rFonts w:ascii="Calibri" w:hAnsi="Calibri" w:cs="Calibri"/>
-                <w:color w:val="000000"/>
-              </w:rPr>
-              <w:instrText xml:space="preserve"> ADDIN EN.CITE &lt;EndNote&gt;&lt;Cite&gt;&lt;Author&gt;Franzén&lt;/Author&gt;&lt;Year&gt;2019&lt;/Year&gt;&lt;RecNum&gt;682&lt;/RecNum&gt;&lt;DisplayText&gt;(1)&lt;/DisplayText&gt;&lt;record&gt;&lt;rec-number&gt;682&lt;/rec-number&gt;&lt;foreign-keys&gt;&lt;key app="EN" db-id="xxwwe0rzmffw5tea00tvder2stww5tpt9xwa" timestamp="1691154024" guid="c39a3138-2a5b-4f33-b724-135fd1a0da54"&gt;682&lt;/key&gt;&lt;/foreign-keys&gt;&lt;ref-type name="Journal Article"&gt;17&lt;/ref-type&gt;&lt;contributors&gt;&lt;authors&gt;&lt;author&gt;Franzén, Oscar&lt;/author&gt;&lt;author&gt;Gan, Li-Ming&lt;/author&gt;&lt;author&gt;Björkegren, Johan L M&lt;/author&gt;&lt;/authors&gt;&lt;/contributors&gt;&lt;titles&gt;&lt;title&gt;PanglaoDB: a web server for exploration of mouse and human single-cell RNA sequencing data&lt;/title&gt;&lt;secondary-title&gt;Database&lt;/secondary-title&gt;&lt;/titles&gt;&lt;periodical&gt;&lt;full-title&gt;Database&lt;/full-title&gt;&lt;/periodical&gt;&lt;volume&gt;2019&lt;/volume&gt;&lt;dates&gt;&lt;year&gt;2019&lt;/year&gt;&lt;/dates&gt;&lt;isbn&gt;1758-0463&lt;/isbn&gt;&lt;urls&gt;&lt;related-urls&gt;&lt;url&gt;https://doi.org/10.1093/database/baz046&lt;/url&gt;&lt;/related-urls&gt;&lt;/urls&gt;&lt;custom1&gt;baz046&lt;/custom1&gt;&lt;electronic-resource-num&gt;10.1093/database/baz046&lt;/electronic-resource-num&gt;&lt;access-date&gt;6/29/2023&lt;/access-date&gt;&lt;/record&gt;&lt;/Cite&gt;&lt;/EndNote&gt;</w:instrText>
-            </w:r>
-            <w:r>
-              <w:rPr>
-                <w:rFonts w:ascii="Calibri" w:hAnsi="Calibri" w:cs="Calibri"/>
-                <w:color w:val="000000"/>
-              </w:rPr>
-              <w:fldChar w:fldCharType="separate"/>
-            </w:r>
-            <w:r>
-              <w:rPr>
-                <w:rFonts w:ascii="Calibri" w:hAnsi="Calibri" w:cs="Calibri"/>
-                <w:noProof/>
-                <w:color w:val="000000"/>
-              </w:rPr>
-              <w:t>(1)</w:t>
-            </w:r>
-            <w:r>
-              <w:rPr>
-                <w:rFonts w:ascii="Calibri" w:hAnsi="Calibri" w:cs="Calibri"/>
-                <w:color w:val="000000"/>
-              </w:rPr>
-              <w:fldChar w:fldCharType="end"/>
-            </w:r>
-          </w:p>
-        </w:tc>
-      </w:tr>
-      <w:tr>
-        <w:tc>
-          <w:tcPr>
-            <w:tcW w:w="3317" w:type="dxa"/>
-            <w:vAlign w:val="bottom"/>
-          </w:tcPr>
-          <w:p>
-            <w:r>
-              <w:rPr>
-                <w:rFonts w:ascii="Calibri" w:hAnsi="Calibri" w:cs="Calibri"/>
-                <w:color w:val="000000"/>
-              </w:rPr>
-              <w:t>Endothelial cells</w:t>
-            </w:r>
-          </w:p>
-        </w:tc>
-        <w:tc>
-          <w:tcPr>
-            <w:tcW w:w="3128" w:type="dxa"/>
-            <w:vAlign w:val="bottom"/>
-          </w:tcPr>
-          <w:p>
-            <w:r>
-              <w:rPr>
-                <w:rFonts w:ascii="Calibri" w:hAnsi="Calibri" w:cs="Calibri"/>
-                <w:color w:val="000000"/>
-              </w:rPr>
-              <w:t>Slc38a5</w:t>
-            </w:r>
-          </w:p>
-        </w:tc>
-        <w:tc>
-          <w:tcPr>
-            <w:tcW w:w="2617" w:type="dxa"/>
-          </w:tcPr>
-          <w:p>
-            <w:pPr>
-              <w:rPr>
-                <w:rFonts w:ascii="Calibri" w:hAnsi="Calibri" w:cs="Calibri"/>
-                <w:color w:val="000000"/>
-              </w:rPr>
-            </w:pPr>
-            <w:r>
-              <w:rPr>
-                <w:rFonts w:ascii="Calibri" w:hAnsi="Calibri" w:cs="Calibri"/>
-                <w:color w:val="000000"/>
-              </w:rPr>
-              <w:fldChar w:fldCharType="begin"/>
-            </w:r>
-            <w:r>
-              <w:rPr>
-                <w:rFonts w:ascii="Calibri" w:hAnsi="Calibri" w:cs="Calibri"/>
-                <w:color w:val="000000"/>
-              </w:rPr>
-              <w:instrText xml:space="preserve"> ADDIN EN.CITE &lt;EndNote&gt;&lt;Cite&gt;&lt;Author&gt;Franzén&lt;/Author&gt;&lt;Year&gt;2019&lt;/Year&gt;&lt;RecNum&gt;682&lt;/RecNum&gt;&lt;DisplayText&gt;(1)&lt;/DisplayText&gt;&lt;record&gt;&lt;rec-number&gt;682&lt;/rec-number&gt;&lt;foreign-keys&gt;&lt;key app="EN" db-id="xxwwe0rzmffw5tea00tvder2stww5tpt9xwa" timestamp="1691154024" guid="c39a3138-2a5b-4f33-b724-135fd1a0da54"&gt;682&lt;/key&gt;&lt;/foreign-keys&gt;&lt;ref-type name="Journal Article"&gt;17&lt;/ref-type&gt;&lt;contributors&gt;&lt;authors&gt;&lt;author&gt;Franzén, Oscar&lt;/author&gt;&lt;author&gt;Gan, Li-Ming&lt;/author&gt;&lt;author&gt;Björkegren, Johan L M&lt;/author&gt;&lt;/authors&gt;&lt;/contributors&gt;&lt;titles&gt;&lt;title&gt;PanglaoDB: a web server for exploration of mouse and human single-cell RNA sequencing data&lt;/title&gt;&lt;secondary-title&gt;Database&lt;/secondary-title&gt;&lt;/titles&gt;&lt;periodical&gt;&lt;full-title&gt;Database&lt;/full-title&gt;&lt;/periodical&gt;&lt;volume&gt;2019&lt;/volume&gt;&lt;dates&gt;&lt;year&gt;2019&lt;/year&gt;&lt;/dates&gt;&lt;isbn&gt;1758-0463&lt;/isbn&gt;&lt;urls&gt;&lt;related-urls&gt;&lt;url&gt;https://doi.org/10.1093/database/baz046&lt;/url&gt;&lt;/related-urls&gt;&lt;/urls&gt;&lt;custom1&gt;baz046&lt;/custom1&gt;&lt;electronic-resource-num&gt;10.1093/database/baz046&lt;/electronic-resource-num&gt;&lt;access-date&gt;6/29/2023&lt;/access-date&gt;&lt;/record&gt;&lt;/Cite&gt;&lt;/EndNote&gt;</w:instrText>
-            </w:r>
-            <w:r>
-              <w:rPr>
-                <w:rFonts w:ascii="Calibri" w:hAnsi="Calibri" w:cs="Calibri"/>
-                <w:color w:val="000000"/>
-              </w:rPr>
-              <w:fldChar w:fldCharType="separate"/>
-            </w:r>
-            <w:r>
-              <w:rPr>
-                <w:rFonts w:ascii="Calibri" w:hAnsi="Calibri" w:cs="Calibri"/>
-                <w:noProof/>
-                <w:color w:val="000000"/>
-              </w:rPr>
-              <w:t>(1)</w:t>
-            </w:r>
-            <w:r>
-              <w:rPr>
-                <w:rFonts w:ascii="Calibri" w:hAnsi="Calibri" w:cs="Calibri"/>
-                <w:color w:val="000000"/>
-              </w:rPr>
-              <w:fldChar w:fldCharType="end"/>
-            </w:r>
-          </w:p>
-        </w:tc>
-      </w:tr>
-      <w:tr>
-        <w:tc>
-          <w:tcPr>
-            <w:tcW w:w="3317" w:type="dxa"/>
-            <w:vAlign w:val="bottom"/>
-          </w:tcPr>
-          <w:p>
-            <w:r>
-              <w:rPr>
-                <w:rFonts w:ascii="Calibri" w:hAnsi="Calibri" w:cs="Calibri"/>
-                <w:color w:val="000000"/>
-              </w:rPr>
-              <w:t>Endothelial cells</w:t>
-            </w:r>
-          </w:p>
-        </w:tc>
-        <w:tc>
-          <w:tcPr>
-            <w:tcW w:w="3128" w:type="dxa"/>
-            <w:vAlign w:val="bottom"/>
-          </w:tcPr>
-          <w:p>
-            <w:r>
-              <w:rPr>
-                <w:rFonts w:ascii="Calibri" w:hAnsi="Calibri" w:cs="Calibri"/>
-                <w:color w:val="000000"/>
-              </w:rPr>
-              <w:t>Xdh</w:t>
-            </w:r>
-          </w:p>
-        </w:tc>
-        <w:tc>
-          <w:tcPr>
-            <w:tcW w:w="2617" w:type="dxa"/>
-          </w:tcPr>
-          <w:p>
-            <w:pPr>
-              <w:rPr>
-                <w:rFonts w:ascii="Calibri" w:hAnsi="Calibri" w:cs="Calibri"/>
-                <w:color w:val="000000"/>
-              </w:rPr>
-            </w:pPr>
-            <w:r>
-              <w:rPr>
-                <w:rFonts w:ascii="Calibri" w:hAnsi="Calibri" w:cs="Calibri"/>
-                <w:color w:val="000000"/>
-              </w:rPr>
-              <w:fldChar w:fldCharType="begin"/>
-            </w:r>
-            <w:r>
-              <w:rPr>
-                <w:rFonts w:ascii="Calibri" w:hAnsi="Calibri" w:cs="Calibri"/>
-                <w:color w:val="000000"/>
-              </w:rPr>
-              <w:instrText xml:space="preserve"> ADDIN EN.CITE &lt;EndNote&gt;&lt;Cite&gt;&lt;Author&gt;Franzén&lt;/Author&gt;&lt;Year&gt;2019&lt;/Year&gt;&lt;RecNum&gt;682&lt;/RecNum&gt;&lt;DisplayText&gt;(1)&lt;/DisplayText&gt;&lt;record&gt;&lt;rec-number&gt;682&lt;/rec-number&gt;&lt;foreign-keys&gt;&lt;key app="EN" db-id="xxwwe0rzmffw5tea00tvder2stww5tpt9xwa" timestamp="1691154024" guid="c39a3138-2a5b-4f33-b724-135fd1a0da54"&gt;682&lt;/key&gt;&lt;/foreign-keys&gt;&lt;ref-type name="Journal Article"&gt;17&lt;/ref-type&gt;&lt;contributors&gt;&lt;authors&gt;&lt;author&gt;Franzén, Oscar&lt;/author&gt;&lt;author&gt;Gan, Li-Ming&lt;/author&gt;&lt;author&gt;Björkegren, Johan L M&lt;/author&gt;&lt;/authors&gt;&lt;/contributors&gt;&lt;titles&gt;&lt;title&gt;PanglaoDB: a web server for exploration of mouse and human single-cell RNA sequencing data&lt;/title&gt;&lt;secondary-title&gt;Database&lt;/secondary-title&gt;&lt;/titles&gt;&lt;periodical&gt;&lt;full-title&gt;Database&lt;/full-title&gt;&lt;/periodical&gt;&lt;volume&gt;2019&lt;/volume&gt;&lt;dates&gt;&lt;year&gt;2019&lt;/year&gt;&lt;/dates&gt;&lt;isbn&gt;1758-0463&lt;/isbn&gt;&lt;urls&gt;&lt;related-urls&gt;&lt;url&gt;https://doi.org/10.1093/database/baz046&lt;/url&gt;&lt;/related-urls&gt;&lt;/urls&gt;&lt;custom1&gt;baz046&lt;/custom1&gt;&lt;electronic-resource-num&gt;10.1093/database/baz046&lt;/electronic-resource-num&gt;&lt;access-date&gt;6/29/2023&lt;/access-date&gt;&lt;/record&gt;&lt;/Cite&gt;&lt;/EndNote&gt;</w:instrText>
-            </w:r>
-            <w:r>
-              <w:rPr>
-                <w:rFonts w:ascii="Calibri" w:hAnsi="Calibri" w:cs="Calibri"/>
-                <w:color w:val="000000"/>
-              </w:rPr>
-              <w:fldChar w:fldCharType="separate"/>
-            </w:r>
-            <w:r>
-              <w:rPr>
-                <w:rFonts w:ascii="Calibri" w:hAnsi="Calibri" w:cs="Calibri"/>
-                <w:noProof/>
-                <w:color w:val="000000"/>
-              </w:rPr>
-              <w:t>(1)</w:t>
-            </w:r>
-            <w:r>
-              <w:rPr>
-                <w:rFonts w:ascii="Calibri" w:hAnsi="Calibri" w:cs="Calibri"/>
-                <w:color w:val="000000"/>
-              </w:rPr>
-              <w:fldChar w:fldCharType="end"/>
-            </w:r>
-          </w:p>
-        </w:tc>
-      </w:tr>
-      <w:tr>
-        <w:tc>
-          <w:tcPr>
-            <w:tcW w:w="3317" w:type="dxa"/>
-            <w:vAlign w:val="bottom"/>
-          </w:tcPr>
-          <w:p>
-            <w:r>
-              <w:rPr>
-                <w:rFonts w:ascii="Calibri" w:hAnsi="Calibri" w:cs="Calibri"/>
-                <w:color w:val="000000"/>
-              </w:rPr>
-              <w:t>Endothelial cells</w:t>
-            </w:r>
-          </w:p>
-        </w:tc>
-        <w:tc>
-          <w:tcPr>
-            <w:tcW w:w="3128" w:type="dxa"/>
-            <w:vAlign w:val="bottom"/>
-          </w:tcPr>
-          <w:p>
-            <w:r>
-              <w:rPr>
-                <w:rFonts w:ascii="Calibri" w:hAnsi="Calibri" w:cs="Calibri"/>
-                <w:color w:val="000000"/>
-              </w:rPr>
-              <w:t>Slc9a3r2</w:t>
-            </w:r>
-          </w:p>
-        </w:tc>
-        <w:tc>
-          <w:tcPr>
-            <w:tcW w:w="2617" w:type="dxa"/>
-          </w:tcPr>
-          <w:p>
-            <w:pPr>
-              <w:rPr>
-                <w:rFonts w:ascii="Calibri" w:hAnsi="Calibri" w:cs="Calibri"/>
-                <w:color w:val="000000"/>
-              </w:rPr>
-            </w:pPr>
-            <w:r>
-              <w:rPr>
-                <w:rFonts w:ascii="Calibri" w:hAnsi="Calibri" w:cs="Calibri"/>
-                <w:color w:val="000000"/>
-              </w:rPr>
-              <w:fldChar w:fldCharType="begin"/>
-            </w:r>
-            <w:r>
-              <w:rPr>
-                <w:rFonts w:ascii="Calibri" w:hAnsi="Calibri" w:cs="Calibri"/>
-                <w:color w:val="000000"/>
-              </w:rPr>
-              <w:instrText xml:space="preserve"> ADDIN EN.CITE &lt;EndNote&gt;&lt;Cite&gt;&lt;Author&gt;Franzén&lt;/Author&gt;&lt;Year&gt;2019&lt;/Year&gt;&lt;RecNum&gt;682&lt;/RecNum&gt;&lt;DisplayText&gt;(1)&lt;/DisplayText&gt;&lt;record&gt;&lt;rec-number&gt;682&lt;/rec-number&gt;&lt;foreign-keys&gt;&lt;key app="EN" db-id="xxwwe0rzmffw5tea00tvder2stww5tpt9xwa" timestamp="1691154024" guid="c39a3138-2a5b-4f33-b724-135fd1a0da54"&gt;682&lt;/key&gt;&lt;/foreign-keys&gt;&lt;ref-type name="Journal Article"&gt;17&lt;/ref-type&gt;&lt;contributors&gt;&lt;authors&gt;&lt;author&gt;Franzén, Oscar&lt;/author&gt;&lt;author&gt;Gan, Li-Ming&lt;/author&gt;&lt;author&gt;Björkegren, Johan L M&lt;/author&gt;&lt;/authors&gt;&lt;/contributors&gt;&lt;titles&gt;&lt;title&gt;PanglaoDB: a web server for exploration of mouse and human single-cell RNA sequencing data&lt;/title&gt;&lt;secondary-title&gt;Database&lt;/secondary-title&gt;&lt;/titles&gt;&lt;periodical&gt;&lt;full-title&gt;Database&lt;/full-title&gt;&lt;/periodical&gt;&lt;volume&gt;2019&lt;/volume&gt;&lt;dates&gt;&lt;year&gt;2019&lt;/year&gt;&lt;/dates&gt;&lt;isbn&gt;1758-0463&lt;/isbn&gt;&lt;urls&gt;&lt;related-urls&gt;&lt;url&gt;https://doi.org/10.1093/database/baz046&lt;/url&gt;&lt;/related-urls&gt;&lt;/urls&gt;&lt;custom1&gt;baz046&lt;/custom1&gt;&lt;electronic-resource-num&gt;10.1093/database/baz046&lt;/electronic-resource-num&gt;&lt;access-date&gt;6/29/2023&lt;/access-date&gt;&lt;/record&gt;&lt;/Cite&gt;&lt;/EndNote&gt;</w:instrText>
-            </w:r>
-            <w:r>
-              <w:rPr>
-                <w:rFonts w:ascii="Calibri" w:hAnsi="Calibri" w:cs="Calibri"/>
-                <w:color w:val="000000"/>
-              </w:rPr>
-              <w:fldChar w:fldCharType="separate"/>
-            </w:r>
-            <w:r>
-              <w:rPr>
-                <w:rFonts w:ascii="Calibri" w:hAnsi="Calibri" w:cs="Calibri"/>
-                <w:noProof/>
-                <w:color w:val="000000"/>
-              </w:rPr>
-              <w:t>(1)</w:t>
-            </w:r>
-            <w:r>
-              <w:rPr>
-                <w:rFonts w:ascii="Calibri" w:hAnsi="Calibri" w:cs="Calibri"/>
-                <w:color w:val="000000"/>
-              </w:rPr>
-              <w:fldChar w:fldCharType="end"/>
-            </w:r>
-          </w:p>
-        </w:tc>
-      </w:tr>
-      <w:tr>
-        <w:tc>
-          <w:tcPr>
-            <w:tcW w:w="3317" w:type="dxa"/>
-            <w:vAlign w:val="bottom"/>
-          </w:tcPr>
-          <w:p>
-            <w:r>
-              <w:rPr>
-                <w:rFonts w:ascii="Calibri" w:hAnsi="Calibri" w:cs="Calibri"/>
-                <w:color w:val="000000"/>
-              </w:rPr>
-              <w:t>Endothelial cells</w:t>
-            </w:r>
-          </w:p>
-        </w:tc>
-        <w:tc>
-          <w:tcPr>
-            <w:tcW w:w="3128" w:type="dxa"/>
-            <w:vAlign w:val="bottom"/>
-          </w:tcPr>
-          <w:p>
-            <w:proofErr w:type="spellStart"/>
-            <w:r>
-              <w:rPr>
-                <w:rFonts w:ascii="Calibri" w:hAnsi="Calibri" w:cs="Calibri"/>
-                <w:color w:val="000000"/>
-              </w:rPr>
-              <w:t>Rgcc</w:t>
-            </w:r>
-            <w:proofErr w:type="spellEnd"/>
-          </w:p>
-        </w:tc>
-        <w:tc>
-          <w:tcPr>
-            <w:tcW w:w="2617" w:type="dxa"/>
-          </w:tcPr>
-          <w:p>
-            <w:pPr>
-              <w:rPr>
-                <w:rFonts w:ascii="Calibri" w:hAnsi="Calibri" w:cs="Calibri"/>
-                <w:color w:val="000000"/>
-              </w:rPr>
-            </w:pPr>
-            <w:r>
-              <w:rPr>
-                <w:rFonts w:ascii="Calibri" w:hAnsi="Calibri" w:cs="Calibri"/>
-                <w:color w:val="000000"/>
-              </w:rPr>
-              <w:fldChar w:fldCharType="begin"/>
-            </w:r>
-            <w:r>
-              <w:rPr>
-                <w:rFonts w:ascii="Calibri" w:hAnsi="Calibri" w:cs="Calibri"/>
-                <w:color w:val="000000"/>
-              </w:rPr>
-              <w:instrText xml:space="preserve"> ADDIN EN.CITE &lt;EndNote&gt;&lt;Cite&gt;&lt;Author&gt;Franzén&lt;/Author&gt;&lt;Year&gt;2019&lt;/Year&gt;&lt;RecNum&gt;682&lt;/RecNum&gt;&lt;DisplayText&gt;(1)&lt;/DisplayText&gt;&lt;record&gt;&lt;rec-number&gt;682&lt;/rec-number&gt;&lt;foreign-keys&gt;&lt;key app="EN" db-id="xxwwe0rzmffw5tea00tvder2stww5tpt9xwa" timestamp="1691154024" guid="c39a3138-2a5b-4f33-b724-135fd1a0da54"&gt;682&lt;/key&gt;&lt;/foreign-keys&gt;&lt;ref-type name="Journal Article"&gt;17&lt;/ref-type&gt;&lt;contributors&gt;&lt;authors&gt;&lt;author&gt;Franzén, Oscar&lt;/author&gt;&lt;author&gt;Gan, Li-Ming&lt;/author&gt;&lt;author&gt;Björkegren, Johan L M&lt;/author&gt;&lt;/authors&gt;&lt;/contributors&gt;&lt;titles&gt;&lt;title&gt;PanglaoDB: a web server for exploration of mouse and human single-cell RNA sequencing data&lt;/title&gt;&lt;secondary-title&gt;Database&lt;/secondary-title&gt;&lt;/titles&gt;&lt;periodical&gt;&lt;full-title&gt;Database&lt;/full-title&gt;&lt;/periodical&gt;&lt;volume&gt;2019&lt;/volume&gt;&lt;dates&gt;&lt;year&gt;2019&lt;/year&gt;&lt;/dates&gt;&lt;isbn&gt;1758-0463&lt;/isbn&gt;&lt;urls&gt;&lt;related-urls&gt;&lt;url&gt;https://doi.org/10.1093/database/baz046&lt;/url&gt;&lt;/related-urls&gt;&lt;/urls&gt;&lt;custom1&gt;baz046&lt;/custom1&gt;&lt;electronic-resource-num&gt;10.1093/database/baz046&lt;/electronic-resource-num&gt;&lt;access-date&gt;6/29/2023&lt;/access-date&gt;&lt;/record&gt;&lt;/Cite&gt;&lt;/EndNote&gt;</w:instrText>
-            </w:r>
-            <w:r>
-              <w:rPr>
-                <w:rFonts w:ascii="Calibri" w:hAnsi="Calibri" w:cs="Calibri"/>
-                <w:color w:val="000000"/>
-              </w:rPr>
-              <w:fldChar w:fldCharType="separate"/>
-            </w:r>
-            <w:r>
-              <w:rPr>
-                <w:rFonts w:ascii="Calibri" w:hAnsi="Calibri" w:cs="Calibri"/>
-                <w:noProof/>
-                <w:color w:val="000000"/>
-              </w:rPr>
-              <w:t>(1)</w:t>
-            </w:r>
-            <w:r>
-              <w:rPr>
-                <w:rFonts w:ascii="Calibri" w:hAnsi="Calibri" w:cs="Calibri"/>
-                <w:color w:val="000000"/>
-              </w:rPr>
-              <w:fldChar w:fldCharType="end"/>
-            </w:r>
-          </w:p>
-        </w:tc>
-      </w:tr>
-      <w:tr>
-        <w:tc>
-          <w:tcPr>
-            <w:tcW w:w="3317" w:type="dxa"/>
-            <w:vAlign w:val="bottom"/>
-          </w:tcPr>
-          <w:p>
-            <w:r>
-              <w:rPr>
-                <w:rFonts w:ascii="Calibri" w:hAnsi="Calibri" w:cs="Calibri"/>
-                <w:color w:val="000000"/>
-              </w:rPr>
-              <w:t>Endothelial cells</w:t>
-            </w:r>
-          </w:p>
-        </w:tc>
-        <w:tc>
-          <w:tcPr>
-            <w:tcW w:w="3128" w:type="dxa"/>
-            <w:vAlign w:val="bottom"/>
-          </w:tcPr>
-          <w:p>
-            <w:r>
-              <w:rPr>
-                <w:rFonts w:ascii="Calibri" w:hAnsi="Calibri" w:cs="Calibri"/>
-                <w:color w:val="000000"/>
-              </w:rPr>
-              <w:t>Sparcl1</w:t>
-            </w:r>
-          </w:p>
-        </w:tc>
-        <w:tc>
-          <w:tcPr>
-            <w:tcW w:w="2617" w:type="dxa"/>
-          </w:tcPr>
-          <w:p>
-            <w:pPr>
-              <w:rPr>
-                <w:rFonts w:ascii="Calibri" w:hAnsi="Calibri" w:cs="Calibri"/>
-                <w:color w:val="000000"/>
-              </w:rPr>
-            </w:pPr>
-            <w:r>
-              <w:rPr>
-                <w:rFonts w:ascii="Calibri" w:hAnsi="Calibri" w:cs="Calibri"/>
-                <w:color w:val="000000"/>
-              </w:rPr>
-              <w:fldChar w:fldCharType="begin"/>
-            </w:r>
-            <w:r>
-              <w:rPr>
-                <w:rFonts w:ascii="Calibri" w:hAnsi="Calibri" w:cs="Calibri"/>
-                <w:color w:val="000000"/>
-              </w:rPr>
-              <w:instrText xml:space="preserve"> ADDIN EN.CITE &lt;EndNote&gt;&lt;Cite&gt;&lt;Author&gt;Franzén&lt;/Author&gt;&lt;Year&gt;2019&lt;/Year&gt;&lt;RecNum&gt;682&lt;/RecNum&gt;&lt;DisplayText&gt;(1)&lt;/DisplayText&gt;&lt;record&gt;&lt;rec-number&gt;682&lt;/rec-number&gt;&lt;foreign-keys&gt;&lt;key app="EN" db-id="xxwwe0rzmffw5tea00tvder2stww5tpt9xwa" timestamp="1691154024" guid="c39a3138-2a5b-4f33-b724-135fd1a0da54"&gt;682&lt;/key&gt;&lt;/foreign-keys&gt;&lt;ref-type name="Journal Article"&gt;17&lt;/ref-type&gt;&lt;contributors&gt;&lt;authors&gt;&lt;author&gt;Franzén, Oscar&lt;/author&gt;&lt;author&gt;Gan, Li-Ming&lt;/author&gt;&lt;author&gt;Björkegren, Johan L M&lt;/author&gt;&lt;/authors&gt;&lt;/contributors&gt;&lt;titles&gt;&lt;title&gt;PanglaoDB: a web server for exploration of mouse and human single-cell RNA sequencing data&lt;/title&gt;&lt;secondary-title&gt;Database&lt;/secondary-title&gt;&lt;/titles&gt;&lt;periodical&gt;&lt;full-title&gt;Database&lt;/full-title&gt;&lt;/periodical&gt;&lt;volume&gt;2019&lt;/volume&gt;&lt;dates&gt;&lt;year&gt;2019&lt;/year&gt;&lt;/dates&gt;&lt;isbn&gt;1758-0463&lt;/isbn&gt;&lt;urls&gt;&lt;related-urls&gt;&lt;url&gt;https://doi.org/10.1093/database/baz046&lt;/url&gt;&lt;/related-urls&gt;&lt;/urls&gt;&lt;custom1&gt;baz046&lt;/custom1&gt;&lt;electronic-resource-num&gt;10.1093/database/baz046&lt;/electronic-resource-num&gt;&lt;access-date&gt;6/29/2023&lt;/access-date&gt;&lt;/record&gt;&lt;/Cite&gt;&lt;/EndNote&gt;</w:instrText>
-            </w:r>
-            <w:r>
-              <w:rPr>
-                <w:rFonts w:ascii="Calibri" w:hAnsi="Calibri" w:cs="Calibri"/>
-                <w:color w:val="000000"/>
-              </w:rPr>
-              <w:fldChar w:fldCharType="separate"/>
-            </w:r>
-            <w:r>
-              <w:rPr>
-                <w:rFonts w:ascii="Calibri" w:hAnsi="Calibri" w:cs="Calibri"/>
-                <w:noProof/>
-                <w:color w:val="000000"/>
-              </w:rPr>
-              <w:t>(1)</w:t>
-            </w:r>
-            <w:r>
-              <w:rPr>
-                <w:rFonts w:ascii="Calibri" w:hAnsi="Calibri" w:cs="Calibri"/>
-                <w:color w:val="000000"/>
-              </w:rPr>
-              <w:fldChar w:fldCharType="end"/>
-            </w:r>
-          </w:p>
-        </w:tc>
-      </w:tr>
-      <w:tr>
-        <w:tc>
-          <w:tcPr>
-            <w:tcW w:w="3317" w:type="dxa"/>
-            <w:vAlign w:val="bottom"/>
-          </w:tcPr>
-          <w:p>
-            <w:r>
-              <w:rPr>
-                <w:rFonts w:ascii="Calibri" w:hAnsi="Calibri" w:cs="Calibri"/>
-                <w:color w:val="000000"/>
-              </w:rPr>
-              <w:t>Endothelial cells</w:t>
-            </w:r>
-          </w:p>
-        </w:tc>
-        <w:tc>
-          <w:tcPr>
-            <w:tcW w:w="3128" w:type="dxa"/>
-            <w:vAlign w:val="bottom"/>
-          </w:tcPr>
-          <w:p>
-            <w:r>
-              <w:rPr>
-                <w:rFonts w:ascii="Calibri" w:hAnsi="Calibri" w:cs="Calibri"/>
-                <w:color w:val="000000"/>
-              </w:rPr>
-              <w:t>Tm4sf1</w:t>
-            </w:r>
-          </w:p>
-        </w:tc>
-        <w:tc>
-          <w:tcPr>
-            <w:tcW w:w="2617" w:type="dxa"/>
-          </w:tcPr>
-          <w:p>
-            <w:pPr>
-              <w:rPr>
-                <w:rFonts w:ascii="Calibri" w:hAnsi="Calibri" w:cs="Calibri"/>
-                <w:color w:val="000000"/>
-              </w:rPr>
-            </w:pPr>
-            <w:r>
-              <w:rPr>
-                <w:rFonts w:ascii="Calibri" w:hAnsi="Calibri" w:cs="Calibri"/>
-                <w:color w:val="000000"/>
-              </w:rPr>
-              <w:fldChar w:fldCharType="begin"/>
-            </w:r>
-            <w:r>
-              <w:rPr>
-                <w:rFonts w:ascii="Calibri" w:hAnsi="Calibri" w:cs="Calibri"/>
-                <w:color w:val="000000"/>
-              </w:rPr>
-              <w:instrText xml:space="preserve"> ADDIN EN.CITE &lt;EndNote&gt;&lt;Cite&gt;&lt;Author&gt;Franzén&lt;/Author&gt;&lt;Year&gt;2019&lt;/Year&gt;&lt;RecNum&gt;682&lt;/RecNum&gt;&lt;DisplayText&gt;(1)&lt;/DisplayText&gt;&lt;record&gt;&lt;rec-number&gt;682&lt;/rec-number&gt;&lt;foreign-keys&gt;&lt;key app="EN" db-id="xxwwe0rzmffw5tea00tvder2stww5tpt9xwa" timestamp="1691154024" guid="c39a3138-2a5b-4f33-b724-135fd1a0da54"&gt;682&lt;/key&gt;&lt;/foreign-keys&gt;&lt;ref-type name="Journal Article"&gt;17&lt;/ref-type&gt;&lt;contributors&gt;&lt;authors&gt;&lt;author&gt;Franzén, Oscar&lt;/author&gt;&lt;author&gt;Gan, Li-Ming&lt;/author&gt;&lt;author&gt;Björkegren, Johan L M&lt;/author&gt;&lt;/authors&gt;&lt;/contributors&gt;&lt;titles&gt;&lt;title&gt;PanglaoDB: a web server for exploration of mouse and human single-cell RNA sequencing data&lt;/title&gt;&lt;secondary-title&gt;Database&lt;/secondary-title&gt;&lt;/titles&gt;&lt;periodical&gt;&lt;full-title&gt;Database&lt;/full-title&gt;&lt;/periodical&gt;&lt;volume&gt;2019&lt;/volume&gt;&lt;dates&gt;&lt;year&gt;2019&lt;/year&gt;&lt;/dates&gt;&lt;isbn&gt;1758-0463&lt;/isbn&gt;&lt;urls&gt;&lt;related-urls&gt;&lt;url&gt;https://doi.org/10.1093/database/baz046&lt;/url&gt;&lt;/related-urls&gt;&lt;/urls&gt;&lt;custom1&gt;baz046&lt;/custom1&gt;&lt;electronic-resource-num&gt;10.1093/database/baz046&lt;/electronic-resource-num&gt;&lt;access-date&gt;6/29/2023&lt;/access-date&gt;&lt;/record&gt;&lt;/Cite&gt;&lt;/EndNote&gt;</w:instrText>
-            </w:r>
-            <w:r>
-              <w:rPr>
-                <w:rFonts w:ascii="Calibri" w:hAnsi="Calibri" w:cs="Calibri"/>
-                <w:color w:val="000000"/>
-              </w:rPr>
-              <w:fldChar w:fldCharType="separate"/>
-            </w:r>
-            <w:r>
-              <w:rPr>
-                <w:rFonts w:ascii="Calibri" w:hAnsi="Calibri" w:cs="Calibri"/>
-                <w:noProof/>
-                <w:color w:val="000000"/>
-              </w:rPr>
-              <w:t>(1)</w:t>
-            </w:r>
-            <w:r>
-              <w:rPr>
-                <w:rFonts w:ascii="Calibri" w:hAnsi="Calibri" w:cs="Calibri"/>
-                <w:color w:val="000000"/>
-              </w:rPr>
-              <w:fldChar w:fldCharType="end"/>
-            </w:r>
-          </w:p>
-        </w:tc>
-      </w:tr>
-      <w:tr>
-        <w:tc>
-          <w:tcPr>
-            <w:tcW w:w="3317" w:type="dxa"/>
-            <w:vAlign w:val="bottom"/>
-          </w:tcPr>
-          <w:p>
-            <w:r>
-              <w:rPr>
-                <w:rFonts w:ascii="Calibri" w:hAnsi="Calibri" w:cs="Calibri"/>
-                <w:color w:val="000000"/>
-              </w:rPr>
-              <w:t>Endothelial cells</w:t>
-            </w:r>
-          </w:p>
-        </w:tc>
-        <w:tc>
-          <w:tcPr>
-            <w:tcW w:w="3128" w:type="dxa"/>
-            <w:vAlign w:val="bottom"/>
-          </w:tcPr>
-          <w:p>
-            <w:proofErr w:type="spellStart"/>
-            <w:r>
-              <w:rPr>
-                <w:rFonts w:ascii="Calibri" w:hAnsi="Calibri" w:cs="Calibri"/>
-                <w:color w:val="000000"/>
-              </w:rPr>
-              <w:t>Srpx</w:t>
-            </w:r>
-            <w:proofErr w:type="spellEnd"/>
-          </w:p>
-        </w:tc>
-        <w:tc>
-          <w:tcPr>
-            <w:tcW w:w="2617" w:type="dxa"/>
-          </w:tcPr>
-          <w:p>
-            <w:pPr>
-              <w:rPr>
-                <w:rFonts w:ascii="Calibri" w:hAnsi="Calibri" w:cs="Calibri"/>
-                <w:color w:val="000000"/>
-              </w:rPr>
-            </w:pPr>
-            <w:r>
-              <w:rPr>
-                <w:rFonts w:ascii="Calibri" w:hAnsi="Calibri" w:cs="Calibri"/>
-                <w:color w:val="000000"/>
-              </w:rPr>
-              <w:fldChar w:fldCharType="begin"/>
-            </w:r>
-            <w:r>
-              <w:rPr>
-                <w:rFonts w:ascii="Calibri" w:hAnsi="Calibri" w:cs="Calibri"/>
-                <w:color w:val="000000"/>
-              </w:rPr>
-              <w:instrText xml:space="preserve"> ADDIN EN.CITE &lt;EndNote&gt;&lt;Cite&gt;&lt;Author&gt;Franzén&lt;/Author&gt;&lt;Year&gt;2019&lt;/Year&gt;&lt;RecNum&gt;682&lt;/RecNum&gt;&lt;DisplayText&gt;(1)&lt;/DisplayText&gt;&lt;record&gt;&lt;rec-number&gt;682&lt;/rec-number&gt;&lt;foreign-keys&gt;&lt;key app="EN" db-id="xxwwe0rzmffw5tea00tvder2stww5tpt9xwa" timestamp="1691154024" guid="c39a3138-2a5b-4f33-b724-135fd1a0da54"&gt;682&lt;/key&gt;&lt;/foreign-keys&gt;&lt;ref-type name="Journal Article"&gt;17&lt;/ref-type&gt;&lt;contributors&gt;&lt;authors&gt;&lt;author&gt;Franzén, Oscar&lt;/author&gt;&lt;author&gt;Gan, Li-Ming&lt;/author&gt;&lt;author&gt;Björkegren, Johan L M&lt;/author&gt;&lt;/authors&gt;&lt;/contributors&gt;&lt;titles&gt;&lt;title&gt;PanglaoDB: a web server for exploration of mouse and human single-cell RNA sequencing data&lt;/title&gt;&lt;secondary-title&gt;Database&lt;/secondary-title&gt;&lt;/titles&gt;&lt;periodical&gt;&lt;full-title&gt;Database&lt;/full-title&gt;&lt;/periodical&gt;&lt;volume&gt;2019&lt;/volume&gt;&lt;dates&gt;&lt;year&gt;2019&lt;/year&gt;&lt;/dates&gt;&lt;isbn&gt;1758-0463&lt;/isbn&gt;&lt;urls&gt;&lt;related-urls&gt;&lt;url&gt;https://doi.org/10.1093/database/baz046&lt;/url&gt;&lt;/related-urls&gt;&lt;/urls&gt;&lt;custom1&gt;baz046&lt;/custom1&gt;&lt;electronic-resource-num&gt;10.1093/database/baz046&lt;/electronic-resource-num&gt;&lt;access-date&gt;6/29/2023&lt;/access-date&gt;&lt;/record&gt;&lt;/Cite&gt;&lt;/EndNote&gt;</w:instrText>
-            </w:r>
-            <w:r>
-              <w:rPr>
-                <w:rFonts w:ascii="Calibri" w:hAnsi="Calibri" w:cs="Calibri"/>
-                <w:color w:val="000000"/>
-              </w:rPr>
-              <w:fldChar w:fldCharType="separate"/>
-            </w:r>
-            <w:r>
-              <w:rPr>
-                <w:rFonts w:ascii="Calibri" w:hAnsi="Calibri" w:cs="Calibri"/>
-                <w:noProof/>
-                <w:color w:val="000000"/>
-              </w:rPr>
-              <w:t>(1)</w:t>
-            </w:r>
-            <w:r>
-              <w:rPr>
-                <w:rFonts w:ascii="Calibri" w:hAnsi="Calibri" w:cs="Calibri"/>
-                <w:color w:val="000000"/>
-              </w:rPr>
-              <w:fldChar w:fldCharType="end"/>
-            </w:r>
-          </w:p>
-        </w:tc>
-      </w:tr>
-      <w:tr>
-        <w:tc>
-          <w:tcPr>
-            <w:tcW w:w="3317" w:type="dxa"/>
-            <w:vAlign w:val="bottom"/>
-          </w:tcPr>
-          <w:p>
-            <w:r>
-              <w:rPr>
-                <w:rFonts w:ascii="Calibri" w:hAnsi="Calibri" w:cs="Calibri"/>
-                <w:color w:val="000000"/>
-              </w:rPr>
-              <w:t>Endothelial cells</w:t>
-            </w:r>
-          </w:p>
-        </w:tc>
-        <w:tc>
-          <w:tcPr>
-            <w:tcW w:w="3128" w:type="dxa"/>
-            <w:vAlign w:val="bottom"/>
-          </w:tcPr>
-          <w:p>
-            <w:r>
-              <w:rPr>
-                <w:rFonts w:ascii="Calibri" w:hAnsi="Calibri" w:cs="Calibri"/>
-                <w:color w:val="000000"/>
-              </w:rPr>
-              <w:t>S100a13</w:t>
-            </w:r>
-          </w:p>
-        </w:tc>
-        <w:tc>
-          <w:tcPr>
-            <w:tcW w:w="2617" w:type="dxa"/>
-          </w:tcPr>
-          <w:p>
-            <w:pPr>
-              <w:rPr>
-                <w:rFonts w:ascii="Calibri" w:hAnsi="Calibri" w:cs="Calibri"/>
-                <w:color w:val="000000"/>
-              </w:rPr>
-            </w:pPr>
-            <w:r>
-              <w:rPr>
-                <w:rFonts w:ascii="Calibri" w:hAnsi="Calibri" w:cs="Calibri"/>
-                <w:color w:val="000000"/>
-              </w:rPr>
-              <w:fldChar w:fldCharType="begin"/>
-            </w:r>
-            <w:r>
-              <w:rPr>
-                <w:rFonts w:ascii="Calibri" w:hAnsi="Calibri" w:cs="Calibri"/>
-                <w:color w:val="000000"/>
-              </w:rPr>
-              <w:instrText xml:space="preserve"> ADDIN EN.CITE &lt;EndNote&gt;&lt;Cite&gt;&lt;Author&gt;Franzén&lt;/Author&gt;&lt;Year&gt;2019&lt;/Year&gt;&lt;RecNum&gt;682&lt;/RecNum&gt;&lt;DisplayText&gt;(1)&lt;/DisplayText&gt;&lt;record&gt;&lt;rec-number&gt;682&lt;/rec-number&gt;&lt;foreign-keys&gt;&lt;key app="EN" db-id="xxwwe0rzmffw5tea00tvder2stww5tpt9xwa" timestamp="1691154024" guid="c39a3138-2a5b-4f33-b724-135fd1a0da54"&gt;682&lt;/key&gt;&lt;/foreign-keys&gt;&lt;ref-type name="Journal Article"&gt;17&lt;/ref-type&gt;&lt;contributors&gt;&lt;authors&gt;&lt;author&gt;Franzén, Oscar&lt;/author&gt;&lt;author&gt;Gan, Li-Ming&lt;/author&gt;&lt;author&gt;Björkegren, Johan L M&lt;/author&gt;&lt;/authors&gt;&lt;/contributors&gt;&lt;titles&gt;&lt;title&gt;PanglaoDB: a web server for exploration of mouse and human single-cell RNA sequencing data&lt;/title&gt;&lt;secondary-title&gt;Database&lt;/secondary-title&gt;&lt;/titles&gt;&lt;periodical&gt;&lt;full-title&gt;Database&lt;/full-title&gt;&lt;/periodical&gt;&lt;volume&gt;2019&lt;/volume&gt;&lt;dates&gt;&lt;year&gt;2019&lt;/year&gt;&lt;/dates&gt;&lt;isbn&gt;1758-0463&lt;/isbn&gt;&lt;urls&gt;&lt;related-urls&gt;&lt;url&gt;https://doi.org/10.1093/database/baz046&lt;/url&gt;&lt;/related-urls&gt;&lt;/urls&gt;&lt;custom1&gt;baz046&lt;/custom1&gt;&lt;electronic-resource-num&gt;10.1093/database/baz046&lt;/electronic-resource-num&gt;&lt;access-date&gt;6/29/2023&lt;/access-date&gt;&lt;/record&gt;&lt;/Cite&gt;&lt;/EndNote&gt;</w:instrText>
-            </w:r>
-            <w:r>
-              <w:rPr>
-                <w:rFonts w:ascii="Calibri" w:hAnsi="Calibri" w:cs="Calibri"/>
-                <w:color w:val="000000"/>
-              </w:rPr>
-              <w:fldChar w:fldCharType="separate"/>
-            </w:r>
-            <w:r>
-              <w:rPr>
-                <w:rFonts w:ascii="Calibri" w:hAnsi="Calibri" w:cs="Calibri"/>
-                <w:noProof/>
-                <w:color w:val="000000"/>
-              </w:rPr>
-              <w:t>(1)</w:t>
-            </w:r>
-            <w:r>
-              <w:rPr>
-                <w:rFonts w:ascii="Calibri" w:hAnsi="Calibri" w:cs="Calibri"/>
-                <w:color w:val="000000"/>
-              </w:rPr>
-              <w:fldChar w:fldCharType="end"/>
-            </w:r>
-          </w:p>
-        </w:tc>
-      </w:tr>
-      <w:tr>
-        <w:tc>
-          <w:tcPr>
-            <w:tcW w:w="3317" w:type="dxa"/>
-            <w:vAlign w:val="bottom"/>
-          </w:tcPr>
-          <w:p>
-            <w:r>
-              <w:rPr>
-                <w:rFonts w:ascii="Calibri" w:hAnsi="Calibri" w:cs="Calibri"/>
-                <w:color w:val="000000"/>
-              </w:rPr>
-              <w:t>Endothelial cells</w:t>
-            </w:r>
-          </w:p>
-        </w:tc>
-        <w:tc>
-          <w:tcPr>
-            <w:tcW w:w="3128" w:type="dxa"/>
-            <w:vAlign w:val="bottom"/>
-          </w:tcPr>
-          <w:p>
-            <w:r>
-              <w:rPr>
-                <w:rFonts w:ascii="Calibri" w:hAnsi="Calibri" w:cs="Calibri"/>
-                <w:color w:val="000000"/>
-              </w:rPr>
-              <w:t>Sgk1</w:t>
-            </w:r>
-          </w:p>
-        </w:tc>
-        <w:tc>
-          <w:tcPr>
-            <w:tcW w:w="2617" w:type="dxa"/>
-          </w:tcPr>
-          <w:p>
-            <w:pPr>
-              <w:rPr>
-                <w:rFonts w:ascii="Calibri" w:hAnsi="Calibri" w:cs="Calibri"/>
-                <w:color w:val="000000"/>
-              </w:rPr>
-            </w:pPr>
-            <w:r>
-              <w:rPr>
-                <w:rFonts w:ascii="Calibri" w:hAnsi="Calibri" w:cs="Calibri"/>
-                <w:color w:val="000000"/>
-              </w:rPr>
-              <w:fldChar w:fldCharType="begin"/>
-            </w:r>
-            <w:r>
-              <w:rPr>
-                <w:rFonts w:ascii="Calibri" w:hAnsi="Calibri" w:cs="Calibri"/>
-                <w:color w:val="000000"/>
-              </w:rPr>
-              <w:instrText xml:space="preserve"> ADDIN EN.CITE &lt;EndNote&gt;&lt;Cite&gt;&lt;Author&gt;Franzén&lt;/Author&gt;&lt;Year&gt;2019&lt;/Year&gt;&lt;RecNum&gt;682&lt;/RecNum&gt;&lt;DisplayText&gt;(1)&lt;/DisplayText&gt;&lt;record&gt;&lt;rec-number&gt;682&lt;/rec-number&gt;&lt;foreign-keys&gt;&lt;key app="EN" db-id="xxwwe0rzmffw5tea00tvder2stww5tpt9xwa" timestamp="1691154024" guid="c39a3138-2a5b-4f33-b724-135fd1a0da54"&gt;682&lt;/key&gt;&lt;/foreign-keys&gt;&lt;ref-type name="Journal Article"&gt;17&lt;/ref-type&gt;&lt;contributors&gt;&lt;authors&gt;&lt;author&gt;Franzén, Oscar&lt;/author&gt;&lt;author&gt;Gan, Li-Ming&lt;/author&gt;&lt;author&gt;Björkegren, Johan L M&lt;/author&gt;&lt;/authors&gt;&lt;/contributors&gt;&lt;titles&gt;&lt;title&gt;PanglaoDB: a web server for exploration of mouse and human single-cell RNA sequencing data&lt;/title&gt;&lt;secondary-title&gt;Database&lt;/secondary-title&gt;&lt;/titles&gt;&lt;periodical&gt;&lt;full-title&gt;Database&lt;/full-title&gt;&lt;/periodical&gt;&lt;volume&gt;2019&lt;/volume&gt;&lt;dates&gt;&lt;year&gt;2019&lt;/year&gt;&lt;/dates&gt;&lt;isbn&gt;1758-0463&lt;/isbn&gt;&lt;urls&gt;&lt;related-urls&gt;&lt;url&gt;https://doi.org/10.1093/database/baz046&lt;/url&gt;&lt;/related-urls&gt;&lt;/urls&gt;&lt;custom1&gt;baz046&lt;/custom1&gt;&lt;electronic-resource-num&gt;10.1093/database/baz046&lt;/electronic-resource-num&gt;&lt;access-date&gt;6/29/2023&lt;/access-date&gt;&lt;/record&gt;&lt;/Cite&gt;&lt;/EndNote&gt;</w:instrText>
-            </w:r>
-            <w:r>
-              <w:rPr>
-                <w:rFonts w:ascii="Calibri" w:hAnsi="Calibri" w:cs="Calibri"/>
-                <w:color w:val="000000"/>
-              </w:rPr>
-              <w:fldChar w:fldCharType="separate"/>
-            </w:r>
-            <w:r>
-              <w:rPr>
-                <w:rFonts w:ascii="Calibri" w:hAnsi="Calibri" w:cs="Calibri"/>
-                <w:noProof/>
-                <w:color w:val="000000"/>
-              </w:rPr>
-              <w:t>(1)</w:t>
-            </w:r>
-            <w:r>
-              <w:rPr>
-                <w:rFonts w:ascii="Calibri" w:hAnsi="Calibri" w:cs="Calibri"/>
-                <w:color w:val="000000"/>
-              </w:rPr>
-              <w:fldChar w:fldCharType="end"/>
-            </w:r>
-          </w:p>
-        </w:tc>
-      </w:tr>
-      <w:tr>
-        <w:tc>
-          <w:tcPr>
-            <w:tcW w:w="3317" w:type="dxa"/>
-            <w:vAlign w:val="bottom"/>
-          </w:tcPr>
-          <w:p>
-            <w:r>
-              <w:rPr>
-                <w:rFonts w:ascii="Calibri" w:hAnsi="Calibri" w:cs="Calibri"/>
-                <w:color w:val="000000"/>
-              </w:rPr>
-              <w:t>Endothelial cells</w:t>
-            </w:r>
-          </w:p>
-        </w:tc>
-        <w:tc>
-          <w:tcPr>
-            <w:tcW w:w="3128" w:type="dxa"/>
-            <w:vAlign w:val="bottom"/>
-          </w:tcPr>
-          <w:p>
-            <w:r>
-              <w:rPr>
-                <w:rFonts w:ascii="Calibri" w:hAnsi="Calibri" w:cs="Calibri"/>
-                <w:color w:val="000000"/>
-              </w:rPr>
-              <w:t>Timp3</w:t>
-            </w:r>
-          </w:p>
-        </w:tc>
-        <w:tc>
-          <w:tcPr>
-            <w:tcW w:w="2617" w:type="dxa"/>
-          </w:tcPr>
-          <w:p>
-            <w:pPr>
-              <w:rPr>
-                <w:rFonts w:ascii="Calibri" w:hAnsi="Calibri" w:cs="Calibri"/>
-                <w:color w:val="000000"/>
-              </w:rPr>
-            </w:pPr>
-            <w:r>
-              <w:rPr>
-                <w:rFonts w:ascii="Calibri" w:hAnsi="Calibri" w:cs="Calibri"/>
-                <w:color w:val="000000"/>
-              </w:rPr>
-              <w:fldChar w:fldCharType="begin"/>
-            </w:r>
-            <w:r>
-              <w:rPr>
-                <w:rFonts w:ascii="Calibri" w:hAnsi="Calibri" w:cs="Calibri"/>
-                <w:color w:val="000000"/>
-              </w:rPr>
-              <w:instrText xml:space="preserve"> ADDIN EN.CITE &lt;EndNote&gt;&lt;Cite&gt;&lt;Author&gt;Franzén&lt;/Author&gt;&lt;Year&gt;2019&lt;/Year&gt;&lt;RecNum&gt;682&lt;/RecNum&gt;&lt;DisplayText&gt;(1)&lt;/DisplayText&gt;&lt;record&gt;&lt;rec-number&gt;682&lt;/rec-number&gt;&lt;foreign-keys&gt;&lt;key app="EN" db-id="xxwwe0rzmffw5tea00tvder2stww5tpt9xwa" timestamp="1691154024" guid="c39a3138-2a5b-4f33-b724-135fd1a0da54"&gt;682&lt;/key&gt;&lt;/foreign-keys&gt;&lt;ref-type name="Journal Article"&gt;17&lt;/ref-type&gt;&lt;contributors&gt;&lt;authors&gt;&lt;author&gt;Franzén, Oscar&lt;/author&gt;&lt;author&gt;Gan, Li-Ming&lt;/author&gt;&lt;author&gt;Björkegren, Johan L M&lt;/author&gt;&lt;/authors&gt;&lt;/contributors&gt;&lt;titles&gt;&lt;title&gt;PanglaoDB: a web server for exploration of mouse and human single-cell RNA sequencing data&lt;/title&gt;&lt;secondary-title&gt;Database&lt;/secondary-title&gt;&lt;/titles&gt;&lt;periodical&gt;&lt;full-title&gt;Database&lt;/full-title&gt;&lt;/periodical&gt;&lt;volume&gt;2019&lt;/volume&gt;&lt;dates&gt;&lt;year&gt;2019&lt;/year&gt;&lt;/dates&gt;&lt;isbn&gt;1758-0463&lt;/isbn&gt;&lt;urls&gt;&lt;related-urls&gt;&lt;url&gt;https://doi.org/10.1093/database/baz046&lt;/url&gt;&lt;/related-urls&gt;&lt;/urls&gt;&lt;custom1&gt;baz046&lt;/custom1&gt;&lt;electronic-resource-num&gt;10.1093/database/baz046&lt;/electronic-resource-num&gt;&lt;access-date&gt;6/29/2023&lt;/access-date&gt;&lt;/record&gt;&lt;/Cite&gt;&lt;/EndNote&gt;</w:instrText>
-            </w:r>
-            <w:r>
-              <w:rPr>
-                <w:rFonts w:ascii="Calibri" w:hAnsi="Calibri" w:cs="Calibri"/>
-                <w:color w:val="000000"/>
-              </w:rPr>
-              <w:fldChar w:fldCharType="separate"/>
-            </w:r>
-            <w:r>
-              <w:rPr>
-                <w:rFonts w:ascii="Calibri" w:hAnsi="Calibri" w:cs="Calibri"/>
-                <w:noProof/>
-                <w:color w:val="000000"/>
-              </w:rPr>
-              <w:t>(1)</w:t>
-            </w:r>
-            <w:r>
-              <w:rPr>
-                <w:rFonts w:ascii="Calibri" w:hAnsi="Calibri" w:cs="Calibri"/>
-                <w:color w:val="000000"/>
-              </w:rPr>
-              <w:fldChar w:fldCharType="end"/>
-            </w:r>
-          </w:p>
-        </w:tc>
-      </w:tr>
-      <w:tr>
-        <w:tc>
-          <w:tcPr>
-            <w:tcW w:w="3317" w:type="dxa"/>
-            <w:vAlign w:val="bottom"/>
-          </w:tcPr>
-          <w:p>
-            <w:r>
-              <w:rPr>
-                <w:rFonts w:ascii="Calibri" w:hAnsi="Calibri" w:cs="Calibri"/>
-                <w:color w:val="000000"/>
-              </w:rPr>
-              <w:t>Endothelial cells</w:t>
-            </w:r>
-          </w:p>
-        </w:tc>
-        <w:tc>
-          <w:tcPr>
-            <w:tcW w:w="3128" w:type="dxa"/>
-            <w:vAlign w:val="bottom"/>
-          </w:tcPr>
-          <w:p>
-            <w:r>
-              <w:rPr>
-                <w:rFonts w:ascii="Calibri" w:hAnsi="Calibri" w:cs="Calibri"/>
-                <w:color w:val="000000"/>
-              </w:rPr>
-              <w:t>Stab2</w:t>
-            </w:r>
-          </w:p>
-        </w:tc>
-        <w:tc>
-          <w:tcPr>
-            <w:tcW w:w="2617" w:type="dxa"/>
-          </w:tcPr>
-          <w:p>
-            <w:pPr>
-              <w:rPr>
-                <w:rFonts w:ascii="Calibri" w:hAnsi="Calibri" w:cs="Calibri"/>
-                <w:color w:val="000000"/>
-              </w:rPr>
-            </w:pPr>
-            <w:r>
-              <w:rPr>
-                <w:rFonts w:ascii="Calibri" w:hAnsi="Calibri" w:cs="Calibri"/>
-                <w:color w:val="000000"/>
-              </w:rPr>
-              <w:fldChar w:fldCharType="begin"/>
-            </w:r>
-            <w:r>
-              <w:rPr>
-                <w:rFonts w:ascii="Calibri" w:hAnsi="Calibri" w:cs="Calibri"/>
-                <w:color w:val="000000"/>
-              </w:rPr>
-              <w:instrText xml:space="preserve"> ADDIN EN.CITE &lt;EndNote&gt;&lt;Cite&gt;&lt;Author&gt;Franzén&lt;/Author&gt;&lt;Year&gt;2019&lt;/Year&gt;&lt;RecNum&gt;682&lt;/RecNum&gt;&lt;DisplayText&gt;(1)&lt;/DisplayText&gt;&lt;record&gt;&lt;rec-number&gt;682&lt;/rec-number&gt;&lt;foreign-keys&gt;&lt;key app="EN" db-id="xxwwe0rzmffw5tea00tvder2stww5tpt9xwa" timestamp="1691154024" guid="c39a3138-2a5b-4f33-b724-135fd1a0da54"&gt;682&lt;/key&gt;&lt;/foreign-keys&gt;&lt;ref-type name="Journal Article"&gt;17&lt;/ref-type&gt;&lt;contributors&gt;&lt;authors&gt;&lt;author&gt;Franzén, Oscar&lt;/author&gt;&lt;author&gt;Gan, Li-Ming&lt;/author&gt;&lt;author&gt;Björkegren, Johan L M&lt;/author&gt;&lt;/authors&gt;&lt;/contributors&gt;&lt;titles&gt;&lt;title&gt;PanglaoDB: a web server for exploration of mouse and human single-cell RNA sequencing data&lt;/title&gt;&lt;secondary-title&gt;Database&lt;/secondary-title&gt;&lt;/titles&gt;&lt;periodical&gt;&lt;full-title&gt;Database&lt;/full-title&gt;&lt;/periodical&gt;&lt;volume&gt;2019&lt;/volume&gt;&lt;dates&gt;&lt;year&gt;2019&lt;/year&gt;&lt;/dates&gt;&lt;isbn&gt;1758-0463&lt;/isbn&gt;&lt;urls&gt;&lt;related-urls&gt;&lt;url&gt;https://doi.org/10.1093/database/baz046&lt;/url&gt;&lt;/related-urls&gt;&lt;/urls&gt;&lt;custom1&gt;baz046&lt;/custom1&gt;&lt;electronic-resource-num&gt;10.1093/database/baz046&lt;/electronic-resource-num&gt;&lt;access-date&gt;6/29/2023&lt;/access-date&gt;&lt;/record&gt;&lt;/Cite&gt;&lt;/EndNote&gt;</w:instrText>
-            </w:r>
-            <w:r>
-              <w:rPr>
-                <w:rFonts w:ascii="Calibri" w:hAnsi="Calibri" w:cs="Calibri"/>
-                <w:color w:val="000000"/>
-              </w:rPr>
-              <w:fldChar w:fldCharType="separate"/>
-            </w:r>
-            <w:r>
-              <w:rPr>
-                <w:rFonts w:ascii="Calibri" w:hAnsi="Calibri" w:cs="Calibri"/>
-                <w:noProof/>
-                <w:color w:val="000000"/>
-              </w:rPr>
-              <w:t>(1)</w:t>
-            </w:r>
-            <w:r>
-              <w:rPr>
-                <w:rFonts w:ascii="Calibri" w:hAnsi="Calibri" w:cs="Calibri"/>
-                <w:color w:val="000000"/>
-              </w:rPr>
-              <w:fldChar w:fldCharType="end"/>
-            </w:r>
-          </w:p>
-        </w:tc>
-      </w:tr>
-      <w:tr>
-        <w:tc>
-          <w:tcPr>
-            <w:tcW w:w="3317" w:type="dxa"/>
-            <w:vAlign w:val="bottom"/>
-          </w:tcPr>
-          <w:p>
-            <w:r>
-              <w:rPr>
-                <w:rFonts w:ascii="Calibri" w:hAnsi="Calibri" w:cs="Calibri"/>
-                <w:color w:val="000000"/>
-              </w:rPr>
-              <w:t>Enterochromaffin cells</w:t>
-            </w:r>
-          </w:p>
-        </w:tc>
-        <w:tc>
-          <w:tcPr>
-            <w:tcW w:w="3128" w:type="dxa"/>
-            <w:vAlign w:val="bottom"/>
-          </w:tcPr>
-          <w:p>
-            <w:r>
-              <w:rPr>
-                <w:rFonts w:ascii="Calibri" w:hAnsi="Calibri" w:cs="Calibri"/>
-                <w:color w:val="000000"/>
-              </w:rPr>
-              <w:t>Reg4</w:t>
-            </w:r>
-          </w:p>
-        </w:tc>
-        <w:tc>
-          <w:tcPr>
-            <w:tcW w:w="2617" w:type="dxa"/>
-          </w:tcPr>
-          <w:p>
-            <w:pPr>
-              <w:rPr>
-                <w:rFonts w:ascii="Calibri" w:hAnsi="Calibri" w:cs="Calibri"/>
-                <w:color w:val="000000"/>
-              </w:rPr>
-            </w:pPr>
-            <w:r>
-              <w:rPr>
-                <w:rFonts w:ascii="Calibri" w:hAnsi="Calibri" w:cs="Calibri"/>
-                <w:color w:val="000000"/>
-              </w:rPr>
-              <w:fldChar w:fldCharType="begin"/>
-            </w:r>
-            <w:r>
-              <w:rPr>
-                <w:rFonts w:ascii="Calibri" w:hAnsi="Calibri" w:cs="Calibri"/>
-                <w:color w:val="000000"/>
-              </w:rPr>
-              <w:instrText xml:space="preserve"> ADDIN EN.CITE &lt;EndNote&gt;&lt;Cite&gt;&lt;Author&gt;Franzén&lt;/Author&gt;&lt;Year&gt;2019&lt;/Year&gt;&lt;RecNum&gt;682&lt;/RecNum&gt;&lt;DisplayText&gt;(1)&lt;/DisplayText&gt;&lt;record&gt;&lt;rec-number&gt;682&lt;/rec-number&gt;&lt;foreign-keys&gt;&lt;key app="EN" db-id="xxwwe0rzmffw5tea00tvder2stww5tpt9xwa" timestamp="1691154024" guid="c39a3138-2a5b-4f33-b724-135fd1a0da54"&gt;682&lt;/key&gt;&lt;/foreign-keys&gt;&lt;ref-type name="Journal Article"&gt;17&lt;/ref-type&gt;&lt;contributors&gt;&lt;authors&gt;&lt;author&gt;Franzén, Oscar&lt;/author&gt;&lt;author&gt;Gan, Li-Ming&lt;/author&gt;&lt;author&gt;Björkegren, Johan L M&lt;/author&gt;&lt;/authors&gt;&lt;/contributors&gt;&lt;titles&gt;&lt;title&gt;PanglaoDB: a web server for exploration of mouse and human single-cell RNA sequencing data&lt;/title&gt;&lt;secondary-title&gt;Database&lt;/secondary-title&gt;&lt;/titles&gt;&lt;periodical&gt;&lt;full-title&gt;Database&lt;/full-title&gt;&lt;/periodical&gt;&lt;volume&gt;2019&lt;/volume&gt;&lt;dates&gt;&lt;year&gt;2019&lt;/year&gt;&lt;/dates&gt;&lt;isbn&gt;1758-0463&lt;/isbn&gt;&lt;urls&gt;&lt;related-urls&gt;&lt;url&gt;https://doi.org/10.1093/database/baz046&lt;/url&gt;&lt;/related-urls&gt;&lt;/urls&gt;&lt;custom1&gt;baz046&lt;/custom1&gt;&lt;electronic-resource-num&gt;10.1093/database/baz046&lt;/electronic-resource-num&gt;&lt;access-date&gt;6/29/2023&lt;/access-date&gt;&lt;/record&gt;&lt;/Cite&gt;&lt;/EndNote&gt;</w:instrText>
-            </w:r>
-            <w:r>
-              <w:rPr>
-                <w:rFonts w:ascii="Calibri" w:hAnsi="Calibri" w:cs="Calibri"/>
-                <w:color w:val="000000"/>
-              </w:rPr>
-              <w:fldChar w:fldCharType="separate"/>
-            </w:r>
-            <w:r>
-              <w:rPr>
-                <w:rFonts w:ascii="Calibri" w:hAnsi="Calibri" w:cs="Calibri"/>
-                <w:noProof/>
-                <w:color w:val="000000"/>
-              </w:rPr>
-              <w:t>(1)</w:t>
-            </w:r>
-            <w:r>
-              <w:rPr>
-                <w:rFonts w:ascii="Calibri" w:hAnsi="Calibri" w:cs="Calibri"/>
-                <w:color w:val="000000"/>
-              </w:rPr>
-              <w:fldChar w:fldCharType="end"/>
-            </w:r>
-          </w:p>
-        </w:tc>
-      </w:tr>
-      <w:tr>
-        <w:tc>
-          <w:tcPr>
-            <w:tcW w:w="3317" w:type="dxa"/>
-            <w:vAlign w:val="bottom"/>
-          </w:tcPr>
-          <w:p>
-            <w:r>
-              <w:rPr>
-                <w:rFonts w:ascii="Calibri" w:hAnsi="Calibri" w:cs="Calibri"/>
-                <w:color w:val="000000"/>
-              </w:rPr>
-              <w:t>Enterochromaffin cells</w:t>
-            </w:r>
-          </w:p>
-        </w:tc>
-        <w:tc>
-          <w:tcPr>
-            <w:tcW w:w="3128" w:type="dxa"/>
-            <w:vAlign w:val="bottom"/>
-          </w:tcPr>
-          <w:p>
-            <w:r>
-              <w:rPr>
-                <w:rFonts w:ascii="Calibri" w:hAnsi="Calibri" w:cs="Calibri"/>
-                <w:color w:val="000000"/>
-              </w:rPr>
-              <w:t>Slc18a1</w:t>
-            </w:r>
-          </w:p>
-        </w:tc>
-        <w:tc>
-          <w:tcPr>
-            <w:tcW w:w="2617" w:type="dxa"/>
-          </w:tcPr>
-          <w:p>
-            <w:pPr>
-              <w:rPr>
-                <w:rFonts w:ascii="Calibri" w:hAnsi="Calibri" w:cs="Calibri"/>
-                <w:color w:val="000000"/>
-              </w:rPr>
-            </w:pPr>
-            <w:r>
-              <w:rPr>
-                <w:rFonts w:ascii="Calibri" w:hAnsi="Calibri" w:cs="Calibri"/>
-                <w:color w:val="000000"/>
-              </w:rPr>
-              <w:fldChar w:fldCharType="begin"/>
-            </w:r>
-            <w:r>
-              <w:rPr>
-                <w:rFonts w:ascii="Calibri" w:hAnsi="Calibri" w:cs="Calibri"/>
-                <w:color w:val="000000"/>
-              </w:rPr>
-              <w:instrText xml:space="preserve"> ADDIN EN.CITE &lt;EndNote&gt;&lt;Cite&gt;&lt;Author&gt;Franzén&lt;/Author&gt;&lt;Year&gt;2019&lt;/Year&gt;&lt;RecNum&gt;682&lt;/RecNum&gt;&lt;DisplayText&gt;(1)&lt;/DisplayText&gt;&lt;record&gt;&lt;rec-number&gt;682&lt;/rec-number&gt;&lt;foreign-keys&gt;&lt;key app="EN" db-id="xxwwe0rzmffw5tea00tvder2stww5tpt9xwa" timestamp="1691154024" guid="c39a3138-2a5b-4f33-b724-135fd1a0da54"&gt;682&lt;/key&gt;&lt;/foreign-keys&gt;&lt;ref-type name="Journal Article"&gt;17&lt;/ref-type&gt;&lt;contributors&gt;&lt;authors&gt;&lt;author&gt;Franzén, Oscar&lt;/author&gt;&lt;author&gt;Gan, Li-Ming&lt;/author&gt;&lt;author&gt;Björkegren, Johan L M&lt;/author&gt;&lt;/authors&gt;&lt;/contributors&gt;&lt;titles&gt;&lt;title&gt;PanglaoDB: a web server for exploration of mouse and human single-cell RNA sequencing data&lt;/title&gt;&lt;secondary-title&gt;Database&lt;/secondary-title&gt;&lt;/titles&gt;&lt;periodical&gt;&lt;full-title&gt;Database&lt;/full-title&gt;&lt;/periodical&gt;&lt;volume&gt;2019&lt;/volume&gt;&lt;dates&gt;&lt;year&gt;2019&lt;/year&gt;&lt;/dates&gt;&lt;isbn&gt;1758-0463&lt;/isbn&gt;&lt;urls&gt;&lt;related-urls&gt;&lt;url&gt;https://doi.org/10.1093/database/baz046&lt;/url&gt;&lt;/related-urls&gt;&lt;/urls&gt;&lt;custom1&gt;baz046&lt;/custom1&gt;&lt;electronic-resource-num&gt;10.1093/database/baz046&lt;/electronic-resource-num&gt;&lt;access-date&gt;6/29/2023&lt;/access-date&gt;&lt;/record&gt;&lt;/Cite&gt;&lt;/EndNote&gt;</w:instrText>
-            </w:r>
-            <w:r>
-              <w:rPr>
-                <w:rFonts w:ascii="Calibri" w:hAnsi="Calibri" w:cs="Calibri"/>
-                <w:color w:val="000000"/>
-              </w:rPr>
-              <w:fldChar w:fldCharType="separate"/>
-            </w:r>
-            <w:r>
-              <w:rPr>
-                <w:rFonts w:ascii="Calibri" w:hAnsi="Calibri" w:cs="Calibri"/>
-                <w:noProof/>
-                <w:color w:val="000000"/>
-              </w:rPr>
-              <w:t>(1)</w:t>
-            </w:r>
-            <w:r>
-              <w:rPr>
-                <w:rFonts w:ascii="Calibri" w:hAnsi="Calibri" w:cs="Calibri"/>
-                <w:color w:val="000000"/>
-              </w:rPr>
-              <w:fldChar w:fldCharType="end"/>
-            </w:r>
-          </w:p>
-        </w:tc>
-      </w:tr>
-      <w:tr>
-        <w:tc>
-          <w:tcPr>
-            <w:tcW w:w="3317" w:type="dxa"/>
-            <w:vAlign w:val="bottom"/>
-          </w:tcPr>
-          <w:p>
-            <w:r>
-              <w:rPr>
-                <w:rFonts w:ascii="Calibri" w:hAnsi="Calibri" w:cs="Calibri"/>
-                <w:color w:val="000000"/>
-              </w:rPr>
-              <w:lastRenderedPageBreak/>
               <w:t>Enteroendocrine cells</w:t>
             </w:r>
           </w:p>
@@ -11311,6 +11317,12 @@
                 <w:rFonts w:ascii="Calibri" w:hAnsi="Calibri" w:cs="Calibri"/>
                 <w:color w:val="000000"/>
               </w:rPr>
+            </w:r>
+            <w:r>
+              <w:rPr>
+                <w:rFonts w:ascii="Calibri" w:hAnsi="Calibri" w:cs="Calibri"/>
+                <w:color w:val="000000"/>
+              </w:rPr>
               <w:fldChar w:fldCharType="separate"/>
             </w:r>
             <w:r>
@@ -11553,6 +11565,12 @@
                 <w:rFonts w:ascii="Calibri" w:hAnsi="Calibri" w:cs="Calibri"/>
                 <w:color w:val="000000"/>
               </w:rPr>
+            </w:r>
+            <w:r>
+              <w:rPr>
+                <w:rFonts w:ascii="Calibri" w:hAnsi="Calibri" w:cs="Calibri"/>
+                <w:color w:val="000000"/>
+              </w:rPr>
               <w:fldChar w:fldCharType="separate"/>
             </w:r>
             <w:r>
@@ -11795,6 +11813,12 @@
                 <w:rFonts w:ascii="Calibri" w:hAnsi="Calibri" w:cs="Calibri"/>
                 <w:color w:val="000000"/>
               </w:rPr>
+            </w:r>
+            <w:r>
+              <w:rPr>
+                <w:rFonts w:ascii="Calibri" w:hAnsi="Calibri" w:cs="Calibri"/>
+                <w:color w:val="000000"/>
+              </w:rPr>
               <w:fldChar w:fldCharType="separate"/>
             </w:r>
             <w:r>
@@ -11918,7 +11942,6 @@
             <w:vAlign w:val="bottom"/>
           </w:tcPr>
           <w:p>
-            <w:proofErr w:type="spellStart"/>
             <w:r>
               <w:rPr>
                 <w:rFonts w:ascii="Calibri" w:hAnsi="Calibri" w:cs="Calibri"/>
@@ -11926,7 +11949,6 @@
               </w:rPr>
               <w:t>Lep</w:t>
             </w:r>
-            <w:proofErr w:type="spellEnd"/>
           </w:p>
         </w:tc>
         <w:tc>
@@ -12165,6 +12187,12 @@
                 <w:rFonts w:ascii="Calibri" w:hAnsi="Calibri" w:cs="Calibri"/>
                 <w:color w:val="000000"/>
               </w:rPr>
+            </w:r>
+            <w:r>
+              <w:rPr>
+                <w:rFonts w:ascii="Calibri" w:hAnsi="Calibri" w:cs="Calibri"/>
+                <w:color w:val="000000"/>
+              </w:rPr>
               <w:fldChar w:fldCharType="separate"/>
             </w:r>
             <w:r>
@@ -13499,6 +13527,7 @@
                 <w:rFonts w:ascii="Calibri" w:hAnsi="Calibri" w:cs="Calibri"/>
                 <w:color w:val="000000"/>
               </w:rPr>
+              <w:lastRenderedPageBreak/>
               <w:t>Mast cells</w:t>
             </w:r>
           </w:p>
@@ -13661,7 +13690,6 @@
                 <w:rFonts w:ascii="Calibri" w:hAnsi="Calibri" w:cs="Calibri"/>
                 <w:color w:val="000000"/>
               </w:rPr>
-              <w:lastRenderedPageBreak/>
               <w:t>Mast cells</w:t>
             </w:r>
           </w:p>
@@ -16351,6 +16379,12 @@
                 <w:rFonts w:ascii="Calibri" w:hAnsi="Calibri" w:cs="Calibri"/>
                 <w:color w:val="000000"/>
               </w:rPr>
+            </w:r>
+            <w:r>
+              <w:rPr>
+                <w:rFonts w:ascii="Calibri" w:hAnsi="Calibri" w:cs="Calibri"/>
+                <w:color w:val="000000"/>
+              </w:rPr>
               <w:fldChar w:fldCharType="separate"/>
             </w:r>
             <w:r>
@@ -16393,7 +16427,6 @@
             <w:vAlign w:val="bottom"/>
           </w:tcPr>
           <w:p>
-            <w:proofErr w:type="spellStart"/>
             <w:r>
               <w:rPr>
                 <w:rFonts w:ascii="Calibri" w:hAnsi="Calibri" w:cs="Calibri"/>
@@ -16401,7 +16434,6 @@
               </w:rPr>
               <w:t>Clu</w:t>
             </w:r>
-            <w:proofErr w:type="spellEnd"/>
           </w:p>
         </w:tc>
         <w:tc>
@@ -16559,6 +16591,12 @@
                 <w:rFonts w:ascii="Calibri" w:hAnsi="Calibri" w:cs="Calibri"/>
                 <w:color w:val="000000"/>
               </w:rPr>
+            </w:r>
+            <w:r>
+              <w:rPr>
+                <w:rFonts w:ascii="Calibri" w:hAnsi="Calibri" w:cs="Calibri"/>
+                <w:color w:val="000000"/>
+              </w:rPr>
               <w:fldChar w:fldCharType="separate"/>
             </w:r>
             <w:r>
@@ -17004,6 +17042,12 @@
                 <w:color w:val="000000"/>
               </w:rPr>
               <w:fldChar w:fldCharType="end"/>
+            </w:r>
+            <w:r>
+              <w:rPr>
+                <w:rFonts w:ascii="Calibri" w:hAnsi="Calibri" w:cs="Calibri"/>
+                <w:color w:val="000000"/>
+              </w:rPr>
             </w:r>
             <w:r>
               <w:rPr>
@@ -17900,6 +17944,12 @@
                 <w:rFonts w:ascii="Calibri" w:hAnsi="Calibri" w:cs="Calibri"/>
                 <w:color w:val="000000"/>
               </w:rPr>
+            </w:r>
+            <w:r>
+              <w:rPr>
+                <w:rFonts w:ascii="Calibri" w:hAnsi="Calibri" w:cs="Calibri"/>
+                <w:color w:val="000000"/>
+              </w:rPr>
               <w:fldChar w:fldCharType="separate"/>
             </w:r>
             <w:r>
@@ -18106,6 +18156,12 @@
                 <w:rFonts w:ascii="Calibri" w:hAnsi="Calibri" w:cs="Calibri"/>
                 <w:color w:val="000000"/>
               </w:rPr>
+            </w:r>
+            <w:r>
+              <w:rPr>
+                <w:rFonts w:ascii="Calibri" w:hAnsi="Calibri" w:cs="Calibri"/>
+                <w:color w:val="000000"/>
+              </w:rPr>
               <w:fldChar w:fldCharType="separate"/>
             </w:r>
             <w:r>
@@ -18219,6 +18275,7 @@
                 <w:rFonts w:ascii="Calibri" w:hAnsi="Calibri" w:cs="Calibri"/>
                 <w:color w:val="000000"/>
               </w:rPr>
+              <w:lastRenderedPageBreak/>
               <w:t>Pericytes</w:t>
             </w:r>
           </w:p>
@@ -18381,7 +18438,6 @@
                 <w:rFonts w:ascii="Calibri" w:hAnsi="Calibri" w:cs="Calibri"/>
                 <w:color w:val="000000"/>
               </w:rPr>
-              <w:lastRenderedPageBreak/>
               <w:t>Plasma cells</w:t>
             </w:r>
           </w:p>
@@ -19775,6 +19831,12 @@
                 <w:rFonts w:ascii="Calibri" w:hAnsi="Calibri" w:cs="Calibri"/>
                 <w:color w:val="000000"/>
               </w:rPr>
+            </w:r>
+            <w:r>
+              <w:rPr>
+                <w:rFonts w:ascii="Calibri" w:hAnsi="Calibri" w:cs="Calibri"/>
+                <w:color w:val="000000"/>
+              </w:rPr>
               <w:fldChar w:fldCharType="separate"/>
             </w:r>
             <w:r>
@@ -19981,6 +20043,12 @@
                 <w:rFonts w:ascii="Calibri" w:hAnsi="Calibri" w:cs="Calibri"/>
                 <w:color w:val="000000"/>
               </w:rPr>
+            </w:r>
+            <w:r>
+              <w:rPr>
+                <w:rFonts w:ascii="Calibri" w:hAnsi="Calibri" w:cs="Calibri"/>
+                <w:color w:val="000000"/>
+              </w:rPr>
               <w:fldChar w:fldCharType="separate"/>
             </w:r>
             <w:r>
@@ -20183,6 +20251,12 @@
                 <w:color w:val="000000"/>
               </w:rPr>
               <w:fldChar w:fldCharType="end"/>
+            </w:r>
+            <w:r>
+              <w:rPr>
+                <w:rFonts w:ascii="Calibri" w:hAnsi="Calibri" w:cs="Calibri"/>
+                <w:color w:val="000000"/>
+              </w:rPr>
             </w:r>
             <w:r>
               <w:rPr>
@@ -20512,6 +20586,12 @@
                 <w:rFonts w:ascii="Calibri" w:hAnsi="Calibri" w:cs="Calibri"/>
                 <w:color w:val="000000"/>
               </w:rPr>
+            </w:r>
+            <w:r>
+              <w:rPr>
+                <w:rFonts w:ascii="Calibri" w:hAnsi="Calibri" w:cs="Calibri"/>
+                <w:color w:val="000000"/>
+              </w:rPr>
               <w:fldChar w:fldCharType="separate"/>
             </w:r>
             <w:r>
@@ -21343,14 +21423,19 @@
               </w:rPr>
               <w:fldChar w:fldCharType="end"/>
             </w:r>
-            <w:bookmarkStart w:id="2" w:name="_GoBack"/>
-            <w:bookmarkEnd w:id="2"/>
           </w:p>
         </w:tc>
       </w:tr>
     </w:tbl>
     <w:p/>
-    <w:p/>
+    <w:p>
+      <w:pPr>
+        <w:pStyle w:val="Heading1"/>
+      </w:pPr>
+      <w:r>
+        <w:t>References</w:t>
+      </w:r>
+    </w:p>
     <w:p>
       <w:pPr>
         <w:pStyle w:val="EndNoteBibliography"/>
@@ -21401,7 +21486,7 @@
 </file>
 
 <file path=word/styles.xml><?xml version="1.0" encoding="utf-8"?>
-<w:styles xmlns:mc="http://schemas.openxmlformats.org/markup-compatibility/2006" xmlns:r="http://schemas.openxmlformats.org/officeDocument/2006/relationships" xmlns:w="http://schemas.openxmlformats.org/wordprocessingml/2006/main" xmlns:w14="http://schemas.microsoft.com/office/word/2010/wordml" xmlns:w15="http://schemas.microsoft.com/office/word/2012/wordml" xmlns:w16cid="http://schemas.microsoft.com/office/word/2016/wordml/cid" xmlns:w16se="http://schemas.microsoft.com/office/word/2015/wordml/symex" mc:Ignorable="w14 w15 w16se w16cid">
+<w:styles xmlns:mc="http://schemas.openxmlformats.org/markup-compatibility/2006" xmlns:r="http://schemas.openxmlformats.org/officeDocument/2006/relationships" xmlns:w="http://schemas.openxmlformats.org/wordprocessingml/2006/main" xmlns:w14="http://schemas.microsoft.com/office/word/2010/wordml" xmlns:w15="http://schemas.microsoft.com/office/word/2012/wordml" xmlns:w16cex="http://schemas.microsoft.com/office/word/2018/wordml/cex" xmlns:w16cid="http://schemas.microsoft.com/office/word/2016/wordml/cid" xmlns:w16="http://schemas.microsoft.com/office/word/2018/wordml" xmlns:w16du="http://schemas.microsoft.com/office/word/2023/wordml/word16du" xmlns:w16sdtdh="http://schemas.microsoft.com/office/word/2020/wordml/sdtdatahash" xmlns:w16sdtfl="http://schemas.microsoft.com/office/word/2024/wordml/sdtformatlock" xmlns:w16se="http://schemas.microsoft.com/office/word/2015/wordml/symex" mc:Ignorable="w14 w15 w16se w16cid w16 w16cex w16sdtdh w16sdtfl w16du">
   <w:docDefaults>
     <w:rPrDefault>
       <w:rPr>
@@ -21417,7 +21502,7 @@
       </w:pPr>
     </w:pPrDefault>
   </w:docDefaults>
-  <w:latentStyles w:defLockedState="0" w:defUIPriority="99" w:defSemiHidden="0" w:defUnhideWhenUsed="0" w:defQFormat="0" w:count="375">
+  <w:latentStyles w:defLockedState="0" w:defUIPriority="99" w:defSemiHidden="0" w:defUnhideWhenUsed="0" w:defQFormat="0" w:count="376">
     <w:lsdException w:name="Normal" w:uiPriority="0" w:qFormat="1"/>
     <w:lsdException w:name="heading 1" w:uiPriority="9" w:qFormat="1"/>
     <w:lsdException w:name="heading 2" w:semiHidden="1" w:uiPriority="9" w:unhideWhenUsed="1" w:qFormat="1"/>
@@ -21793,15 +21878,60 @@
     <w:lsdException w:name="Smart Hyperlink" w:semiHidden="1" w:unhideWhenUsed="1"/>
     <w:lsdException w:name="Hashtag" w:semiHidden="1" w:unhideWhenUsed="1"/>
     <w:lsdException w:name="Unresolved Mention" w:semiHidden="1" w:unhideWhenUsed="1"/>
+    <w:lsdException w:name="Smart Link" w:semiHidden="1" w:unhideWhenUsed="1"/>
   </w:latentStyles>
   <w:style w:type="paragraph" w:default="1" w:styleId="Normal">
     <w:name w:val="Normal"/>
     <w:qFormat/>
     <w:rsid w:val="0031695C"/>
   </w:style>
+  <w:style w:type="paragraph" w:styleId="Heading1">
+    <w:name w:val="heading 1"/>
+    <w:basedOn w:val="Normal"/>
+    <w:next w:val="Normal"/>
+    <w:link w:val="Heading1Char"/>
+    <w:uiPriority w:val="9"/>
+    <w:qFormat/>
+    <w:rsid w:val="00C35065"/>
+    <w:pPr>
+      <w:keepNext/>
+      <w:keepLines/>
+      <w:spacing w:before="240" w:after="0"/>
+      <w:outlineLvl w:val="0"/>
+    </w:pPr>
+    <w:rPr>
+      <w:rFonts w:asciiTheme="majorHAnsi" w:eastAsiaTheme="majorEastAsia" w:hAnsiTheme="majorHAnsi" w:cstheme="majorBidi"/>
+      <w:color w:val="2F5496" w:themeColor="accent1" w:themeShade="BF"/>
+      <w:sz w:val="32"/>
+      <w:szCs w:val="32"/>
+    </w:rPr>
+  </w:style>
+  <w:style w:type="paragraph" w:styleId="Heading2">
+    <w:name w:val="heading 2"/>
+    <w:basedOn w:val="Normal"/>
+    <w:next w:val="Normal"/>
+    <w:link w:val="Heading2Char"/>
+    <w:uiPriority w:val="9"/>
+    <w:unhideWhenUsed/>
+    <w:qFormat/>
+    <w:rsid w:val="00C35065"/>
+    <w:pPr>
+      <w:keepNext/>
+      <w:keepLines/>
+      <w:spacing w:before="40" w:after="0"/>
+      <w:outlineLvl w:val="1"/>
+    </w:pPr>
+    <w:rPr>
+      <w:rFonts w:asciiTheme="majorHAnsi" w:eastAsiaTheme="majorEastAsia" w:hAnsiTheme="majorHAnsi" w:cstheme="majorBidi"/>
+      <w:color w:val="2F5496" w:themeColor="accent1" w:themeShade="BF"/>
+      <w:sz w:val="26"/>
+      <w:szCs w:val="26"/>
+    </w:rPr>
+  </w:style>
   <w:style w:type="character" w:default="1" w:styleId="DefaultParagraphFont">
     <w:name w:val="Default Paragraph Font"/>
     <w:uiPriority w:val="1"/>
+    <w:semiHidden/>
     <w:unhideWhenUsed/>
   </w:style>
   <w:style w:type="table" w:default="1" w:styleId="TableNormal">
@@ -21908,6 +22038,32 @@
     <w:rPr>
       <w:rFonts w:ascii="Calibri" w:hAnsi="Calibri" w:cs="Calibri"/>
       <w:noProof/>
+    </w:rPr>
+  </w:style>
+  <w:style w:type="character" w:customStyle="1" w:styleId="Heading2Char">
+    <w:name w:val="Heading 2 Char"/>
+    <w:basedOn w:val="DefaultParagraphFont"/>
+    <w:link w:val="Heading2"/>
+    <w:uiPriority w:val="9"/>
+    <w:rsid w:val="00C35065"/>
+    <w:rPr>
+      <w:rFonts w:asciiTheme="majorHAnsi" w:eastAsiaTheme="majorEastAsia" w:hAnsiTheme="majorHAnsi" w:cstheme="majorBidi"/>
+      <w:color w:val="2F5496" w:themeColor="accent1" w:themeShade="BF"/>
+      <w:sz w:val="26"/>
+      <w:szCs w:val="26"/>
+    </w:rPr>
+  </w:style>
+  <w:style w:type="character" w:customStyle="1" w:styleId="Heading1Char">
+    <w:name w:val="Heading 1 Char"/>
+    <w:basedOn w:val="DefaultParagraphFont"/>
+    <w:link w:val="Heading1"/>
+    <w:uiPriority w:val="9"/>
+    <w:rsid w:val="00C35065"/>
+    <w:rPr>
+      <w:rFonts w:asciiTheme="majorHAnsi" w:eastAsiaTheme="majorEastAsia" w:hAnsiTheme="majorHAnsi" w:cstheme="majorBidi"/>
+      <w:color w:val="2F5496" w:themeColor="accent1" w:themeShade="BF"/>
+      <w:sz w:val="32"/>
+      <w:szCs w:val="32"/>
     </w:rPr>
   </w:style>
 </w:styles>

</xml_diff>